<commit_message>
Docs: long-run diagnostic findings; correct the stall explanation
The ~190 ms stalls are hung sensor reads, not self-heal restarts; the
ruler board never reset and the link stayed clean. REPORT.md, the .docx
and FINDINGS.md now describe the ~20 min sensor failure, the measured
timing split, and the firmware changes awaiting a test run.

Co-Authored-By: Claude Opus 5.5 <noreply@anthropic.com>
Claude-Session: https://claude.ai/code/session_01AxnhBNGVNZa62atbRd2ZEw
</commit_message>
<xml_diff>
--- a/analysis/static_test/Static_Stability_Test_Report.docx
+++ b/analysis/static_test/Static_Stability_Test_Report.docx
@@ -177,10 +177,10 @@
           <w:b/>
           <w:bCs/>
         </w:rPr>
-        <w:t xml:space="preserve">The ruler-side node's sensor can go bad.</w:t>
-      </w:r>
-      <w:r>
-        <w:t xml:space="preserve"> In one recording it reported spinning while completely still, and the valid-sample rate fell to 93 %.</w:t>
+        <w:t xml:space="preserve">The ruler-side node's sensor fails after ~20 minutes of running.</w:t>
+      </w:r>
+      <w:r>
+        <w:t xml:space="preserve"> Its reads start hanging and returning garbage, and a few minutes later it stops producing data. Seen twice, both times with the board untouched.</w:t>
       </w:r>
     </w:p>
     <w:p>
@@ -2104,6 +2104,26 @@
     </w:p>
     <w:p>
       <w:pPr>
+        <w:pStyle w:val="ListParagraph"/>
+        <w:numPr>
+          <w:ilvl w:val="0"/>
+          <w:numId w:val="4"/>
+        </w:numPr>
+        <w:spacing w:after="60"/>
+      </w:pPr>
+      <w:r>
+        <w:rPr>
+          <w:b/>
+          <w:bCs/>
+        </w:rPr>
+        <w:t xml:space="preserve">Longest clean hold so far:</w:t>
+      </w:r>
+      <w:r>
+        <w:t xml:space="preserve"> the first ~18 minutes of the 40-minute run held at 0.80° with 0.016° jitter and −0.001 °/min drift, before the sensor fault (issue 2) began.</w:t>
+      </w:r>
+    </w:p>
+    <w:p>
+      <w:pPr>
         <w:pStyle w:val="Heading1"/>
       </w:pPr>
       <w:r>
@@ -2405,6 +2425,21 @@
     </w:p>
     <w:p>
       <w:pPr>
+        <w:spacing w:after="120"/>
+      </w:pPr>
+      <w:r>
+        <w:rPr>
+          <w:b/>
+          <w:bCs/>
+        </w:rPr>
+        <w:t xml:space="preserve">Measured cause.</w:t>
+      </w:r>
+      <w:r>
+        <w:t xml:space="preserve"> The diagnostic build timed each ~23 ms cycle: ~10.7 ms reading the thigh IMU and ~11.7 ms printing the data line as ~36 separate prints. Sending a longer line as one write took ~0.7 ms.</w:t>
+      </w:r>
+    </w:p>
+    <w:p>
+      <w:pPr>
         <w:spacing w:after="60"/>
       </w:pPr>
       <w:r>
@@ -2438,7 +2473,14 @@
         <w:spacing w:after="60"/>
       </w:pPr>
       <w:r>
-        <w:t xml:space="preserve">A diagnostic build is ready. It times the parts of that cycle; the suspects are about 36 separate print calls per line and slow sensor reads.</w:t>
+        <w:rPr>
+          <w:b/>
+          <w:bCs/>
+        </w:rPr>
+        <w:t xml:space="preserve">Fix made, awaiting a test run:</w:t>
+      </w:r>
+      <w:r>
+        <w:t xml:space="preserve"> the central now builds each data line in memory and sends it with one write, which should bring the cycle to ~11–12 ms and the rate to a true 50 Hz.</w:t>
       </w:r>
     </w:p>
     <w:p>
@@ -2451,33 +2493,7 @@
         <w:spacing w:after="60"/>
       </w:pPr>
       <w:r>
-        <w:t xml:space="preserve">Planned fixes:</w:t>
-      </w:r>
-    </w:p>
-    <w:p>
-      <w:pPr>
-        <w:pStyle w:val="ListParagraph"/>
-        <w:numPr>
-          <w:ilvl w:val="1"/>
-          <w:numId w:val="4"/>
-        </w:numPr>
-        <w:spacing w:after="60"/>
-      </w:pPr>
-      <w:r>
-        <w:t xml:space="preserve">Speed up the output cycle.</w:t>
-      </w:r>
-    </w:p>
-    <w:p>
-      <w:pPr>
-        <w:pStyle w:val="ListParagraph"/>
-        <w:numPr>
-          <w:ilvl w:val="1"/>
-          <w:numId w:val="4"/>
-        </w:numPr>
-        <w:spacing w:after="60"/>
-      </w:pPr>
-      <w:r>
-        <w:t xml:space="preserve">Write one CSV row per received sample, so duplicates can't happen.</w:t>
+        <w:t xml:space="preserve">Still planned: write one CSV row per received sample, so duplicates can't happen.</w:t>
       </w:r>
     </w:p>
     <w:p>
@@ -2485,7 +2501,7 @@
         <w:pStyle w:val="Heading2"/>
       </w:pPr>
       <w:r>
-        <w:t xml:space="preserve">2. The ruler-side node's sensor can go bad</w:t>
+        <w:t xml:space="preserve">2. The ruler-side node's sensor fails after ~20 minutes</w:t>
       </w:r>
     </w:p>
     <w:p>
@@ -2493,19 +2509,339 @@
         <w:spacing w:after="120"/>
       </w:pPr>
       <w:r>
-        <w:t xml:space="preserve">In a separate 1-minute recording where nothing moved at all (the central board had been running ~26 minutes since its last reset, from its </w:t>
-      </w:r>
-      <w:r>
-        <w:rPr>
-          <w:rFonts w:ascii="Consolas" w:cs="Consolas" w:eastAsia="Consolas" w:hAnsi="Consolas"/>
-          <w:sz w:val="19"/>
-          <w:szCs w:val="19"/>
-        </w:rPr>
-        <w:t xml:space="preserve">t_thigh_us</w:t>
-      </w:r>
-      <w:r>
-        <w:t xml:space="preserve"> clock):</w:t>
-      </w:r>
+        <w:t xml:space="preserve">Seen in two recordings with the boards untouched: a 1-minute no-motion recording, and a ~40-minute unattended run with the diagnostic build (both boards on USB power). The diagnostic run shows the sequence:</w:t>
+      </w:r>
+    </w:p>
+    <w:tbl>
+      <w:tblPr>
+        <w:tblW w:type="dxa" w:w="10080"/>
+        <w:tblBorders>
+          <w:top w:val="single" w:color="BFBFBF" w:sz="4"/>
+          <w:left w:val="single" w:color="BFBFBF" w:sz="4"/>
+          <w:bottom w:val="single" w:color="BFBFBF" w:sz="4"/>
+          <w:right w:val="single" w:color="BFBFBF" w:sz="4"/>
+          <w:insideH w:val="single" w:color="BFBFBF" w:sz="4"/>
+          <w:insideV w:val="single" w:color="BFBFBF" w:sz="4"/>
+        </w:tblBorders>
+        <w:tblLayout w:type="fixed"/>
+      </w:tblPr>
+      <w:tblGrid>
+        <w:gridCol w:w="2174"/>
+        <w:gridCol w:w="7906"/>
+      </w:tblGrid>
+      <w:tr>
+        <w:trPr>
+          <w:tblHeader/>
+        </w:trPr>
+        <w:tc>
+          <w:tcPr>
+            <w:tcW w:type="dxa" w:w="2174"/>
+            <w:shd w:fill="DCE6F1" w:color="auto" w:val="clear"/>
+            <w:tcMar>
+              <w:top w:type="dxa" w:w="60"/>
+              <w:left w:type="dxa" w:w="100"/>
+              <w:bottom w:type="dxa" w:w="60"/>
+              <w:right w:type="dxa" w:w="100"/>
+            </w:tcMar>
+          </w:tcPr>
+          <w:p>
+            <w:r>
+              <w:rPr>
+                <w:b/>
+                <w:bCs/>
+                <w:sz w:val="19"/>
+                <w:szCs w:val="19"/>
+              </w:rPr>
+              <w:t xml:space="preserve">Board uptime</w:t>
+            </w:r>
+          </w:p>
+        </w:tc>
+        <w:tc>
+          <w:tcPr>
+            <w:tcW w:type="dxa" w:w="7906"/>
+            <w:shd w:fill="DCE6F1" w:color="auto" w:val="clear"/>
+            <w:tcMar>
+              <w:top w:type="dxa" w:w="60"/>
+              <w:left w:type="dxa" w:w="100"/>
+              <w:bottom w:type="dxa" w:w="60"/>
+              <w:right w:type="dxa" w:w="100"/>
+            </w:tcMar>
+          </w:tcPr>
+          <w:p>
+            <w:r>
+              <w:rPr>
+                <w:b/>
+                <w:bCs/>
+                <w:sz w:val="19"/>
+                <w:szCs w:val="19"/>
+              </w:rPr>
+              <w:t xml:space="preserve">What the ruler node reported</w:t>
+            </w:r>
+          </w:p>
+        </w:tc>
+      </w:tr>
+      <w:tr>
+        <w:trPr>
+          <w:cantSplit/>
+        </w:trPr>
+        <w:tc>
+          <w:tcPr>
+            <w:tcW w:type="dxa" w:w="2174"/>
+            <w:tcMar>
+              <w:top w:type="dxa" w:w="60"/>
+              <w:left w:type="dxa" w:w="100"/>
+              <w:bottom w:type="dxa" w:w="60"/>
+              <w:right w:type="dxa" w:w="100"/>
+            </w:tcMar>
+          </w:tcPr>
+          <w:p>
+            <w:r>
+              <w:rPr>
+                <w:sz w:val="19"/>
+                <w:szCs w:val="19"/>
+              </w:rPr>
+              <w:t xml:space="preserve">0–20 min</w:t>
+            </w:r>
+          </w:p>
+        </w:tc>
+        <w:tc>
+          <w:tcPr>
+            <w:tcW w:type="dxa" w:w="7906"/>
+            <w:tcMar>
+              <w:top w:type="dxa" w:w="60"/>
+              <w:left w:type="dxa" w:w="100"/>
+              <w:bottom w:type="dxa" w:w="60"/>
+              <w:right w:type="dxa" w:w="100"/>
+            </w:tcMar>
+          </w:tcPr>
+          <w:p>
+            <w:r>
+              <w:rPr>
+                <w:sz w:val="19"/>
+                <w:szCs w:val="19"/>
+              </w:rPr>
+              <w:t xml:space="preserve">Healthy: 100 % valid, jitter 0.016°, drift −0.001 °/min</w:t>
+            </w:r>
+          </w:p>
+        </w:tc>
+      </w:tr>
+      <w:tr>
+        <w:trPr>
+          <w:cantSplit/>
+        </w:trPr>
+        <w:tc>
+          <w:tcPr>
+            <w:tcW w:type="dxa" w:w="2174"/>
+            <w:tcMar>
+              <w:top w:type="dxa" w:w="60"/>
+              <w:left w:type="dxa" w:w="100"/>
+              <w:bottom w:type="dxa" w:w="60"/>
+              <w:right w:type="dxa" w:w="100"/>
+            </w:tcMar>
+          </w:tcPr>
+          <w:p>
+            <w:r>
+              <w:rPr>
+                <w:sz w:val="19"/>
+                <w:szCs w:val="19"/>
+              </w:rPr>
+              <w:t xml:space="preserve">20.4 min</w:t>
+            </w:r>
+          </w:p>
+        </w:tc>
+        <w:tc>
+          <w:tcPr>
+            <w:tcW w:type="dxa" w:w="7906"/>
+            <w:tcMar>
+              <w:top w:type="dxa" w:w="60"/>
+              <w:left w:type="dxa" w:w="100"/>
+              <w:bottom w:type="dxa" w:w="60"/>
+              <w:right w:type="dxa" w:w="100"/>
+            </w:tcMar>
+          </w:tcPr>
+          <w:p>
+            <w:r>
+              <w:rPr>
+                <w:sz w:val="19"/>
+                <w:szCs w:val="19"/>
+              </w:rPr>
+              <w:t xml:space="preserve">Individual sensor reads start </w:t>
+            </w:r>
+            <w:r>
+              <w:rPr>
+                <w:b/>
+                <w:bCs/>
+                <w:sz w:val="19"/>
+                <w:szCs w:val="19"/>
+              </w:rPr>
+              <w:t xml:space="preserve">hanging for ~190 ms</w:t>
+            </w:r>
+            <w:r>
+              <w:rPr>
+                <w:sz w:val="19"/>
+                <w:szCs w:val="19"/>
+              </w:rPr>
+              <w:t xml:space="preserve"> and returning garbage (accelerometer up to 4.4 g, two axes stuck at −1 count)</w:t>
+            </w:r>
+          </w:p>
+        </w:tc>
+      </w:tr>
+      <w:tr>
+        <w:trPr>
+          <w:cantSplit/>
+        </w:trPr>
+        <w:tc>
+          <w:tcPr>
+            <w:tcW w:type="dxa" w:w="2174"/>
+            <w:tcMar>
+              <w:top w:type="dxa" w:w="60"/>
+              <w:left w:type="dxa" w:w="100"/>
+              <w:bottom w:type="dxa" w:w="60"/>
+              <w:right w:type="dxa" w:w="100"/>
+            </w:tcMar>
+          </w:tcPr>
+          <w:p>
+            <w:r>
+              <w:rPr>
+                <w:sz w:val="19"/>
+                <w:szCs w:val="19"/>
+              </w:rPr>
+              <w:t xml:space="preserve">21–26 min</w:t>
+            </w:r>
+          </w:p>
+        </w:tc>
+        <w:tc>
+          <w:tcPr>
+            <w:tcW w:type="dxa" w:w="7906"/>
+            <w:tcMar>
+              <w:top w:type="dxa" w:w="60"/>
+              <w:left w:type="dxa" w:w="100"/>
+              <w:bottom w:type="dxa" w:w="60"/>
+              <w:right w:type="dxa" w:w="100"/>
+            </w:tcMar>
+          </w:tcPr>
+          <w:p>
+            <w:r>
+              <w:rPr>
+                <w:sz w:val="19"/>
+                <w:szCs w:val="19"/>
+              </w:rPr>
+              <w:t xml:space="preserve">Hung reads more frequent; gyro reads 1500–2400 °/s while still, so the orientation spins and the angle swings by tens of degrees</w:t>
+            </w:r>
+          </w:p>
+        </w:tc>
+      </w:tr>
+      <w:tr>
+        <w:trPr>
+          <w:cantSplit/>
+        </w:trPr>
+        <w:tc>
+          <w:tcPr>
+            <w:tcW w:type="dxa" w:w="2174"/>
+            <w:tcMar>
+              <w:top w:type="dxa" w:w="60"/>
+              <w:left w:type="dxa" w:w="100"/>
+              <w:bottom w:type="dxa" w:w="60"/>
+              <w:right w:type="dxa" w:w="100"/>
+            </w:tcMar>
+          </w:tcPr>
+          <w:p>
+            <w:r>
+              <w:rPr>
+                <w:sz w:val="19"/>
+                <w:szCs w:val="19"/>
+              </w:rPr>
+              <w:t xml:space="preserve">26.3 min</w:t>
+            </w:r>
+          </w:p>
+        </w:tc>
+        <w:tc>
+          <w:tcPr>
+            <w:tcW w:type="dxa" w:w="7906"/>
+            <w:tcMar>
+              <w:top w:type="dxa" w:w="60"/>
+              <w:left w:type="dxa" w:w="100"/>
+              <w:bottom w:type="dxa" w:w="60"/>
+              <w:right w:type="dxa" w:w="100"/>
+            </w:tcMar>
+          </w:tcPr>
+          <w:p>
+            <w:r>
+              <w:rPr>
+                <w:sz w:val="19"/>
+                <w:szCs w:val="19"/>
+              </w:rPr>
+              <w:t xml:space="preserve">The sensor </w:t>
+            </w:r>
+            <w:r>
+              <w:rPr>
+                <w:b/>
+                <w:bCs/>
+                <w:sz w:val="19"/>
+                <w:szCs w:val="19"/>
+              </w:rPr>
+              <w:t xml:space="preserve">stops producing data</w:t>
+            </w:r>
+            <w:r>
+              <w:rPr>
+                <w:sz w:val="19"/>
+                <w:szCs w:val="19"/>
+              </w:rPr>
+              <w:t xml:space="preserve">. Each restart attempt reports success but takes ~1.9 s, and no sample ever follows</w:t>
+            </w:r>
+          </w:p>
+        </w:tc>
+      </w:tr>
+      <w:tr>
+        <w:trPr>
+          <w:cantSplit/>
+        </w:trPr>
+        <w:tc>
+          <w:tcPr>
+            <w:tcW w:type="dxa" w:w="2174"/>
+            <w:tcMar>
+              <w:top w:type="dxa" w:w="60"/>
+              <w:left w:type="dxa" w:w="100"/>
+              <w:bottom w:type="dxa" w:w="60"/>
+              <w:right w:type="dxa" w:w="100"/>
+            </w:tcMar>
+          </w:tcPr>
+          <w:p>
+            <w:r>
+              <w:rPr>
+                <w:sz w:val="19"/>
+                <w:szCs w:val="19"/>
+              </w:rPr>
+              <w:t xml:space="preserve">26–41 min</w:t>
+            </w:r>
+          </w:p>
+        </w:tc>
+        <w:tc>
+          <w:tcPr>
+            <w:tcW w:type="dxa" w:w="7906"/>
+            <w:tcMar>
+              <w:top w:type="dxa" w:w="60"/>
+              <w:left w:type="dxa" w:w="100"/>
+              <w:bottom w:type="dxa" w:w="60"/>
+              <w:right w:type="dxa" w:w="100"/>
+            </w:tcMar>
+          </w:tcPr>
+          <w:p>
+            <w:r>
+              <w:rPr>
+                <w:sz w:val="19"/>
+                <w:szCs w:val="19"/>
+              </w:rPr>
+              <w:t xml:space="preserve">Board still running and talking to the central; its sensor silent</w:t>
+            </w:r>
+          </w:p>
+        </w:tc>
+      </w:tr>
+    </w:tbl>
+    <w:p>
+      <w:pPr>
+        <w:spacing w:after="120"/>
+      </w:pPr>
     </w:p>
     <w:p>
       <w:pPr>
@@ -2521,10 +2857,10 @@
           <w:b/>
           <w:bCs/>
         </w:rPr>
-        <w:t xml:space="preserve">The ruler node's reported orientation spun</w:t>
-      </w:r>
-      <w:r>
-        <w:t xml:space="preserve"> by a median of ~27° between consecutive samples, up to ~2000 °/s. The desk node stayed within 0.05°.</w:t>
+        <w:t xml:space="preserve">Not the link:</w:t>
+      </w:r>
+      <w:r>
+        <w:t xml:space="preserve"> 0 checksum failures and 0 corrupted bytes for the whole run, and the ruler board's health reports kept arriving.</w:t>
       </w:r>
     </w:p>
     <w:p>
@@ -2541,10 +2877,10 @@
           <w:b/>
           <w:bCs/>
         </w:rPr>
-        <w:t xml:space="preserve">The ruler node stalled 26 times</w:t>
-      </w:r>
-      <w:r>
-        <w:t xml:space="preserve">, each for ~0.2 s. That matches its built-in sensor-restart routine firing repeatedly without fixing the problem.</w:t>
+        <w:t xml:space="preserve">Not a board reset or power loss:</w:t>
+      </w:r>
+      <w:r>
+        <w:t xml:space="preserve"> its uptime counter never restarted.</w:t>
       </w:r>
     </w:p>
     <w:p>
@@ -2561,10 +2897,10 @@
           <w:b/>
           <w:bCs/>
         </w:rPr>
-        <w:t xml:space="preserve">Valid samples fell to 93 %.</w:t>
-      </w:r>
-      <w:r>
-        <w:t xml:space="preserve"> The rest were gaps filled with the previous value.</w:t>
+        <w:t xml:space="preserve">Not calibration:</w:t>
+      </w:r>
+      <w:r>
+        <w:t xml:space="preserve"> the fault is between the ruler board's processor and its own sensor. The desk node's sensor stayed perfect for all 41 minutes.</w:t>
       </w:r>
     </w:p>
     <w:p>
@@ -2572,7 +2908,22 @@
         <w:spacing w:after="120" w:before="80"/>
       </w:pPr>
       <w:r>
-        <w:t xml:space="preserve">This is consistent with the drop in data quality seen after ~15 minutes of collection. It isn't caused by calibration or by the sample-rate issue. The diagnostic build reports the ruler node's sensor health once a second, to show when and how it fails.</w:t>
+        <w:t xml:space="preserve">The likely cause is a hardware problem on that board (the sensor, its connections, or heat), but a firmware cause isn't ruled out yet. Swapping the two boards' roles will tell: if the fault stays with the same physical board, it's that board.</w:t>
+      </w:r>
+    </w:p>
+    <w:p>
+      <w:pPr>
+        <w:spacing w:after="120"/>
+      </w:pPr>
+      <w:r>
+        <w:rPr>
+          <w:b/>
+          <w:bCs/>
+        </w:rPr>
+        <w:t xml:space="preserve">Firmware protection (made, awaiting a test run):</w:t>
+      </w:r>
+      <w:r>
+        <w:t xml:space="preserve"> the ruler board now rejects implausible samples and sends them as gaps instead of wrong angles, resets its filter after each sensor restart, and reboots itself if its sensor produces nothing usable for 5 s.</w:t>
       </w:r>
     </w:p>
     <w:p>
@@ -2653,10 +3004,10 @@
           <w:b/>
           <w:bCs/>
         </w:rPr>
-        <w:t xml:space="preserve">5-minute holds.</w:t>
-      </w:r>
-      <w:r>
-        <w:t xml:space="preserve"> Drift over longer periods isn't measured.</w:t>
+        <w:t xml:space="preserve">Mostly 5-minute holds.</w:t>
+      </w:r>
+      <w:r>
+        <w:t xml:space="preserve"> One clean 18-minute stretch exists; longer drift isn't measured yet because of the sensor fault.</w:t>
       </w:r>
     </w:p>
     <w:p>
@@ -2795,7 +3146,7 @@
                 <w:sz w:val="19"/>
                 <w:szCs w:val="19"/>
               </w:rPr>
-              <w:t xml:space="preserve">Ready: flash both boards</w:t>
+              <w:t xml:space="preserve">Done (~40 min run)</w:t>
             </w:r>
           </w:p>
         </w:tc>
@@ -2880,7 +3231,7 @@
                 <w:sz w:val="19"/>
                 <w:szCs w:val="19"/>
               </w:rPr>
-              <w:t xml:space="preserve">Fix the sample rate (faster output cycle; one row per received sample)</w:t>
+              <w:t xml:space="preserve">Speed up the output cycle (one write per line)</w:t>
             </w:r>
           </w:p>
         </w:tc>
@@ -2900,7 +3251,7 @@
                 <w:sz w:val="19"/>
                 <w:szCs w:val="19"/>
               </w:rPr>
-              <w:t xml:space="preserve">After diagnostics</w:t>
+              <w:t xml:space="preserve">Done: flash both boards and test</w:t>
             </w:r>
           </w:p>
         </w:tc>
@@ -2925,7 +3276,7 @@
                 <w:sz w:val="19"/>
                 <w:szCs w:val="19"/>
               </w:rPr>
-              <w:t xml:space="preserve">Investigate and fix the ruler-node sensor fault</w:t>
+              <w:t xml:space="preserve">Guard the ruler node against a failing sensor</w:t>
             </w:r>
           </w:p>
         </w:tc>
@@ -2945,7 +3296,97 @@
                 <w:sz w:val="19"/>
                 <w:szCs w:val="19"/>
               </w:rPr>
-              <w:t xml:space="preserve">After diagnostics</w:t>
+              <w:t xml:space="preserve">Done: flash both boards and test</w:t>
+            </w:r>
+          </w:p>
+        </w:tc>
+      </w:tr>
+      <w:tr>
+        <w:trPr>
+          <w:cantSplit/>
+        </w:trPr>
+        <w:tc>
+          <w:tcPr>
+            <w:tcW w:type="dxa" w:w="6854"/>
+            <w:tcMar>
+              <w:top w:type="dxa" w:w="60"/>
+              <w:left w:type="dxa" w:w="100"/>
+              <w:bottom w:type="dxa" w:w="60"/>
+              <w:right w:type="dxa" w:w="100"/>
+            </w:tcMar>
+          </w:tcPr>
+          <w:p>
+            <w:r>
+              <w:rPr>
+                <w:sz w:val="19"/>
+                <w:szCs w:val="19"/>
+              </w:rPr>
+              <w:t xml:space="preserve">Swap the boards' roles to see if the fault follows the hardware</w:t>
+            </w:r>
+          </w:p>
+        </w:tc>
+        <w:tc>
+          <w:tcPr>
+            <w:tcW w:type="dxa" w:w="3226"/>
+            <w:tcMar>
+              <w:top w:type="dxa" w:w="60"/>
+              <w:left w:type="dxa" w:w="100"/>
+              <w:bottom w:type="dxa" w:w="60"/>
+              <w:right w:type="dxa" w:w="100"/>
+            </w:tcMar>
+          </w:tcPr>
+          <w:p>
+            <w:r>
+              <w:rPr>
+                <w:sz w:val="19"/>
+                <w:szCs w:val="19"/>
+              </w:rPr>
+              <w:t xml:space="preserve">Next test</w:t>
+            </w:r>
+          </w:p>
+        </w:tc>
+      </w:tr>
+      <w:tr>
+        <w:trPr>
+          <w:cantSplit/>
+        </w:trPr>
+        <w:tc>
+          <w:tcPr>
+            <w:tcW w:type="dxa" w:w="6854"/>
+            <w:tcMar>
+              <w:top w:type="dxa" w:w="60"/>
+              <w:left w:type="dxa" w:w="100"/>
+              <w:bottom w:type="dxa" w:w="60"/>
+              <w:right w:type="dxa" w:w="100"/>
+            </w:tcMar>
+          </w:tcPr>
+          <w:p>
+            <w:r>
+              <w:rPr>
+                <w:sz w:val="19"/>
+                <w:szCs w:val="19"/>
+              </w:rPr>
+              <w:t xml:space="preserve">Write one CSV row per received sample</w:t>
+            </w:r>
+          </w:p>
+        </w:tc>
+        <w:tc>
+          <w:tcPr>
+            <w:tcW w:type="dxa" w:w="3226"/>
+            <w:tcMar>
+              <w:top w:type="dxa" w:w="60"/>
+              <w:left w:type="dxa" w:w="100"/>
+              <w:bottom w:type="dxa" w:w="60"/>
+              <w:right w:type="dxa" w:w="100"/>
+            </w:tcMar>
+          </w:tcPr>
+          <w:p>
+            <w:r>
+              <w:rPr>
+                <w:sz w:val="19"/>
+                <w:szCs w:val="19"/>
+              </w:rPr>
+              <w:t xml:space="preserve">To do</w:t>
             </w:r>
           </w:p>
         </w:tc>

</xml_diff>

<commit_message>
Report: board-swap result, confirmed rate fix, 1-hour hold, 45/90 rig check
REPORT.md and the .docx are rewritten around the latest results: the
sensor fault follows one physical board (replace it), the 50 Hz and
one-row-per-sample fixes are confirmed (0 duplicate rows), a 57-minute
clean hold (drift -0.001 deg/min), and a preliminary 45/90 degree rig
check (45.0 and 89.0 deg, with the reference-node caveat). Also notes
that valid % only reflects the shank node's data.

FINDINGS.md gains sections 9-11 with the per-run detail.

Co-Authored-By: Claude Opus 5.5 <noreply@anthropic.com>
Claude-Session: https://claude.ai/code/session_01AxnhBNGVNZa62atbRd2ZEw
</commit_message>
<xml_diff>
--- a/analysis/static_test/Static_Stability_Test_Report.docx
+++ b/analysis/static_test/Static_Stability_Test_Report.docx
@@ -20,7 +20,7 @@
           <w:sz w:val="32"/>
           <w:szCs w:val="32"/>
         </w:rPr>
-        <w:t xml:space="preserve">Static Stability Test Report</w:t>
+        <w:t xml:space="preserve">Static Test Report</w:t>
       </w:r>
     </w:p>
     <w:p>
@@ -119,20 +119,20 @@
           <w:b/>
           <w:bCs/>
         </w:rPr>
-        <w:t xml:space="preserve">0.01°</w:t>
-      </w:r>
-      <w:r>
-        <w:t xml:space="preserve">, and on a stable setup the reading changed by </w:t>
+        <w:t xml:space="preserve">0.01–0.02°</w:t>
+      </w:r>
+      <w:r>
+        <w:t xml:space="preserve">. On a stable setup the reading changed by </w:t>
       </w:r>
       <w:r>
         <w:rPr>
           <w:b/>
           <w:bCs/>
         </w:rPr>
-        <w:t xml:space="preserve">less than 0.1° over 5 minutes</w:t>
-      </w:r>
-      <w:r>
-        <w:t xml:space="preserve">, with no detectable drift. Every sample in all six runs was valid.</w:t>
+        <w:t xml:space="preserve">less than 0.1° over 5 minutes, and by about 0.06° over a full hour</w:t>
+      </w:r>
+      <w:r>
+        <w:t xml:space="preserve"> (drift −0.001 °/min).</w:t>
       </w:r>
     </w:p>
     <w:p>
@@ -140,7 +140,25 @@
         <w:spacing w:after="120"/>
       </w:pPr>
       <w:r>
-        <w:t xml:space="preserve">Testing also turned up three problems to fix before dynamic (movement) testing:</w:t>
+        <w:t xml:space="preserve">A preliminary check on 45° and 90° rigs read </w:t>
+      </w:r>
+      <w:r>
+        <w:rPr>
+          <w:b/>
+          <w:bCs/>
+        </w:rPr>
+        <w:t xml:space="preserve">45.0° and 89.0°</w:t>
+      </w:r>
+      <w:r>
+        <w:t xml:space="preserve">. That's within 1° of nominal, but the setup couldn't give a rigorous accuracy figure (see below).</w:t>
+      </w:r>
+    </w:p>
+    <w:p>
+      <w:pPr>
+        <w:spacing w:after="120"/>
+      </w:pPr>
+      <w:r>
+        <w:t xml:space="preserve">Testing also found three problems:</w:t>
       </w:r>
     </w:p>
     <w:p>
@@ -157,10 +175,20 @@
           <w:b/>
           <w:bCs/>
         </w:rPr>
-        <w:t xml:space="preserve">The sample rate is ~40 Hz, not the configured 50 Hz</w:t>
-      </w:r>
-      <w:r>
-        <w:t xml:space="preserve">, and ~20 % of CSV rows are duplicates. The static results are unaffected.</w:t>
+        <w:t xml:space="preserve">The sample rate was ~40 Hz, not 50 Hz,</w:t>
+      </w:r>
+      <w:r>
+        <w:t xml:space="preserve"> and ~20 % of CSV rows were duplicates. </w:t>
+      </w:r>
+      <w:r>
+        <w:rPr>
+          <w:b/>
+          <w:bCs/>
+        </w:rPr>
+        <w:t xml:space="preserve">Fixed and confirmed:</w:t>
+      </w:r>
+      <w:r>
+        <w:t xml:space="preserve"> true 50 Hz, 0 duplicate rows. The static results were unaffected.</w:t>
       </w:r>
     </w:p>
     <w:p>
@@ -177,10 +205,17 @@
           <w:b/>
           <w:bCs/>
         </w:rPr>
-        <w:t xml:space="preserve">The ruler-side node's sensor fails after ~20 minutes of running.</w:t>
-      </w:r>
-      <w:r>
-        <w:t xml:space="preserve"> Its reads start hanging and returning garbage, and a few minutes later it stops producing data. Seen twice, both times with the board untouched.</w:t>
+        <w:t xml:space="preserve">One board's sensor fails after 20–47 minutes of running.</w:t>
+      </w:r>
+      <w:r>
+        <w:t xml:space="preserve"> The fault followed that physical board when the boards swapped roles; the other board ran a full hour without a single bad reading. </w:t>
+      </w:r>
+      <w:r>
+        <w:rPr>
+          <w:b/>
+          <w:bCs/>
+        </w:rPr>
+        <w:t xml:space="preserve">Action: replace that board.</w:t>
       </w:r>
     </w:p>
     <w:p>
@@ -197,7 +232,7 @@
           <w:b/>
           <w:bCs/>
         </w:rPr>
-        <w:t xml:space="preserve">Only one of the two sensors was exercised</w:t>
+        <w:t xml:space="preserve">Only one node was exercised</w:t>
       </w:r>
       <w:r>
         <w:t xml:space="preserve"> by these tests, because of how calibration works when one node never tilts.</w:t>
@@ -213,20 +248,50 @@
     </w:p>
     <w:p>
       <w:pPr>
-        <w:spacing w:after="120"/>
-      </w:pPr>
-      <w:r>
-        <w:t xml:space="preserve">To check </w:t>
-      </w:r>
+        <w:pStyle w:val="ListParagraph"/>
+        <w:numPr>
+          <w:ilvl w:val="0"/>
+          <w:numId w:val="3"/>
+        </w:numPr>
+        <w:spacing w:after="60"/>
+      </w:pPr>
       <w:r>
         <w:rPr>
           <w:b/>
           <w:bCs/>
         </w:rPr>
-        <w:t xml:space="preserve">stability, not accuracy</w:t>
-      </w:r>
-      <w:r>
-        <w:t xml:space="preserve">: if nothing moves, does the measured angle also stay unchanged? No reference angle was used, so absolute accuracy is out of scope.</w:t>
+        <w:t xml:space="preserve">Stability:</w:t>
+      </w:r>
+      <w:r>
+        <w:t xml:space="preserve"> if nothing moves, does the measured angle also stay unchanged?</w:t>
+      </w:r>
+    </w:p>
+    <w:p>
+      <w:pPr>
+        <w:pStyle w:val="ListParagraph"/>
+        <w:numPr>
+          <w:ilvl w:val="0"/>
+          <w:numId w:val="3"/>
+        </w:numPr>
+        <w:spacing w:after="60"/>
+      </w:pPr>
+      <w:r>
+        <w:rPr>
+          <w:b/>
+          <w:bCs/>
+        </w:rPr>
+        <w:t xml:space="preserve">Preliminary angle check:</w:t>
+      </w:r>
+      <w:r>
+        <w:t xml:space="preserve"> do fixed 45° and 90° rigs read close to nominal?</w:t>
+      </w:r>
+    </w:p>
+    <w:p>
+      <w:pPr>
+        <w:spacing w:after="120" w:before="80"/>
+      </w:pPr>
+      <w:r>
+        <w:t xml:space="preserve">The rigs weren't precise enough for a formal accuracy figure, so that part is a preliminary inspection only.</w:t>
       </w:r>
     </w:p>
     <w:p>
@@ -251,9 +316,11 @@
         <w:tblLayout w:type="fixed"/>
       </w:tblPr>
       <w:tblGrid>
-        <w:gridCol w:w="1945"/>
-        <w:gridCol w:w="3536"/>
-        <w:gridCol w:w="4599"/>
+        <w:gridCol w:w="1527"/>
+        <w:gridCol w:w="1985"/>
+        <w:gridCol w:w="2443"/>
+        <w:gridCol w:w="1985"/>
+        <w:gridCol w:w="2140"/>
       </w:tblGrid>
       <w:tr>
         <w:trPr>
@@ -261,7 +328,7 @@
         </w:trPr>
         <w:tc>
           <w:tcPr>
-            <w:tcW w:type="dxa" w:w="1945"/>
+            <w:tcW w:type="dxa" w:w="1527"/>
             <w:shd w:fill="DCE6F1" w:color="auto" w:val="clear"/>
             <w:tcMar>
               <w:top w:type="dxa" w:w="60"/>
@@ -274,7 +341,7 @@
         </w:tc>
         <w:tc>
           <w:tcPr>
-            <w:tcW w:type="dxa" w:w="3536"/>
+            <w:tcW w:type="dxa" w:w="1985"/>
             <w:shd w:fill="DCE6F1" w:color="auto" w:val="clear"/>
             <w:tcMar>
               <w:top w:type="dxa" w:w="60"/>
@@ -297,7 +364,7 @@
         </w:tc>
         <w:tc>
           <w:tcPr>
-            <w:tcW w:type="dxa" w:w="4599"/>
+            <w:tcW w:type="dxa" w:w="2443"/>
             <w:shd w:fill="DCE6F1" w:color="auto" w:val="clear"/>
             <w:tcMar>
               <w:top w:type="dxa" w:w="60"/>
@@ -315,6 +382,52 @@
                 <w:szCs w:val="19"/>
               </w:rPr>
               <w:t xml:space="preserve">Session 2 (runs 4–6)</w:t>
+            </w:r>
+          </w:p>
+        </w:tc>
+        <w:tc>
+          <w:tcPr>
+            <w:tcW w:type="dxa" w:w="1985"/>
+            <w:shd w:fill="DCE6F1" w:color="auto" w:val="clear"/>
+            <w:tcMar>
+              <w:top w:type="dxa" w:w="60"/>
+              <w:left w:type="dxa" w:w="100"/>
+              <w:bottom w:type="dxa" w:w="60"/>
+              <w:right w:type="dxa" w:w="100"/>
+            </w:tcMar>
+          </w:tcPr>
+          <w:p>
+            <w:r>
+              <w:rPr>
+                <w:b/>
+                <w:bCs/>
+                <w:sz w:val="19"/>
+                <w:szCs w:val="19"/>
+              </w:rPr>
+              <w:t xml:space="preserve">Long runs (3 runs)</w:t>
+            </w:r>
+          </w:p>
+        </w:tc>
+        <w:tc>
+          <w:tcPr>
+            <w:tcW w:type="dxa" w:w="2140"/>
+            <w:shd w:fill="DCE6F1" w:color="auto" w:val="clear"/>
+            <w:tcMar>
+              <w:top w:type="dxa" w:w="60"/>
+              <w:left w:type="dxa" w:w="100"/>
+              <w:bottom w:type="dxa" w:w="60"/>
+              <w:right w:type="dxa" w:w="100"/>
+            </w:tcMar>
+          </w:tcPr>
+          <w:p>
+            <w:r>
+              <w:rPr>
+                <w:b/>
+                <w:bCs/>
+                <w:sz w:val="19"/>
+                <w:szCs w:val="19"/>
+              </w:rPr>
+              <w:t xml:space="preserve">Angle rig (45°, 90°)</w:t>
             </w:r>
           </w:p>
         </w:tc>
@@ -325,7 +438,7 @@
         </w:trPr>
         <w:tc>
           <w:tcPr>
-            <w:tcW w:type="dxa" w:w="1945"/>
+            <w:tcW w:type="dxa" w:w="1527"/>
             <w:tcMar>
               <w:top w:type="dxa" w:w="60"/>
               <w:left w:type="dxa" w:w="100"/>
@@ -345,7 +458,7 @@
         </w:tc>
         <w:tc>
           <w:tcPr>
-            <w:tcW w:type="dxa" w:w="3536"/>
+            <w:tcW w:type="dxa" w:w="1985"/>
             <w:tcMar>
               <w:top w:type="dxa" w:w="60"/>
               <w:left w:type="dxa" w:w="100"/>
@@ -365,7 +478,47 @@
         </w:tc>
         <w:tc>
           <w:tcPr>
-            <w:tcW w:type="dxa" w:w="4599"/>
+            <w:tcW w:type="dxa" w:w="2443"/>
+            <w:tcMar>
+              <w:top w:type="dxa" w:w="60"/>
+              <w:left w:type="dxa" w:w="100"/>
+              <w:bottom w:type="dxa" w:w="60"/>
+              <w:right w:type="dxa" w:w="100"/>
+            </w:tcMar>
+          </w:tcPr>
+          <w:p>
+            <w:r>
+              <w:rPr>
+                <w:sz w:val="19"/>
+                <w:szCs w:val="19"/>
+              </w:rPr>
+              <w:t xml:space="preserve">2026-09-24</w:t>
+            </w:r>
+          </w:p>
+        </w:tc>
+        <w:tc>
+          <w:tcPr>
+            <w:tcW w:type="dxa" w:w="1985"/>
+            <w:tcMar>
+              <w:top w:type="dxa" w:w="60"/>
+              <w:left w:type="dxa" w:w="100"/>
+              <w:bottom w:type="dxa" w:w="60"/>
+              <w:right w:type="dxa" w:w="100"/>
+            </w:tcMar>
+          </w:tcPr>
+          <w:p>
+            <w:r>
+              <w:rPr>
+                <w:sz w:val="19"/>
+                <w:szCs w:val="19"/>
+              </w:rPr>
+              <w:t xml:space="preserve">2026-09-24</w:t>
+            </w:r>
+          </w:p>
+        </w:tc>
+        <w:tc>
+          <w:tcPr>
+            <w:tcW w:type="dxa" w:w="2140"/>
             <w:tcMar>
               <w:top w:type="dxa" w:w="60"/>
               <w:left w:type="dxa" w:w="100"/>
@@ -390,61 +543,101 @@
         </w:trPr>
         <w:tc>
           <w:tcPr>
-            <w:tcW w:type="dxa" w:w="1945"/>
-            <w:tcMar>
-              <w:top w:type="dxa" w:w="60"/>
-              <w:left w:type="dxa" w:w="100"/>
-              <w:bottom w:type="dxa" w:w="60"/>
-              <w:right w:type="dxa" w:w="100"/>
-            </w:tcMar>
-          </w:tcPr>
-          <w:p>
-            <w:r>
-              <w:rPr>
-                <w:sz w:val="19"/>
-                <w:szCs w:val="19"/>
-              </w:rPr>
-              <w:t xml:space="preserve">Rig</w:t>
-            </w:r>
-          </w:p>
-        </w:tc>
-        <w:tc>
-          <w:tcPr>
-            <w:tcW w:type="dxa" w:w="3536"/>
-            <w:tcMar>
-              <w:top w:type="dxa" w:w="60"/>
-              <w:left w:type="dxa" w:w="100"/>
-              <w:bottom w:type="dxa" w:w="60"/>
-              <w:right w:type="dxa" w:w="100"/>
-            </w:tcMar>
-          </w:tcPr>
-          <w:p>
-            <w:r>
-              <w:rPr>
-                <w:sz w:val="19"/>
-                <w:szCs w:val="19"/>
-              </w:rPr>
-              <w:t xml:space="preserve">Both nodes on a flat desk</w:t>
-            </w:r>
-          </w:p>
-        </w:tc>
-        <w:tc>
-          <w:tcPr>
-            <w:tcW w:type="dxa" w:w="4599"/>
-            <w:tcMar>
-              <w:top w:type="dxa" w:w="60"/>
-              <w:left w:type="dxa" w:w="100"/>
-              <w:bottom w:type="dxa" w:w="60"/>
-              <w:right w:type="dxa" w:w="100"/>
-            </w:tcMar>
-          </w:tcPr>
-          <w:p>
-            <w:r>
-              <w:rPr>
-                <w:sz w:val="19"/>
-                <w:szCs w:val="19"/>
-              </w:rPr>
-              <w:t xml:space="preserve">Raised rig: desk node ~1 cm higher, ~5 cm apart, roughly in line</w:t>
+            <w:tcW w:type="dxa" w:w="1527"/>
+            <w:tcMar>
+              <w:top w:type="dxa" w:w="60"/>
+              <w:left w:type="dxa" w:w="100"/>
+              <w:bottom w:type="dxa" w:w="60"/>
+              <w:right w:type="dxa" w:w="100"/>
+            </w:tcMar>
+          </w:tcPr>
+          <w:p>
+            <w:r>
+              <w:rPr>
+                <w:sz w:val="19"/>
+                <w:szCs w:val="19"/>
+              </w:rPr>
+              <w:t xml:space="preserve">Thigh node</w:t>
+            </w:r>
+          </w:p>
+        </w:tc>
+        <w:tc>
+          <w:tcPr>
+            <w:tcW w:type="dxa" w:w="1985"/>
+            <w:tcMar>
+              <w:top w:type="dxa" w:w="60"/>
+              <w:left w:type="dxa" w:w="100"/>
+              <w:bottom w:type="dxa" w:w="60"/>
+              <w:right w:type="dxa" w:w="100"/>
+            </w:tcMar>
+          </w:tcPr>
+          <w:p>
+            <w:r>
+              <w:rPr>
+                <w:sz w:val="19"/>
+                <w:szCs w:val="19"/>
+              </w:rPr>
+              <w:t xml:space="preserve">Taped to the desk</w:t>
+            </w:r>
+          </w:p>
+        </w:tc>
+        <w:tc>
+          <w:tcPr>
+            <w:tcW w:type="dxa" w:w="2443"/>
+            <w:tcMar>
+              <w:top w:type="dxa" w:w="60"/>
+              <w:left w:type="dxa" w:w="100"/>
+              <w:bottom w:type="dxa" w:w="60"/>
+              <w:right w:type="dxa" w:w="100"/>
+            </w:tcMar>
+          </w:tcPr>
+          <w:p>
+            <w:r>
+              <w:rPr>
+                <w:sz w:val="19"/>
+                <w:szCs w:val="19"/>
+              </w:rPr>
+              <w:t xml:space="preserve">Taped to a raised rig</w:t>
+            </w:r>
+          </w:p>
+        </w:tc>
+        <w:tc>
+          <w:tcPr>
+            <w:tcW w:type="dxa" w:w="1985"/>
+            <w:tcMar>
+              <w:top w:type="dxa" w:w="60"/>
+              <w:left w:type="dxa" w:w="100"/>
+              <w:bottom w:type="dxa" w:w="60"/>
+              <w:right w:type="dxa" w:w="100"/>
+            </w:tcMar>
+          </w:tcPr>
+          <w:p>
+            <w:r>
+              <w:rPr>
+                <w:sz w:val="19"/>
+                <w:szCs w:val="19"/>
+              </w:rPr>
+              <w:t xml:space="preserve">Taped to the rig</w:t>
+            </w:r>
+          </w:p>
+        </w:tc>
+        <w:tc>
+          <w:tcPr>
+            <w:tcW w:type="dxa" w:w="2140"/>
+            <w:tcMar>
+              <w:top w:type="dxa" w:w="60"/>
+              <w:left w:type="dxa" w:w="100"/>
+              <w:bottom w:type="dxa" w:w="60"/>
+              <w:right w:type="dxa" w:w="100"/>
+            </w:tcMar>
+          </w:tcPr>
+          <w:p>
+            <w:r>
+              <w:rPr>
+                <w:sz w:val="19"/>
+                <w:szCs w:val="19"/>
+              </w:rPr>
+              <w:t xml:space="preserve">On the flat upper segment</w:t>
             </w:r>
           </w:p>
         </w:tc>
@@ -455,61 +648,101 @@
         </w:trPr>
         <w:tc>
           <w:tcPr>
-            <w:tcW w:type="dxa" w:w="1945"/>
-            <w:tcMar>
-              <w:top w:type="dxa" w:w="60"/>
-              <w:left w:type="dxa" w:w="100"/>
-              <w:bottom w:type="dxa" w:w="60"/>
-              <w:right w:type="dxa" w:w="100"/>
-            </w:tcMar>
-          </w:tcPr>
-          <w:p>
-            <w:r>
-              <w:rPr>
-                <w:sz w:val="19"/>
-                <w:szCs w:val="19"/>
-              </w:rPr>
-              <w:t xml:space="preserve">Thigh node</w:t>
-            </w:r>
-          </w:p>
-        </w:tc>
-        <w:tc>
-          <w:tcPr>
-            <w:tcW w:type="dxa" w:w="3536"/>
-            <w:tcMar>
-              <w:top w:type="dxa" w:w="60"/>
-              <w:left w:type="dxa" w:w="100"/>
-              <w:bottom w:type="dxa" w:w="60"/>
-              <w:right w:type="dxa" w:w="100"/>
-            </w:tcMar>
-          </w:tcPr>
-          <w:p>
-            <w:r>
-              <w:rPr>
-                <w:sz w:val="19"/>
-                <w:szCs w:val="19"/>
-              </w:rPr>
-              <w:t xml:space="preserve">Taped to the desk</w:t>
-            </w:r>
-          </w:p>
-        </w:tc>
-        <w:tc>
-          <w:tcPr>
-            <w:tcW w:type="dxa" w:w="4599"/>
-            <w:tcMar>
-              <w:top w:type="dxa" w:w="60"/>
-              <w:left w:type="dxa" w:w="100"/>
-              <w:bottom w:type="dxa" w:w="60"/>
-              <w:right w:type="dxa" w:w="100"/>
-            </w:tcMar>
-          </w:tcPr>
-          <w:p>
-            <w:r>
-              <w:rPr>
-                <w:sz w:val="19"/>
-                <w:szCs w:val="19"/>
-              </w:rPr>
-              <w:t xml:space="preserve">Taped to the rig</w:t>
+            <w:tcW w:type="dxa" w:w="1527"/>
+            <w:tcMar>
+              <w:top w:type="dxa" w:w="60"/>
+              <w:left w:type="dxa" w:w="100"/>
+              <w:bottom w:type="dxa" w:w="60"/>
+              <w:right w:type="dxa" w:w="100"/>
+            </w:tcMar>
+          </w:tcPr>
+          <w:p>
+            <w:r>
+              <w:rPr>
+                <w:sz w:val="19"/>
+                <w:szCs w:val="19"/>
+              </w:rPr>
+              <w:t xml:space="preserve">Shank node</w:t>
+            </w:r>
+          </w:p>
+        </w:tc>
+        <w:tc>
+          <w:tcPr>
+            <w:tcW w:type="dxa" w:w="1985"/>
+            <w:tcMar>
+              <w:top w:type="dxa" w:w="60"/>
+              <w:left w:type="dxa" w:w="100"/>
+              <w:bottom w:type="dxa" w:w="60"/>
+              <w:right w:type="dxa" w:w="100"/>
+            </w:tcMar>
+          </w:tcPr>
+          <w:p>
+            <w:r>
+              <w:rPr>
+                <w:sz w:val="19"/>
+                <w:szCs w:val="19"/>
+              </w:rPr>
+              <w:t xml:space="preserve">Taped to a ruler</w:t>
+            </w:r>
+          </w:p>
+        </w:tc>
+        <w:tc>
+          <w:tcPr>
+            <w:tcW w:type="dxa" w:w="2443"/>
+            <w:tcMar>
+              <w:top w:type="dxa" w:w="60"/>
+              <w:left w:type="dxa" w:w="100"/>
+              <w:bottom w:type="dxa" w:w="60"/>
+              <w:right w:type="dxa" w:w="100"/>
+            </w:tcMar>
+          </w:tcPr>
+          <w:p>
+            <w:r>
+              <w:rPr>
+                <w:sz w:val="19"/>
+                <w:szCs w:val="19"/>
+              </w:rPr>
+              <w:t xml:space="preserve">Taped to a ruler, ~1 cm lower, ~5 cm apart</w:t>
+            </w:r>
+          </w:p>
+        </w:tc>
+        <w:tc>
+          <w:tcPr>
+            <w:tcW w:type="dxa" w:w="1985"/>
+            <w:tcMar>
+              <w:top w:type="dxa" w:w="60"/>
+              <w:left w:type="dxa" w:w="100"/>
+              <w:bottom w:type="dxa" w:w="60"/>
+              <w:right w:type="dxa" w:w="100"/>
+            </w:tcMar>
+          </w:tcPr>
+          <w:p>
+            <w:r>
+              <w:rPr>
+                <w:sz w:val="19"/>
+                <w:szCs w:val="19"/>
+              </w:rPr>
+              <w:t xml:space="preserve">Taped to a ruler</w:t>
+            </w:r>
+          </w:p>
+        </w:tc>
+        <w:tc>
+          <w:tcPr>
+            <w:tcW w:type="dxa" w:w="2140"/>
+            <w:tcMar>
+              <w:top w:type="dxa" w:w="60"/>
+              <w:left w:type="dxa" w:w="100"/>
+              <w:bottom w:type="dxa" w:w="60"/>
+              <w:right w:type="dxa" w:w="100"/>
+            </w:tcMar>
+          </w:tcPr>
+          <w:p>
+            <w:r>
+              <w:rPr>
+                <w:sz w:val="19"/>
+                <w:szCs w:val="19"/>
+              </w:rPr>
+              <w:t xml:space="preserve">On the angled lower segment</w:t>
             </w:r>
           </w:p>
         </w:tc>
@@ -520,137 +753,7 @@
         </w:trPr>
         <w:tc>
           <w:tcPr>
-            <w:tcW w:type="dxa" w:w="1945"/>
-            <w:tcMar>
-              <w:top w:type="dxa" w:w="60"/>
-              <w:left w:type="dxa" w:w="100"/>
-              <w:bottom w:type="dxa" w:w="60"/>
-              <w:right w:type="dxa" w:w="100"/>
-            </w:tcMar>
-          </w:tcPr>
-          <w:p>
-            <w:r>
-              <w:rPr>
-                <w:sz w:val="19"/>
-                <w:szCs w:val="19"/>
-              </w:rPr>
-              <w:t xml:space="preserve">Shank node</w:t>
-            </w:r>
-          </w:p>
-        </w:tc>
-        <w:tc>
-          <w:tcPr>
-            <w:tcW w:type="dxa" w:w="3536"/>
-            <w:tcMar>
-              <w:top w:type="dxa" w:w="60"/>
-              <w:left w:type="dxa" w:w="100"/>
-              <w:bottom w:type="dxa" w:w="60"/>
-              <w:right w:type="dxa" w:w="100"/>
-            </w:tcMar>
-          </w:tcPr>
-          <w:p>
-            <w:r>
-              <w:rPr>
-                <w:sz w:val="19"/>
-                <w:szCs w:val="19"/>
-              </w:rPr>
-              <w:t xml:space="preserve">Taped to a ruler</w:t>
-            </w:r>
-          </w:p>
-        </w:tc>
-        <w:tc>
-          <w:tcPr>
-            <w:tcW w:type="dxa" w:w="4599"/>
-            <w:tcMar>
-              <w:top w:type="dxa" w:w="60"/>
-              <w:left w:type="dxa" w:w="100"/>
-              <w:bottom w:type="dxa" w:w="60"/>
-              <w:right w:type="dxa" w:w="100"/>
-            </w:tcMar>
-          </w:tcPr>
-          <w:p>
-            <w:r>
-              <w:rPr>
-                <w:sz w:val="19"/>
-                <w:szCs w:val="19"/>
-              </w:rPr>
-              <w:t xml:space="preserve">Taped to a ruler</w:t>
-            </w:r>
-          </w:p>
-        </w:tc>
-      </w:tr>
-      <w:tr>
-        <w:trPr>
-          <w:cantSplit/>
-        </w:trPr>
-        <w:tc>
-          <w:tcPr>
-            <w:tcW w:type="dxa" w:w="1945"/>
-            <w:tcMar>
-              <w:top w:type="dxa" w:w="60"/>
-              <w:left w:type="dxa" w:w="100"/>
-              <w:bottom w:type="dxa" w:w="60"/>
-              <w:right w:type="dxa" w:w="100"/>
-            </w:tcMar>
-          </w:tcPr>
-          <w:p>
-            <w:r>
-              <w:rPr>
-                <w:sz w:val="19"/>
-                <w:szCs w:val="19"/>
-              </w:rPr>
-              <w:t xml:space="preserve">Firmware</w:t>
-            </w:r>
-          </w:p>
-        </w:tc>
-        <w:tc>
-          <w:tcPr>
-            <w:tcW w:type="dxa" w:w="3536"/>
-            <w:tcMar>
-              <w:top w:type="dxa" w:w="60"/>
-              <w:left w:type="dxa" w:w="100"/>
-              <w:bottom w:type="dxa" w:w="60"/>
-              <w:right w:type="dxa" w:w="100"/>
-            </w:tcMar>
-          </w:tcPr>
-          <w:p>
-            <w:r>
-              <w:rPr>
-                <w:sz w:val="19"/>
-                <w:szCs w:val="19"/>
-              </w:rPr>
-              <w:t xml:space="preserve">Original</w:t>
-            </w:r>
-          </w:p>
-        </w:tc>
-        <w:tc>
-          <w:tcPr>
-            <w:tcW w:type="dxa" w:w="4599"/>
-            <w:tcMar>
-              <w:top w:type="dxa" w:w="60"/>
-              <w:left w:type="dxa" w:w="100"/>
-              <w:bottom w:type="dxa" w:w="60"/>
-              <w:right w:type="dxa" w:w="100"/>
-            </w:tcMar>
-          </w:tcPr>
-          <w:p>
-            <w:r>
-              <w:rPr>
-                <w:sz w:val="19"/>
-                <w:szCs w:val="19"/>
-              </w:rPr>
-              <w:t xml:space="preserve">Emit-timer change (no effect, see issue 1)</w:t>
-            </w:r>
-          </w:p>
-        </w:tc>
-      </w:tr>
-      <w:tr>
-        <w:trPr>
-          <w:cantSplit/>
-        </w:trPr>
-        <w:tc>
-          <w:tcPr>
-            <w:tcW w:type="dxa" w:w="1945"/>
+            <w:tcW w:type="dxa" w:w="1527"/>
             <w:tcMar>
               <w:top w:type="dxa" w:w="60"/>
               <w:left w:type="dxa" w:w="100"/>
@@ -670,7 +773,7 @@
         </w:tc>
         <w:tc>
           <w:tcPr>
-            <w:tcW w:type="dxa" w:w="3536"/>
+            <w:tcW w:type="dxa" w:w="1985"/>
             <w:tcMar>
               <w:top w:type="dxa" w:w="60"/>
               <w:left w:type="dxa" w:w="100"/>
@@ -690,7 +793,7 @@
         </w:tc>
         <w:tc>
           <w:tcPr>
-            <w:tcW w:type="dxa" w:w="4599"/>
+            <w:tcW w:type="dxa" w:w="2443"/>
             <w:tcMar>
               <w:top w:type="dxa" w:w="60"/>
               <w:left w:type="dxa" w:w="100"/>
@@ -705,6 +808,46 @@
                 <w:szCs w:val="19"/>
               </w:rPr>
               <w:t xml:space="preserve">~5–5.5 min per run</w:t>
+            </w:r>
+          </w:p>
+        </w:tc>
+        <w:tc>
+          <w:tcPr>
+            <w:tcW w:type="dxa" w:w="1985"/>
+            <w:tcMar>
+              <w:top w:type="dxa" w:w="60"/>
+              <w:left w:type="dxa" w:w="100"/>
+              <w:bottom w:type="dxa" w:w="60"/>
+              <w:right w:type="dxa" w:w="100"/>
+            </w:tcMar>
+          </w:tcPr>
+          <w:p>
+            <w:r>
+              <w:rPr>
+                <w:sz w:val="19"/>
+                <w:szCs w:val="19"/>
+              </w:rPr>
+              <w:t xml:space="preserve">25–65 min, unattended</w:t>
+            </w:r>
+          </w:p>
+        </w:tc>
+        <w:tc>
+          <w:tcPr>
+            <w:tcW w:type="dxa" w:w="2140"/>
+            <w:tcMar>
+              <w:top w:type="dxa" w:w="60"/>
+              <w:left w:type="dxa" w:w="100"/>
+              <w:bottom w:type="dxa" w:w="60"/>
+              <w:right w:type="dxa" w:w="100"/>
+            </w:tcMar>
+          </w:tcPr>
+          <w:p>
+            <w:r>
+              <w:rPr>
+                <w:sz w:val="19"/>
+                <w:szCs w:val="19"/>
+              </w:rPr>
+              <w:t xml:space="preserve">~20–25 s hold each</w:t>
             </w:r>
           </w:p>
         </w:tc>
@@ -714,6 +857,14 @@
       <w:pPr>
         <w:spacing w:after="120"/>
       </w:pPr>
+    </w:p>
+    <w:p>
+      <w:pPr>
+        <w:spacing w:after="120"/>
+      </w:pPr>
+      <w:r>
+        <w:t xml:space="preserve">All nodes were powered over USB.</w:t>
+      </w:r>
     </w:p>
     <w:p>
       <w:pPr>
@@ -732,7 +883,7 @@
         <w:pStyle w:val="ListParagraph"/>
         <w:numPr>
           <w:ilvl w:val="0"/>
-          <w:numId w:val="3"/>
+          <w:numId w:val="4"/>
         </w:numPr>
         <w:spacing w:after="60"/>
       </w:pPr>
@@ -752,7 +903,7 @@
         <w:pStyle w:val="ListParagraph"/>
         <w:numPr>
           <w:ilvl w:val="0"/>
-          <w:numId w:val="3"/>
+          <w:numId w:val="4"/>
         </w:numPr>
         <w:spacing w:after="60"/>
       </w:pPr>
@@ -764,7 +915,7 @@
         <w:t xml:space="preserve">Calibration sweep, 6 s:</w:t>
       </w:r>
       <w:r>
-        <w:t xml:space="preserve"> the ruler rotated ~90° and returned, so the software learns the direction it bends in.</w:t>
+        <w:t xml:space="preserve"> the shank node rotated and returned, so the software learns the direction it bends in.</w:t>
       </w:r>
     </w:p>
     <w:p>
@@ -772,7 +923,7 @@
         <w:pStyle w:val="ListParagraph"/>
         <w:numPr>
           <w:ilvl w:val="0"/>
-          <w:numId w:val="3"/>
+          <w:numId w:val="4"/>
         </w:numPr>
         <w:spacing w:after="60"/>
       </w:pPr>
@@ -781,10 +932,10 @@
           <w:b/>
           <w:bCs/>
         </w:rPr>
-        <w:t xml:space="preserve">Hold, ~5 min:</w:t>
-      </w:r>
-      <w:r>
-        <w:t xml:space="preserve"> nothing touched.</w:t>
+        <w:t xml:space="preserve">Hold:</w:t>
+      </w:r>
+      <w:r>
+        <w:t xml:space="preserve"> nothing touched. For the angle rig, the shank segment was set at the rig angle and held.</w:t>
       </w:r>
     </w:p>
     <w:p>
@@ -792,7 +943,7 @@
         <w:spacing w:after="120" w:before="80"/>
       </w:pPr>
       <w:r>
-        <w:t xml:space="preserve">The first 20 s (calibration plus setting the ruler down) are excluded from the analysis.</w:t>
+        <w:t xml:space="preserve">The first 20 s (calibration plus setting the node down) are excluded from the stability analysis.</w:t>
       </w:r>
     </w:p>
     <w:p>
@@ -885,11 +1036,11 @@
         <w:tblLayout w:type="fixed"/>
       </w:tblPr>
       <w:tblGrid>
-        <w:gridCol w:w="975"/>
-        <w:gridCol w:w="2113"/>
-        <w:gridCol w:w="1950"/>
-        <w:gridCol w:w="2763"/>
-        <w:gridCol w:w="2279"/>
+        <w:gridCol w:w="1600"/>
+        <w:gridCol w:w="1920"/>
+        <w:gridCol w:w="1760"/>
+        <w:gridCol w:w="2720"/>
+        <w:gridCol w:w="2080"/>
       </w:tblGrid>
       <w:tr>
         <w:trPr>
@@ -897,7 +1048,7 @@
         </w:trPr>
         <w:tc>
           <w:tcPr>
-            <w:tcW w:type="dxa" w:w="975"/>
+            <w:tcW w:type="dxa" w:w="1600"/>
             <w:shd w:fill="DCE6F1" w:color="auto" w:val="clear"/>
             <w:tcMar>
               <w:top w:type="dxa" w:w="60"/>
@@ -920,7 +1071,7 @@
         </w:tc>
         <w:tc>
           <w:tcPr>
-            <w:tcW w:type="dxa" w:w="2113"/>
+            <w:tcW w:type="dxa" w:w="1920"/>
             <w:shd w:fill="DCE6F1" w:color="auto" w:val="clear"/>
             <w:tcMar>
               <w:top w:type="dxa" w:w="60"/>
@@ -943,7 +1094,7 @@
         </w:tc>
         <w:tc>
           <w:tcPr>
-            <w:tcW w:type="dxa" w:w="1950"/>
+            <w:tcW w:type="dxa" w:w="1760"/>
             <w:shd w:fill="DCE6F1" w:color="auto" w:val="clear"/>
             <w:tcMar>
               <w:top w:type="dxa" w:w="60"/>
@@ -966,7 +1117,7 @@
         </w:tc>
         <w:tc>
           <w:tcPr>
-            <w:tcW w:type="dxa" w:w="2763"/>
+            <w:tcW w:type="dxa" w:w="2720"/>
             <w:shd w:fill="DCE6F1" w:color="auto" w:val="clear"/>
             <w:tcMar>
               <w:top w:type="dxa" w:w="60"/>
@@ -989,7 +1140,7 @@
         </w:tc>
         <w:tc>
           <w:tcPr>
-            <w:tcW w:type="dxa" w:w="2279"/>
+            <w:tcW w:type="dxa" w:w="2080"/>
             <w:shd w:fill="DCE6F1" w:color="auto" w:val="clear"/>
             <w:tcMar>
               <w:top w:type="dxa" w:w="60"/>
@@ -1017,7 +1168,7 @@
         </w:trPr>
         <w:tc>
           <w:tcPr>
-            <w:tcW w:type="dxa" w:w="975"/>
+            <w:tcW w:type="dxa" w:w="1600"/>
             <w:tcMar>
               <w:top w:type="dxa" w:w="60"/>
               <w:left w:type="dxa" w:w="100"/>
@@ -1037,7 +1188,7 @@
         </w:tc>
         <w:tc>
           <w:tcPr>
-            <w:tcW w:type="dxa" w:w="2113"/>
+            <w:tcW w:type="dxa" w:w="1920"/>
             <w:tcMar>
               <w:top w:type="dxa" w:w="60"/>
               <w:left w:type="dxa" w:w="100"/>
@@ -1057,7 +1208,7 @@
         </w:tc>
         <w:tc>
           <w:tcPr>
-            <w:tcW w:type="dxa" w:w="1950"/>
+            <w:tcW w:type="dxa" w:w="1760"/>
             <w:tcMar>
               <w:top w:type="dxa" w:w="60"/>
               <w:left w:type="dxa" w:w="100"/>
@@ -1077,7 +1228,7 @@
         </w:tc>
         <w:tc>
           <w:tcPr>
-            <w:tcW w:type="dxa" w:w="2763"/>
+            <w:tcW w:type="dxa" w:w="2720"/>
             <w:tcMar>
               <w:top w:type="dxa" w:w="60"/>
               <w:left w:type="dxa" w:w="100"/>
@@ -1097,7 +1248,7 @@
         </w:tc>
         <w:tc>
           <w:tcPr>
-            <w:tcW w:type="dxa" w:w="2279"/>
+            <w:tcW w:type="dxa" w:w="2080"/>
             <w:tcMar>
               <w:top w:type="dxa" w:w="60"/>
               <w:left w:type="dxa" w:w="100"/>
@@ -1122,7 +1273,7 @@
         </w:trPr>
         <w:tc>
           <w:tcPr>
-            <w:tcW w:type="dxa" w:w="975"/>
+            <w:tcW w:type="dxa" w:w="1600"/>
             <w:tcMar>
               <w:top w:type="dxa" w:w="60"/>
               <w:left w:type="dxa" w:w="100"/>
@@ -1142,7 +1293,7 @@
         </w:tc>
         <w:tc>
           <w:tcPr>
-            <w:tcW w:type="dxa" w:w="2113"/>
+            <w:tcW w:type="dxa" w:w="1920"/>
             <w:tcMar>
               <w:top w:type="dxa" w:w="60"/>
               <w:left w:type="dxa" w:w="100"/>
@@ -1162,7 +1313,7 @@
         </w:tc>
         <w:tc>
           <w:tcPr>
-            <w:tcW w:type="dxa" w:w="1950"/>
+            <w:tcW w:type="dxa" w:w="1760"/>
             <w:tcMar>
               <w:top w:type="dxa" w:w="60"/>
               <w:left w:type="dxa" w:w="100"/>
@@ -1182,7 +1333,7 @@
         </w:tc>
         <w:tc>
           <w:tcPr>
-            <w:tcW w:type="dxa" w:w="2763"/>
+            <w:tcW w:type="dxa" w:w="2720"/>
             <w:tcMar>
               <w:top w:type="dxa" w:w="60"/>
               <w:left w:type="dxa" w:w="100"/>
@@ -1202,7 +1353,7 @@
         </w:tc>
         <w:tc>
           <w:tcPr>
-            <w:tcW w:type="dxa" w:w="2279"/>
+            <w:tcW w:type="dxa" w:w="2080"/>
             <w:tcMar>
               <w:top w:type="dxa" w:w="60"/>
               <w:left w:type="dxa" w:w="100"/>
@@ -1227,7 +1378,7 @@
         </w:trPr>
         <w:tc>
           <w:tcPr>
-            <w:tcW w:type="dxa" w:w="975"/>
+            <w:tcW w:type="dxa" w:w="1600"/>
             <w:tcMar>
               <w:top w:type="dxa" w:w="60"/>
               <w:left w:type="dxa" w:w="100"/>
@@ -1247,7 +1398,7 @@
         </w:tc>
         <w:tc>
           <w:tcPr>
-            <w:tcW w:type="dxa" w:w="2113"/>
+            <w:tcW w:type="dxa" w:w="1920"/>
             <w:tcMar>
               <w:top w:type="dxa" w:w="60"/>
               <w:left w:type="dxa" w:w="100"/>
@@ -1267,7 +1418,7 @@
         </w:tc>
         <w:tc>
           <w:tcPr>
-            <w:tcW w:type="dxa" w:w="1950"/>
+            <w:tcW w:type="dxa" w:w="1760"/>
             <w:tcMar>
               <w:top w:type="dxa" w:w="60"/>
               <w:left w:type="dxa" w:w="100"/>
@@ -1287,7 +1438,7 @@
         </w:tc>
         <w:tc>
           <w:tcPr>
-            <w:tcW w:type="dxa" w:w="2763"/>
+            <w:tcW w:type="dxa" w:w="2720"/>
             <w:tcMar>
               <w:top w:type="dxa" w:w="60"/>
               <w:left w:type="dxa" w:w="100"/>
@@ -1307,7 +1458,7 @@
         </w:tc>
         <w:tc>
           <w:tcPr>
-            <w:tcW w:type="dxa" w:w="2279"/>
+            <w:tcW w:type="dxa" w:w="2080"/>
             <w:tcMar>
               <w:top w:type="dxa" w:w="60"/>
               <w:left w:type="dxa" w:w="100"/>
@@ -1332,7 +1483,7 @@
         </w:trPr>
         <w:tc>
           <w:tcPr>
-            <w:tcW w:type="dxa" w:w="975"/>
+            <w:tcW w:type="dxa" w:w="1600"/>
             <w:tcMar>
               <w:top w:type="dxa" w:w="60"/>
               <w:left w:type="dxa" w:w="100"/>
@@ -1352,7 +1503,7 @@
         </w:tc>
         <w:tc>
           <w:tcPr>
-            <w:tcW w:type="dxa" w:w="2113"/>
+            <w:tcW w:type="dxa" w:w="1920"/>
             <w:tcMar>
               <w:top w:type="dxa" w:w="60"/>
               <w:left w:type="dxa" w:w="100"/>
@@ -1372,7 +1523,7 @@
         </w:tc>
         <w:tc>
           <w:tcPr>
-            <w:tcW w:type="dxa" w:w="1950"/>
+            <w:tcW w:type="dxa" w:w="1760"/>
             <w:tcMar>
               <w:top w:type="dxa" w:w="60"/>
               <w:left w:type="dxa" w:w="100"/>
@@ -1392,7 +1543,7 @@
         </w:tc>
         <w:tc>
           <w:tcPr>
-            <w:tcW w:type="dxa" w:w="2763"/>
+            <w:tcW w:type="dxa" w:w="2720"/>
             <w:tcMar>
               <w:top w:type="dxa" w:w="60"/>
               <w:left w:type="dxa" w:w="100"/>
@@ -1412,7 +1563,7 @@
         </w:tc>
         <w:tc>
           <w:tcPr>
-            <w:tcW w:type="dxa" w:w="2279"/>
+            <w:tcW w:type="dxa" w:w="2080"/>
             <w:tcMar>
               <w:top w:type="dxa" w:w="60"/>
               <w:left w:type="dxa" w:w="100"/>
@@ -1437,7 +1588,7 @@
         </w:trPr>
         <w:tc>
           <w:tcPr>
-            <w:tcW w:type="dxa" w:w="975"/>
+            <w:tcW w:type="dxa" w:w="1600"/>
             <w:tcMar>
               <w:top w:type="dxa" w:w="60"/>
               <w:left w:type="dxa" w:w="100"/>
@@ -1457,7 +1608,7 @@
         </w:tc>
         <w:tc>
           <w:tcPr>
-            <w:tcW w:type="dxa" w:w="2113"/>
+            <w:tcW w:type="dxa" w:w="1920"/>
             <w:tcMar>
               <w:top w:type="dxa" w:w="60"/>
               <w:left w:type="dxa" w:w="100"/>
@@ -1477,7 +1628,7 @@
         </w:tc>
         <w:tc>
           <w:tcPr>
-            <w:tcW w:type="dxa" w:w="1950"/>
+            <w:tcW w:type="dxa" w:w="1760"/>
             <w:tcMar>
               <w:top w:type="dxa" w:w="60"/>
               <w:left w:type="dxa" w:w="100"/>
@@ -1497,7 +1648,7 @@
         </w:tc>
         <w:tc>
           <w:tcPr>
-            <w:tcW w:type="dxa" w:w="2763"/>
+            <w:tcW w:type="dxa" w:w="2720"/>
             <w:tcMar>
               <w:top w:type="dxa" w:w="60"/>
               <w:left w:type="dxa" w:w="100"/>
@@ -1517,7 +1668,7 @@
         </w:tc>
         <w:tc>
           <w:tcPr>
-            <w:tcW w:type="dxa" w:w="2279"/>
+            <w:tcW w:type="dxa" w:w="2080"/>
             <w:tcMar>
               <w:top w:type="dxa" w:w="60"/>
               <w:left w:type="dxa" w:w="100"/>
@@ -1542,7 +1693,7 @@
         </w:trPr>
         <w:tc>
           <w:tcPr>
-            <w:tcW w:type="dxa" w:w="975"/>
+            <w:tcW w:type="dxa" w:w="1600"/>
             <w:tcMar>
               <w:top w:type="dxa" w:w="60"/>
               <w:left w:type="dxa" w:w="100"/>
@@ -1562,7 +1713,7 @@
         </w:tc>
         <w:tc>
           <w:tcPr>
-            <w:tcW w:type="dxa" w:w="2113"/>
+            <w:tcW w:type="dxa" w:w="1920"/>
             <w:tcMar>
               <w:top w:type="dxa" w:w="60"/>
               <w:left w:type="dxa" w:w="100"/>
@@ -1582,7 +1733,7 @@
         </w:tc>
         <w:tc>
           <w:tcPr>
-            <w:tcW w:type="dxa" w:w="1950"/>
+            <w:tcW w:type="dxa" w:w="1760"/>
             <w:tcMar>
               <w:top w:type="dxa" w:w="60"/>
               <w:left w:type="dxa" w:w="100"/>
@@ -1602,7 +1753,7 @@
         </w:tc>
         <w:tc>
           <w:tcPr>
-            <w:tcW w:type="dxa" w:w="2763"/>
+            <w:tcW w:type="dxa" w:w="2720"/>
             <w:tcMar>
               <w:top w:type="dxa" w:w="60"/>
               <w:left w:type="dxa" w:w="100"/>
@@ -1622,7 +1773,7 @@
         </w:tc>
         <w:tc>
           <w:tcPr>
-            <w:tcW w:type="dxa" w:w="2279"/>
+            <w:tcW w:type="dxa" w:w="2080"/>
             <w:tcMar>
               <w:top w:type="dxa" w:w="60"/>
               <w:left w:type="dxa" w:w="100"/>
@@ -1637,6 +1788,111 @@
                 <w:szCs w:val="19"/>
               </w:rPr>
               <w:t xml:space="preserve">+0.019 °/min</w:t>
+            </w:r>
+          </w:p>
+        </w:tc>
+      </w:tr>
+      <w:tr>
+        <w:trPr>
+          <w:cantSplit/>
+        </w:trPr>
+        <w:tc>
+          <w:tcPr>
+            <w:tcW w:type="dxa" w:w="1600"/>
+            <w:tcMar>
+              <w:top w:type="dxa" w:w="60"/>
+              <w:left w:type="dxa" w:w="100"/>
+              <w:bottom w:type="dxa" w:w="60"/>
+              <w:right w:type="dxa" w:w="100"/>
+            </w:tcMar>
+          </w:tcPr>
+          <w:p>
+            <w:r>
+              <w:rPr>
+                <w:sz w:val="19"/>
+                <w:szCs w:val="19"/>
+              </w:rPr>
+              <w:t xml:space="preserve">1-hour hold</w:t>
+            </w:r>
+          </w:p>
+        </w:tc>
+        <w:tc>
+          <w:tcPr>
+            <w:tcW w:type="dxa" w:w="1920"/>
+            <w:tcMar>
+              <w:top w:type="dxa" w:w="60"/>
+              <w:left w:type="dxa" w:w="100"/>
+              <w:bottom w:type="dxa" w:w="60"/>
+              <w:right w:type="dxa" w:w="100"/>
+            </w:tcMar>
+          </w:tcPr>
+          <w:p>
+            <w:r>
+              <w:rPr>
+                <w:sz w:val="19"/>
+                <w:szCs w:val="19"/>
+              </w:rPr>
+              <w:t xml:space="preserve">+0.23°</w:t>
+            </w:r>
+          </w:p>
+        </w:tc>
+        <w:tc>
+          <w:tcPr>
+            <w:tcW w:type="dxa" w:w="1760"/>
+            <w:tcMar>
+              <w:top w:type="dxa" w:w="60"/>
+              <w:left w:type="dxa" w:w="100"/>
+              <w:bottom w:type="dxa" w:w="60"/>
+              <w:right w:type="dxa" w:w="100"/>
+            </w:tcMar>
+          </w:tcPr>
+          <w:p>
+            <w:r>
+              <w:rPr>
+                <w:sz w:val="19"/>
+                <w:szCs w:val="19"/>
+              </w:rPr>
+              <w:t xml:space="preserve">0.018°</w:t>
+            </w:r>
+          </w:p>
+        </w:tc>
+        <w:tc>
+          <w:tcPr>
+            <w:tcW w:type="dxa" w:w="2720"/>
+            <w:tcMar>
+              <w:top w:type="dxa" w:w="60"/>
+              <w:left w:type="dxa" w:w="100"/>
+              <w:bottom w:type="dxa" w:w="60"/>
+              <w:right w:type="dxa" w:w="100"/>
+            </w:tcMar>
+          </w:tcPr>
+          <w:p>
+            <w:r>
+              <w:rPr>
+                <w:sz w:val="19"/>
+                <w:szCs w:val="19"/>
+              </w:rPr>
+              <w:t xml:space="preserve">~0.06° over 57 min</w:t>
+            </w:r>
+          </w:p>
+        </w:tc>
+        <w:tc>
+          <w:tcPr>
+            <w:tcW w:type="dxa" w:w="2080"/>
+            <w:tcMar>
+              <w:top w:type="dxa" w:w="60"/>
+              <w:left w:type="dxa" w:w="100"/>
+              <w:bottom w:type="dxa" w:w="60"/>
+              <w:right w:type="dxa" w:w="100"/>
+            </w:tcMar>
+          </w:tcPr>
+          <w:p>
+            <w:r>
+              <w:rPr>
+                <w:sz w:val="19"/>
+                <w:szCs w:val="19"/>
+              </w:rPr>
+              <w:t xml:space="preserve">−0.001 °/min</w:t>
             </w:r>
           </w:p>
         </w:tc>
@@ -1662,7 +1918,7 @@
         <w:pStyle w:val="ListParagraph"/>
         <w:numPr>
           <w:ilvl w:val="0"/>
-          <w:numId w:val="4"/>
+          <w:numId w:val="3"/>
         </w:numPr>
         <w:spacing w:after="60"/>
       </w:pPr>
@@ -1682,7 +1938,7 @@
         <w:pStyle w:val="ListParagraph"/>
         <w:numPr>
           <w:ilvl w:val="0"/>
-          <w:numId w:val="4"/>
+          <w:numId w:val="3"/>
         </w:numPr>
         <w:spacing w:after="60"/>
       </w:pPr>
@@ -1694,7 +1950,7 @@
         <w:t xml:space="preserve">Session 2 (raised rig):</w:t>
       </w:r>
       <w:r>
-        <w:t xml:space="preserve"> the reading crept by 0.1–0.5°. Run 5 has two sudden steps. The desk node, which isn't part of the angle calculation, moved at the same time, so the creep most likely comes from the rig or wires settling rather than the sensor. Short-term jitter was the same as in session 1.</w:t>
+        <w:t xml:space="preserve"> the reading crept by 0.1–0.5°, and run 5 has two sudden steps. The desk node, which isn't part of the angle calculation, moved at the same time, so the creep most likely comes from the rig or wires settling. In a later run, the raw accelerometer confirmed that a similar creep was the ruler physically tilting.</w:t>
       </w:r>
     </w:p>
     <w:p>
@@ -1702,7 +1958,7 @@
         <w:pStyle w:val="ListParagraph"/>
         <w:numPr>
           <w:ilvl w:val="0"/>
-          <w:numId w:val="4"/>
+          <w:numId w:val="3"/>
         </w:numPr>
         <w:spacing w:after="60"/>
       </w:pPr>
@@ -1711,10 +1967,30 @@
           <w:b/>
           <w:bCs/>
         </w:rPr>
+        <w:t xml:space="preserve">1-hour hold</w:t>
+      </w:r>
+      <w:r>
+        <w:t xml:space="preserve"> (from the board-swap run, where the angle came from the healthy board): 57 minutes at 0.23° with 0.018° jitter. The 5 s averages stayed within a 0.1° range. This is the longest clean static record.</w:t>
+      </w:r>
+    </w:p>
+    <w:p>
+      <w:pPr>
+        <w:pStyle w:val="ListParagraph"/>
+        <w:numPr>
+          <w:ilvl w:val="0"/>
+          <w:numId w:val="3"/>
+        </w:numPr>
+        <w:spacing w:after="60"/>
+      </w:pPr>
+      <w:r>
+        <w:rPr>
+          <w:b/>
+          <w:bCs/>
+        </w:rPr>
         <w:t xml:space="preserve">Resting angle</w:t>
       </w:r>
       <w:r>
-        <w:t xml:space="preserve"> is where the ruler came to rest after the calibration sweep, relative to where it was zeroed. It reflects placement, and it stays constant during the hold.</w:t>
+        <w:t xml:space="preserve"> is where the node came to rest after the calibration sweep, relative to where it was zeroed. It reflects placement, and it stays constant during the hold.</w:t>
       </w:r>
     </w:p>
     <w:p>
@@ -1730,7 +2006,7 @@
         <w:spacing w:after="120"/>
       </w:pPr>
       <w:r>
-        <w:t xml:space="preserve">Allan deviation shows how much averages over a time window τ differ from one window to the next. If it stayed flat or fell as τ grew, there's no drift at those time scales.</w:t>
+        <w:t xml:space="preserve">Allan deviation shows how much averages over a time window τ differ from one window to the next. If it stays flat or falls as τ grows, there's no drift at those time scales.</w:t>
       </w:r>
     </w:p>
     <w:tbl>
@@ -2031,7 +2307,7 @@
         <w:spacing w:after="120"/>
       </w:pPr>
       <w:r>
-        <w:t xml:space="preserve">Session 1 is flat from 10 s to 60 s, so no drift appears over these time scales.</w:t>
+        <w:t xml:space="preserve">Session 1 is flat from 10 s to 60 s, and the 1-hour hold drifted only −0.001 °/min, so no sensor drift shows up at any time scale tested.</w:t>
       </w:r>
     </w:p>
     <w:p>
@@ -2039,103 +2315,7 @@
         <w:pStyle w:val="Heading2"/>
       </w:pPr>
       <w:r>
-        <w:t xml:space="preserve">Other checks</w:t>
-      </w:r>
-    </w:p>
-    <w:p>
-      <w:pPr>
-        <w:pStyle w:val="ListParagraph"/>
-        <w:numPr>
-          <w:ilvl w:val="0"/>
-          <w:numId w:val="4"/>
-        </w:numPr>
-        <w:spacing w:after="60"/>
-      </w:pPr>
-      <w:r>
-        <w:rPr>
-          <w:b/>
-          <w:bCs/>
-        </w:rPr>
-        <w:t xml:space="preserve">Heading drift doesn't affect the angle.</w:t>
-      </w:r>
-      <w:r>
-        <w:t xml:space="preserve"> Each sensor's heading (compass direction) drifted by 0.2–5 °/min, as expected without a magnetometer, and the angle ignored it in both sessions. That's by design.</w:t>
-      </w:r>
-    </w:p>
-    <w:p>
-      <w:pPr>
-        <w:pStyle w:val="ListParagraph"/>
-        <w:numPr>
-          <w:ilvl w:val="0"/>
-          <w:numId w:val="4"/>
-        </w:numPr>
-        <w:spacing w:after="60"/>
-      </w:pPr>
-      <w:r>
-        <w:rPr>
-          <w:b/>
-          <w:bCs/>
-        </w:rPr>
-        <w:t xml:space="preserve">Calibration copes with an imperfect setup.</w:t>
-      </w:r>
-      <w:r>
-        <w:t xml:space="preserve"> In session 2 the ruler node was zeroed 4–15° off level, and the sweep was shorter (~55°) and in the opposite direction. Calibration still worked and the reading was just as steady.</w:t>
-      </w:r>
-    </w:p>
-    <w:p>
-      <w:pPr>
-        <w:pStyle w:val="ListParagraph"/>
-        <w:numPr>
-          <w:ilvl w:val="0"/>
-          <w:numId w:val="4"/>
-        </w:numPr>
-        <w:spacing w:after="60"/>
-      </w:pPr>
-      <w:r>
-        <w:rPr>
-          <w:b/>
-          <w:bCs/>
-        </w:rPr>
-        <w:t xml:space="preserve">Link reliability:</w:t>
-      </w:r>
-      <w:r>
-        <w:t xml:space="preserve"> 100 % valid samples in all six runs, no dropouts.</w:t>
-      </w:r>
-    </w:p>
-    <w:p>
-      <w:pPr>
-        <w:pStyle w:val="ListParagraph"/>
-        <w:numPr>
-          <w:ilvl w:val="0"/>
-          <w:numId w:val="4"/>
-        </w:numPr>
-        <w:spacing w:after="60"/>
-      </w:pPr>
-      <w:r>
-        <w:rPr>
-          <w:b/>
-          <w:bCs/>
-        </w:rPr>
-        <w:t xml:space="preserve">Longest clean hold so far:</w:t>
-      </w:r>
-      <w:r>
-        <w:t xml:space="preserve"> the first ~18 minutes of the 40-minute run held at 0.80° with 0.016° jitter and −0.001 °/min drift, before the sensor fault (issue 2) began.</w:t>
-      </w:r>
-    </w:p>
-    <w:p>
-      <w:pPr>
-        <w:pStyle w:val="Heading1"/>
-      </w:pPr>
-      <w:r>
-        <w:t xml:space="preserve">Issues found</w:t>
-      </w:r>
-    </w:p>
-    <w:p>
-      <w:pPr>
-        <w:pStyle w:val="Heading2"/>
-      </w:pPr>
-      <w:r>
-        <w:t xml:space="preserve">1. Sample rate is ~40 Hz, not 50 Hz</w:t>
+        <w:t xml:space="preserve">Preliminary angle check: 45° and 90° rigs</w:t>
       </w:r>
     </w:p>
     <w:tbl>
@@ -2152,8 +2332,11 @@
         <w:tblLayout w:type="fixed"/>
       </w:tblPr>
       <w:tblGrid>
-        <w:gridCol w:w="4928"/>
-        <w:gridCol w:w="5152"/>
+        <w:gridCol w:w="1138"/>
+        <w:gridCol w:w="2438"/>
+        <w:gridCol w:w="2113"/>
+        <w:gridCol w:w="1788"/>
+        <w:gridCol w:w="2603"/>
       </w:tblGrid>
       <w:tr>
         <w:trPr>
@@ -2161,20 +2344,7 @@
         </w:trPr>
         <w:tc>
           <w:tcPr>
-            <w:tcW w:type="dxa" w:w="4928"/>
-            <w:shd w:fill="DCE6F1" w:color="auto" w:val="clear"/>
-            <w:tcMar>
-              <w:top w:type="dxa" w:w="60"/>
-              <w:left w:type="dxa" w:w="100"/>
-              <w:bottom w:type="dxa" w:w="60"/>
-              <w:right w:type="dxa" w:w="100"/>
-            </w:tcMar>
-          </w:tcPr>
-          <w:p/>
-        </w:tc>
-        <w:tc>
-          <w:tcPr>
-            <w:tcW w:type="dxa" w:w="5152"/>
+            <w:tcW w:type="dxa" w:w="1138"/>
             <w:shd w:fill="DCE6F1" w:color="auto" w:val="clear"/>
             <w:tcMar>
               <w:top w:type="dxa" w:w="60"/>
@@ -2191,7 +2361,99 @@
                 <w:sz w:val="19"/>
                 <w:szCs w:val="19"/>
               </w:rPr>
-              <w:t xml:space="preserve">Rate</w:t>
+              <w:t xml:space="preserve">Rig</w:t>
+            </w:r>
+          </w:p>
+        </w:tc>
+        <w:tc>
+          <w:tcPr>
+            <w:tcW w:type="dxa" w:w="2438"/>
+            <w:shd w:fill="DCE6F1" w:color="auto" w:val="clear"/>
+            <w:tcMar>
+              <w:top w:type="dxa" w:w="60"/>
+              <w:left w:type="dxa" w:w="100"/>
+              <w:bottom w:type="dxa" w:w="60"/>
+              <w:right w:type="dxa" w:w="100"/>
+            </w:tcMar>
+          </w:tcPr>
+          <w:p>
+            <w:r>
+              <w:rPr>
+                <w:b/>
+                <w:bCs/>
+                <w:sz w:val="19"/>
+                <w:szCs w:val="19"/>
+              </w:rPr>
+              <w:t xml:space="preserve">Reading (steady part)</w:t>
+            </w:r>
+          </w:p>
+        </w:tc>
+        <w:tc>
+          <w:tcPr>
+            <w:tcW w:type="dxa" w:w="2113"/>
+            <w:shd w:fill="DCE6F1" w:color="auto" w:val="clear"/>
+            <w:tcMar>
+              <w:top w:type="dxa" w:w="60"/>
+              <w:left w:type="dxa" w:w="100"/>
+              <w:bottom w:type="dxa" w:w="60"/>
+              <w:right w:type="dxa" w:w="100"/>
+            </w:tcMar>
+          </w:tcPr>
+          <w:p>
+            <w:r>
+              <w:rPr>
+                <w:b/>
+                <w:bCs/>
+                <w:sz w:val="19"/>
+                <w:szCs w:val="19"/>
+              </w:rPr>
+              <w:t xml:space="preserve">Diff from nominal</w:t>
+            </w:r>
+          </w:p>
+        </w:tc>
+        <w:tc>
+          <w:tcPr>
+            <w:tcW w:type="dxa" w:w="1788"/>
+            <w:shd w:fill="DCE6F1" w:color="auto" w:val="clear"/>
+            <w:tcMar>
+              <w:top w:type="dxa" w:w="60"/>
+              <w:left w:type="dxa" w:w="100"/>
+              <w:bottom w:type="dxa" w:w="60"/>
+              <w:right w:type="dxa" w:w="100"/>
+            </w:tcMar>
+          </w:tcPr>
+          <w:p>
+            <w:r>
+              <w:rPr>
+                <w:b/>
+                <w:bCs/>
+                <w:sz w:val="19"/>
+                <w:szCs w:val="19"/>
+              </w:rPr>
+              <w:t xml:space="preserve">Jitter (SD)</w:t>
+            </w:r>
+          </w:p>
+        </w:tc>
+        <w:tc>
+          <w:tcPr>
+            <w:tcW w:type="dxa" w:w="2603"/>
+            <w:shd w:fill="DCE6F1" w:color="auto" w:val="clear"/>
+            <w:tcMar>
+              <w:top w:type="dxa" w:w="60"/>
+              <w:left w:type="dxa" w:w="100"/>
+              <w:bottom w:type="dxa" w:w="60"/>
+              <w:right w:type="dxa" w:w="100"/>
+            </w:tcMar>
+          </w:tcPr>
+          <w:p>
+            <w:r>
+              <w:rPr>
+                <w:b/>
+                <w:bCs/>
+                <w:sz w:val="19"/>
+                <w:szCs w:val="19"/>
+              </w:rPr>
+              <w:t xml:space="preserve">Raw-accelerometer check</w:t>
             </w:r>
           </w:p>
         </w:tc>
@@ -2202,41 +2464,101 @@
         </w:trPr>
         <w:tc>
           <w:tcPr>
-            <w:tcW w:type="dxa" w:w="4928"/>
-            <w:tcMar>
-              <w:top w:type="dxa" w:w="60"/>
-              <w:left w:type="dxa" w:w="100"/>
-              <w:bottom w:type="dxa" w:w="60"/>
-              <w:right w:type="dxa" w:w="100"/>
-            </w:tcMar>
-          </w:tcPr>
-          <w:p>
-            <w:r>
-              <w:rPr>
-                <w:sz w:val="19"/>
-                <w:szCs w:val="19"/>
-              </w:rPr>
-              <w:t xml:space="preserve">Configured</w:t>
-            </w:r>
-          </w:p>
-        </w:tc>
-        <w:tc>
-          <w:tcPr>
-            <w:tcW w:type="dxa" w:w="5152"/>
-            <w:tcMar>
-              <w:top w:type="dxa" w:w="60"/>
-              <w:left w:type="dxa" w:w="100"/>
-              <w:bottom w:type="dxa" w:w="60"/>
-              <w:right w:type="dxa" w:w="100"/>
-            </w:tcMar>
-          </w:tcPr>
-          <w:p>
-            <w:r>
-              <w:rPr>
-                <w:sz w:val="19"/>
-                <w:szCs w:val="19"/>
-              </w:rPr>
-              <w:t xml:space="preserve">50 Hz</w:t>
+            <w:tcW w:type="dxa" w:w="1138"/>
+            <w:tcMar>
+              <w:top w:type="dxa" w:w="60"/>
+              <w:left w:type="dxa" w:w="100"/>
+              <w:bottom w:type="dxa" w:w="60"/>
+              <w:right w:type="dxa" w:w="100"/>
+            </w:tcMar>
+          </w:tcPr>
+          <w:p>
+            <w:r>
+              <w:rPr>
+                <w:sz w:val="19"/>
+                <w:szCs w:val="19"/>
+              </w:rPr>
+              <w:t xml:space="preserve">45°</w:t>
+            </w:r>
+          </w:p>
+        </w:tc>
+        <w:tc>
+          <w:tcPr>
+            <w:tcW w:type="dxa" w:w="2438"/>
+            <w:tcMar>
+              <w:top w:type="dxa" w:w="60"/>
+              <w:left w:type="dxa" w:w="100"/>
+              <w:bottom w:type="dxa" w:w="60"/>
+              <w:right w:type="dxa" w:w="100"/>
+            </w:tcMar>
+          </w:tcPr>
+          <w:p>
+            <w:r>
+              <w:rPr>
+                <w:sz w:val="19"/>
+                <w:szCs w:val="19"/>
+              </w:rPr>
+              <w:t xml:space="preserve">45.0°</w:t>
+            </w:r>
+          </w:p>
+        </w:tc>
+        <w:tc>
+          <w:tcPr>
+            <w:tcW w:type="dxa" w:w="2113"/>
+            <w:tcMar>
+              <w:top w:type="dxa" w:w="60"/>
+              <w:left w:type="dxa" w:w="100"/>
+              <w:bottom w:type="dxa" w:w="60"/>
+              <w:right w:type="dxa" w:w="100"/>
+            </w:tcMar>
+          </w:tcPr>
+          <w:p>
+            <w:r>
+              <w:rPr>
+                <w:sz w:val="19"/>
+                <w:szCs w:val="19"/>
+              </w:rPr>
+              <w:t xml:space="preserve">0.0°</w:t>
+            </w:r>
+          </w:p>
+        </w:tc>
+        <w:tc>
+          <w:tcPr>
+            <w:tcW w:type="dxa" w:w="1788"/>
+            <w:tcMar>
+              <w:top w:type="dxa" w:w="60"/>
+              <w:left w:type="dxa" w:w="100"/>
+              <w:bottom w:type="dxa" w:w="60"/>
+              <w:right w:type="dxa" w:w="100"/>
+            </w:tcMar>
+          </w:tcPr>
+          <w:p>
+            <w:r>
+              <w:rPr>
+                <w:sz w:val="19"/>
+                <w:szCs w:val="19"/>
+              </w:rPr>
+              <w:t xml:space="preserve">0.034°</w:t>
+            </w:r>
+          </w:p>
+        </w:tc>
+        <w:tc>
+          <w:tcPr>
+            <w:tcW w:type="dxa" w:w="2603"/>
+            <w:tcMar>
+              <w:top w:type="dxa" w:w="60"/>
+              <w:left w:type="dxa" w:w="100"/>
+              <w:bottom w:type="dxa" w:w="60"/>
+              <w:right w:type="dxa" w:w="100"/>
+            </w:tcMar>
+          </w:tcPr>
+          <w:p>
+            <w:r>
+              <w:rPr>
+                <w:sz w:val="19"/>
+                <w:szCs w:val="19"/>
+              </w:rPr>
+              <w:t xml:space="preserve">45.2°</w:t>
             </w:r>
           </w:p>
         </w:tc>
@@ -2247,131 +2569,101 @@
         </w:trPr>
         <w:tc>
           <w:tcPr>
-            <w:tcW w:type="dxa" w:w="4928"/>
-            <w:tcMar>
-              <w:top w:type="dxa" w:w="60"/>
-              <w:left w:type="dxa" w:w="100"/>
-              <w:bottom w:type="dxa" w:w="60"/>
-              <w:right w:type="dxa" w:w="100"/>
-            </w:tcMar>
-          </w:tcPr>
-          <w:p>
-            <w:r>
-              <w:rPr>
-                <w:sz w:val="19"/>
-                <w:szCs w:val="19"/>
-              </w:rPr>
-              <w:t xml:space="preserve">Produced by the central board</w:t>
-            </w:r>
-          </w:p>
-        </w:tc>
-        <w:tc>
-          <w:tcPr>
-            <w:tcW w:type="dxa" w:w="5152"/>
-            <w:tcMar>
-              <w:top w:type="dxa" w:w="60"/>
-              <w:left w:type="dxa" w:w="100"/>
-              <w:bottom w:type="dxa" w:w="60"/>
-              <w:right w:type="dxa" w:w="100"/>
-            </w:tcMar>
-          </w:tcPr>
-          <w:p>
-            <w:r>
-              <w:rPr>
-                <w:sz w:val="19"/>
-                <w:szCs w:val="19"/>
-              </w:rPr>
-              <w:t xml:space="preserve">~43.5 Hz (one sample every ~23 ms)</w:t>
-            </w:r>
-          </w:p>
-        </w:tc>
-      </w:tr>
-      <w:tr>
-        <w:trPr>
-          <w:cantSplit/>
-        </w:trPr>
-        <w:tc>
-          <w:tcPr>
-            <w:tcW w:type="dxa" w:w="4928"/>
-            <w:tcMar>
-              <w:top w:type="dxa" w:w="60"/>
-              <w:left w:type="dxa" w:w="100"/>
-              <w:bottom w:type="dxa" w:w="60"/>
-              <w:right w:type="dxa" w:w="100"/>
-            </w:tcMar>
-          </w:tcPr>
-          <w:p>
-            <w:r>
-              <w:rPr>
-                <w:sz w:val="19"/>
-                <w:szCs w:val="19"/>
-              </w:rPr>
-              <w:t xml:space="preserve">Unique samples in the CSV</w:t>
-            </w:r>
-          </w:p>
-        </w:tc>
-        <w:tc>
-          <w:tcPr>
-            <w:tcW w:type="dxa" w:w="5152"/>
-            <w:tcMar>
-              <w:top w:type="dxa" w:w="60"/>
-              <w:left w:type="dxa" w:w="100"/>
-              <w:bottom w:type="dxa" w:w="60"/>
-              <w:right w:type="dxa" w:w="100"/>
-            </w:tcMar>
-          </w:tcPr>
-          <w:p>
-            <w:r>
-              <w:rPr>
-                <w:sz w:val="19"/>
-                <w:szCs w:val="19"/>
-              </w:rPr>
-              <w:t xml:space="preserve">~40.5 Hz</w:t>
-            </w:r>
-          </w:p>
-        </w:tc>
-      </w:tr>
-      <w:tr>
-        <w:trPr>
-          <w:cantSplit/>
-        </w:trPr>
-        <w:tc>
-          <w:tcPr>
-            <w:tcW w:type="dxa" w:w="4928"/>
-            <w:tcMar>
-              <w:top w:type="dxa" w:w="60"/>
-              <w:left w:type="dxa" w:w="100"/>
-              <w:bottom w:type="dxa" w:w="60"/>
-              <w:right w:type="dxa" w:w="100"/>
-            </w:tcMar>
-          </w:tcPr>
-          <w:p>
-            <w:r>
-              <w:rPr>
-                <w:sz w:val="19"/>
-                <w:szCs w:val="19"/>
-              </w:rPr>
-              <w:t xml:space="preserve">CSV rows repeating the previous sample</w:t>
-            </w:r>
-          </w:p>
-        </w:tc>
-        <w:tc>
-          <w:tcPr>
-            <w:tcW w:type="dxa" w:w="5152"/>
-            <w:tcMar>
-              <w:top w:type="dxa" w:w="60"/>
-              <w:left w:type="dxa" w:w="100"/>
-              <w:bottom w:type="dxa" w:w="60"/>
-              <w:right w:type="dxa" w:w="100"/>
-            </w:tcMar>
-          </w:tcPr>
-          <w:p>
-            <w:r>
-              <w:rPr>
-                <w:sz w:val="19"/>
-                <w:szCs w:val="19"/>
-              </w:rPr>
-              <w:t xml:space="preserve">19–20 %</w:t>
+            <w:tcW w:type="dxa" w:w="1138"/>
+            <w:tcMar>
+              <w:top w:type="dxa" w:w="60"/>
+              <w:left w:type="dxa" w:w="100"/>
+              <w:bottom w:type="dxa" w:w="60"/>
+              <w:right w:type="dxa" w:w="100"/>
+            </w:tcMar>
+          </w:tcPr>
+          <w:p>
+            <w:r>
+              <w:rPr>
+                <w:sz w:val="19"/>
+                <w:szCs w:val="19"/>
+              </w:rPr>
+              <w:t xml:space="preserve">90°</w:t>
+            </w:r>
+          </w:p>
+        </w:tc>
+        <w:tc>
+          <w:tcPr>
+            <w:tcW w:type="dxa" w:w="2438"/>
+            <w:tcMar>
+              <w:top w:type="dxa" w:w="60"/>
+              <w:left w:type="dxa" w:w="100"/>
+              <w:bottom w:type="dxa" w:w="60"/>
+              <w:right w:type="dxa" w:w="100"/>
+            </w:tcMar>
+          </w:tcPr>
+          <w:p>
+            <w:r>
+              <w:rPr>
+                <w:sz w:val="19"/>
+                <w:szCs w:val="19"/>
+              </w:rPr>
+              <w:t xml:space="preserve">89.0°</w:t>
+            </w:r>
+          </w:p>
+        </w:tc>
+        <w:tc>
+          <w:tcPr>
+            <w:tcW w:type="dxa" w:w="2113"/>
+            <w:tcMar>
+              <w:top w:type="dxa" w:w="60"/>
+              <w:left w:type="dxa" w:w="100"/>
+              <w:bottom w:type="dxa" w:w="60"/>
+              <w:right w:type="dxa" w:w="100"/>
+            </w:tcMar>
+          </w:tcPr>
+          <w:p>
+            <w:r>
+              <w:rPr>
+                <w:sz w:val="19"/>
+                <w:szCs w:val="19"/>
+              </w:rPr>
+              <w:t xml:space="preserve">1.0°</w:t>
+            </w:r>
+          </w:p>
+        </w:tc>
+        <w:tc>
+          <w:tcPr>
+            <w:tcW w:type="dxa" w:w="1788"/>
+            <w:tcMar>
+              <w:top w:type="dxa" w:w="60"/>
+              <w:left w:type="dxa" w:w="100"/>
+              <w:bottom w:type="dxa" w:w="60"/>
+              <w:right w:type="dxa" w:w="100"/>
+            </w:tcMar>
+          </w:tcPr>
+          <w:p>
+            <w:r>
+              <w:rPr>
+                <w:sz w:val="19"/>
+                <w:szCs w:val="19"/>
+              </w:rPr>
+              <w:t xml:space="preserve">0.093°</w:t>
+            </w:r>
+          </w:p>
+        </w:tc>
+        <w:tc>
+          <w:tcPr>
+            <w:tcW w:type="dxa" w:w="2603"/>
+            <w:tcMar>
+              <w:top w:type="dxa" w:w="60"/>
+              <w:left w:type="dxa" w:w="100"/>
+              <w:bottom w:type="dxa" w:w="60"/>
+              <w:right w:type="dxa" w:w="100"/>
+            </w:tcMar>
+          </w:tcPr>
+          <w:p>
+            <w:r>
+              <w:rPr>
+                <w:sz w:val="19"/>
+                <w:szCs w:val="19"/>
+              </w:rPr>
+              <w:t xml:space="preserve">89.0°</w:t>
             </w:r>
           </w:p>
         </w:tc>
@@ -2379,75 +2671,17 @@
     </w:tbl>
     <w:p>
       <w:pPr>
-        <w:spacing w:after="120"/>
-      </w:pPr>
-    </w:p>
-    <w:p>
-      <w:pPr>
-        <w:spacing w:after="120"/>
-      </w:pPr>
-      <w:r>
-        <w:rPr>
-          <w:b/>
-          <w:bCs/>
-        </w:rPr>
-        <w:t xml:space="preserve">Cause.</w:t>
-      </w:r>
-      <w:r>
-        <w:t xml:space="preserve"> The central board takes ~23 ms per output cycle instead of 20 ms. The GUI writes a row every 20 ms whatever it has received, so when no new sample has arrived it writes the previous one again. Repeated rows share the board's timestamp (</w:t>
-      </w:r>
-      <w:r>
-        <w:rPr>
-          <w:rFonts w:ascii="Consolas" w:cs="Consolas" w:eastAsia="Consolas" w:hAnsi="Consolas"/>
-          <w:sz w:val="19"/>
-          <w:szCs w:val="19"/>
-        </w:rPr>
-        <w:t xml:space="preserve">t_thigh_us</w:t>
-      </w:r>
-      <w:r>
-        <w:t xml:space="preserve">), which confirms they are copies of the same measurement.</w:t>
-      </w:r>
-    </w:p>
-    <w:p>
-      <w:pPr>
-        <w:spacing w:after="120"/>
-      </w:pPr>
-      <w:r>
-        <w:rPr>
-          <w:b/>
-          <w:bCs/>
-        </w:rPr>
-        <w:t xml:space="preserve">Effect on these results: none.</w:t>
-      </w:r>
-      <w:r>
-        <w:t xml:space="preserve"> With duplicates removed, every run's mean, SD and drift are identical to within 0.0002°. For movement data it would matter: repeated values, dropped samples, and row times up to ~20 ms off.</w:t>
-      </w:r>
-    </w:p>
-    <w:p>
-      <w:pPr>
-        <w:spacing w:after="120"/>
-      </w:pPr>
-      <w:r>
-        <w:rPr>
-          <w:b/>
-          <w:bCs/>
-        </w:rPr>
-        <w:t xml:space="preserve">Measured cause.</w:t>
-      </w:r>
-      <w:r>
-        <w:t xml:space="preserve"> The diagnostic build timed each ~23 ms cycle: ~10.7 ms reading the thigh IMU and ~11.7 ms printing the data line as ~36 separate prints. Sending a longer line as one write took ~0.7 ms.</w:t>
-      </w:r>
-    </w:p>
-    <w:p>
-      <w:pPr>
-        <w:spacing w:after="60"/>
-      </w:pPr>
-      <w:r>
-        <w:rPr>
-          <w:b/>
-          <w:bCs/>
-        </w:rPr>
-        <w:t xml:space="preserve">Status.</w:t>
+        <w:spacing w:after="200"/>
+      </w:pPr>
+      <w:r>
+        <w:rPr>
+          <w:i/>
+          <w:iCs/>
+          <w:color w:val="5A5A5A"/>
+          <w:sz w:val="18"/>
+          <w:szCs w:val="18"/>
+        </w:rPr>
+        <w:t xml:space="preserve">The GUI shows these as negative angles because of the bending direction the calibration learned.</w:t>
       </w:r>
     </w:p>
     <w:p>
@@ -2455,12 +2689,19 @@
         <w:pStyle w:val="ListParagraph"/>
         <w:numPr>
           <w:ilvl w:val="0"/>
-          <w:numId w:val="4"/>
+          <w:numId w:val="3"/>
         </w:numPr>
         <w:spacing w:after="60"/>
       </w:pPr>
       <w:r>
-        <w:t xml:space="preserve">A first firmware fix to the output timer had no effect, which showed the problem is inside each output cycle.</w:t>
+        <w:rPr>
+          <w:b/>
+          <w:bCs/>
+        </w:rPr>
+        <w:t xml:space="preserve">The shank node's tilt is measured correctly.</w:t>
+      </w:r>
+      <w:r>
+        <w:t xml:space="preserve"> The raw accelerometer, which doesn't depend on the filter or the calibration, agrees with the reported angle within about 0.2°. So the calibration learned the right bending direction, and a 90° hold is as steady as a 0° hold.</w:t>
       </w:r>
     </w:p>
     <w:p>
@@ -2468,7 +2709,7 @@
         <w:pStyle w:val="ListParagraph"/>
         <w:numPr>
           <w:ilvl w:val="0"/>
-          <w:numId w:val="4"/>
+          <w:numId w:val="3"/>
         </w:numPr>
         <w:spacing w:after="60"/>
       </w:pPr>
@@ -2477,10 +2718,65 @@
           <w:b/>
           <w:bCs/>
         </w:rPr>
-        <w:t xml:space="preserve">Fix made, awaiting a test run:</w:t>
-      </w:r>
-      <w:r>
-        <w:t xml:space="preserve"> the central now builds each data line in memory and sends it with one write, which should bring the cycle to ~11–12 ms and the rate to a true 50 Hz.</w:t>
+        <w:t xml:space="preserve">Why this is preliminary:</w:t>
+      </w:r>
+    </w:p>
+    <w:p>
+      <w:pPr>
+        <w:pStyle w:val="ListParagraph"/>
+        <w:numPr>
+          <w:ilvl w:val="1"/>
+          <w:numId w:val="3"/>
+        </w:numPr>
+        <w:spacing w:after="60"/>
+      </w:pPr>
+      <w:r>
+        <w:rPr>
+          <w:b/>
+          <w:bCs/>
+        </w:rPr>
+        <w:t xml:space="preserve">One placement each.</w:t>
+      </w:r>
+    </w:p>
+    <w:p>
+      <w:pPr>
+        <w:pStyle w:val="ListParagraph"/>
+        <w:numPr>
+          <w:ilvl w:val="1"/>
+          <w:numId w:val="3"/>
+        </w:numPr>
+        <w:spacing w:after="60"/>
+      </w:pPr>
+      <w:r>
+        <w:rPr>
+          <w:b/>
+          <w:bCs/>
+        </w:rPr>
+        <w:t xml:space="preserve">The reference (thigh) node shifted 2.7° and 4.5° during placement,</w:t>
+      </w:r>
+      <w:r>
+        <w:t xml:space="preserve"> probably pulled by its cable. The software ignores that node because it didn't tilt during calibration. If the upper segment stayed flat, as intended, the readings above stand. If the segment itself moved, the true angle between the segments could differ by up to ~2–3°.</w:t>
+      </w:r>
+    </w:p>
+    <w:p>
+      <w:pPr>
+        <w:pStyle w:val="ListParagraph"/>
+        <w:numPr>
+          <w:ilvl w:val="1"/>
+          <w:numId w:val="3"/>
+        </w:numPr>
+        <w:spacing w:after="60"/>
+      </w:pPr>
+      <w:r>
+        <w:t xml:space="preserve">The data suggests the board shifted on its segment rather than the segment rotating, since it tilted about as much across the bending plane as along it. But this can't be confirmed.</w:t>
+      </w:r>
+    </w:p>
+    <w:p>
+      <w:pPr>
+        <w:pStyle w:val="Heading2"/>
+      </w:pPr>
+      <w:r>
+        <w:t xml:space="preserve">Other checks</w:t>
       </w:r>
     </w:p>
     <w:p>
@@ -2488,12 +2784,67 @@
         <w:pStyle w:val="ListParagraph"/>
         <w:numPr>
           <w:ilvl w:val="0"/>
-          <w:numId w:val="4"/>
+          <w:numId w:val="3"/>
         </w:numPr>
         <w:spacing w:after="60"/>
       </w:pPr>
       <w:r>
-        <w:t xml:space="preserve">Still planned: write one CSV row per received sample, so duplicates can't happen.</w:t>
+        <w:rPr>
+          <w:b/>
+          <w:bCs/>
+        </w:rPr>
+        <w:t xml:space="preserve">Heading drift doesn't affect the angle.</w:t>
+      </w:r>
+      <w:r>
+        <w:t xml:space="preserve"> Each sensor's heading (compass direction) drifted by 0.2–5 °/min, as expected without a magnetometer, and the angle ignored it in every run. That's by design.</w:t>
+      </w:r>
+    </w:p>
+    <w:p>
+      <w:pPr>
+        <w:pStyle w:val="ListParagraph"/>
+        <w:numPr>
+          <w:ilvl w:val="0"/>
+          <w:numId w:val="3"/>
+        </w:numPr>
+        <w:spacing w:after="60"/>
+      </w:pPr>
+      <w:r>
+        <w:rPr>
+          <w:b/>
+          <w:bCs/>
+        </w:rPr>
+        <w:t xml:space="preserve">Calibration copes with an imperfect setup.</w:t>
+      </w:r>
+      <w:r>
+        <w:t xml:space="preserve"> In session 2 the ruler node was zeroed 4–15° off level, and the sweep was shorter (~55°) and in the opposite direction. Calibration still worked and the reading was just as steady.</w:t>
+      </w:r>
+    </w:p>
+    <w:p>
+      <w:pPr>
+        <w:pStyle w:val="ListParagraph"/>
+        <w:numPr>
+          <w:ilvl w:val="0"/>
+          <w:numId w:val="3"/>
+        </w:numPr>
+        <w:spacing w:after="60"/>
+      </w:pPr>
+      <w:r>
+        <w:rPr>
+          <w:b/>
+          <w:bCs/>
+        </w:rPr>
+        <w:t xml:space="preserve">Link reliability:</w:t>
+      </w:r>
+      <w:r>
+        <w:t xml:space="preserve"> 100 % valid samples in all six short runs. The long runs had no checksum failures while the boards were healthy, apart from 2 at start-up in one run.</w:t>
+      </w:r>
+    </w:p>
+    <w:p>
+      <w:pPr>
+        <w:pStyle w:val="Heading1"/>
+      </w:pPr>
+      <w:r>
+        <w:t xml:space="preserve">Issues found</w:t>
       </w:r>
     </w:p>
     <w:p>
@@ -2501,15 +2852,7 @@
         <w:pStyle w:val="Heading2"/>
       </w:pPr>
       <w:r>
-        <w:t xml:space="preserve">2. The ruler-side node's sensor fails after ~20 minutes</w:t>
-      </w:r>
-    </w:p>
-    <w:p>
-      <w:pPr>
-        <w:spacing w:after="120"/>
-      </w:pPr>
-      <w:r>
-        <w:t xml:space="preserve">Seen in two recordings with the boards untouched: a 1-minute no-motion recording, and a ~40-minute unattended run with the diagnostic build (both boards on USB power). The diagnostic run shows the sequence:</w:t>
+        <w:t xml:space="preserve">1. Sample rate was ~40 Hz, not 50 Hz — fixed</w:t>
       </w:r>
     </w:p>
     <w:tbl>
@@ -2526,8 +2869,9 @@
         <w:tblLayout w:type="fixed"/>
       </w:tblPr>
       <w:tblGrid>
-        <w:gridCol w:w="2174"/>
-        <w:gridCol w:w="7906"/>
+        <w:gridCol w:w="4032"/>
+        <w:gridCol w:w="3225"/>
+        <w:gridCol w:w="2823"/>
       </w:tblGrid>
       <w:tr>
         <w:trPr>
@@ -2535,7 +2879,20 @@
         </w:trPr>
         <w:tc>
           <w:tcPr>
-            <w:tcW w:type="dxa" w:w="2174"/>
+            <w:tcW w:type="dxa" w:w="4032"/>
+            <w:shd w:fill="DCE6F1" w:color="auto" w:val="clear"/>
+            <w:tcMar>
+              <w:top w:type="dxa" w:w="60"/>
+              <w:left w:type="dxa" w:w="100"/>
+              <w:bottom w:type="dxa" w:w="60"/>
+              <w:right w:type="dxa" w:w="100"/>
+            </w:tcMar>
+          </w:tcPr>
+          <w:p/>
+        </w:tc>
+        <w:tc>
+          <w:tcPr>
+            <w:tcW w:type="dxa" w:w="3225"/>
             <w:shd w:fill="DCE6F1" w:color="auto" w:val="clear"/>
             <w:tcMar>
               <w:top w:type="dxa" w:w="60"/>
@@ -2552,13 +2909,13 @@
                 <w:sz w:val="19"/>
                 <w:szCs w:val="19"/>
               </w:rPr>
-              <w:t xml:space="preserve">Board uptime</w:t>
-            </w:r>
-          </w:p>
-        </w:tc>
-        <w:tc>
-          <w:tcPr>
-            <w:tcW w:type="dxa" w:w="7906"/>
+              <w:t xml:space="preserve">Before</w:t>
+            </w:r>
+          </w:p>
+        </w:tc>
+        <w:tc>
+          <w:tcPr>
+            <w:tcW w:type="dxa" w:w="2823"/>
             <w:shd w:fill="DCE6F1" w:color="auto" w:val="clear"/>
             <w:tcMar>
               <w:top w:type="dxa" w:w="60"/>
@@ -2575,7 +2932,7 @@
                 <w:sz w:val="19"/>
                 <w:szCs w:val="19"/>
               </w:rPr>
-              <w:t xml:space="preserve">What the ruler node reported</w:t>
+              <w:t xml:space="preserve">After the fixes</w:t>
             </w:r>
           </w:p>
         </w:tc>
@@ -2586,41 +2943,61 @@
         </w:trPr>
         <w:tc>
           <w:tcPr>
-            <w:tcW w:type="dxa" w:w="2174"/>
-            <w:tcMar>
-              <w:top w:type="dxa" w:w="60"/>
-              <w:left w:type="dxa" w:w="100"/>
-              <w:bottom w:type="dxa" w:w="60"/>
-              <w:right w:type="dxa" w:w="100"/>
-            </w:tcMar>
-          </w:tcPr>
-          <w:p>
-            <w:r>
-              <w:rPr>
-                <w:sz w:val="19"/>
-                <w:szCs w:val="19"/>
-              </w:rPr>
-              <w:t xml:space="preserve">0–20 min</w:t>
-            </w:r>
-          </w:p>
-        </w:tc>
-        <w:tc>
-          <w:tcPr>
-            <w:tcW w:type="dxa" w:w="7906"/>
-            <w:tcMar>
-              <w:top w:type="dxa" w:w="60"/>
-              <w:left w:type="dxa" w:w="100"/>
-              <w:bottom w:type="dxa" w:w="60"/>
-              <w:right w:type="dxa" w:w="100"/>
-            </w:tcMar>
-          </w:tcPr>
-          <w:p>
-            <w:r>
-              <w:rPr>
-                <w:sz w:val="19"/>
-                <w:szCs w:val="19"/>
-              </w:rPr>
-              <w:t xml:space="preserve">Healthy: 100 % valid, jitter 0.016°, drift −0.001 °/min</w:t>
+            <w:tcW w:type="dxa" w:w="4032"/>
+            <w:tcMar>
+              <w:top w:type="dxa" w:w="60"/>
+              <w:left w:type="dxa" w:w="100"/>
+              <w:bottom w:type="dxa" w:w="60"/>
+              <w:right w:type="dxa" w:w="100"/>
+            </w:tcMar>
+          </w:tcPr>
+          <w:p>
+            <w:r>
+              <w:rPr>
+                <w:sz w:val="19"/>
+                <w:szCs w:val="19"/>
+              </w:rPr>
+              <w:t xml:space="preserve">Central board's cycle</w:t>
+            </w:r>
+          </w:p>
+        </w:tc>
+        <w:tc>
+          <w:tcPr>
+            <w:tcW w:type="dxa" w:w="3225"/>
+            <w:tcMar>
+              <w:top w:type="dxa" w:w="60"/>
+              <w:left w:type="dxa" w:w="100"/>
+              <w:bottom w:type="dxa" w:w="60"/>
+              <w:right w:type="dxa" w:w="100"/>
+            </w:tcMar>
+          </w:tcPr>
+          <w:p>
+            <w:r>
+              <w:rPr>
+                <w:sz w:val="19"/>
+                <w:szCs w:val="19"/>
+              </w:rPr>
+              <w:t xml:space="preserve">~23 ms (~43.5 Hz)</w:t>
+            </w:r>
+          </w:p>
+        </w:tc>
+        <w:tc>
+          <w:tcPr>
+            <w:tcW w:type="dxa" w:w="2823"/>
+            <w:tcMar>
+              <w:top w:type="dxa" w:w="60"/>
+              <w:left w:type="dxa" w:w="100"/>
+              <w:bottom w:type="dxa" w:w="60"/>
+              <w:right w:type="dxa" w:w="100"/>
+            </w:tcMar>
+          </w:tcPr>
+          <w:p>
+            <w:r>
+              <w:rPr>
+                <w:sz w:val="19"/>
+                <w:szCs w:val="19"/>
+              </w:rPr>
+              <w:t xml:space="preserve">20.0 ms (50 Hz)</w:t>
             </w:r>
           </w:p>
         </w:tc>
@@ -2631,57 +3008,61 @@
         </w:trPr>
         <w:tc>
           <w:tcPr>
-            <w:tcW w:type="dxa" w:w="2174"/>
-            <w:tcMar>
-              <w:top w:type="dxa" w:w="60"/>
-              <w:left w:type="dxa" w:w="100"/>
-              <w:bottom w:type="dxa" w:w="60"/>
-              <w:right w:type="dxa" w:w="100"/>
-            </w:tcMar>
-          </w:tcPr>
-          <w:p>
-            <w:r>
-              <w:rPr>
-                <w:sz w:val="19"/>
-                <w:szCs w:val="19"/>
-              </w:rPr>
-              <w:t xml:space="preserve">20.4 min</w:t>
-            </w:r>
-          </w:p>
-        </w:tc>
-        <w:tc>
-          <w:tcPr>
-            <w:tcW w:type="dxa" w:w="7906"/>
-            <w:tcMar>
-              <w:top w:type="dxa" w:w="60"/>
-              <w:left w:type="dxa" w:w="100"/>
-              <w:bottom w:type="dxa" w:w="60"/>
-              <w:right w:type="dxa" w:w="100"/>
-            </w:tcMar>
-          </w:tcPr>
-          <w:p>
-            <w:r>
-              <w:rPr>
-                <w:sz w:val="19"/>
-                <w:szCs w:val="19"/>
-              </w:rPr>
-              <w:t xml:space="preserve">Individual sensor reads start </w:t>
-            </w:r>
-            <w:r>
-              <w:rPr>
-                <w:b/>
-                <w:bCs/>
-                <w:sz w:val="19"/>
-                <w:szCs w:val="19"/>
-              </w:rPr>
-              <w:t xml:space="preserve">hanging for ~190 ms</w:t>
-            </w:r>
-            <w:r>
-              <w:rPr>
-                <w:sz w:val="19"/>
-                <w:szCs w:val="19"/>
-              </w:rPr>
-              <w:t xml:space="preserve"> and returning garbage (accelerometer up to 4.4 g, two axes stuck at −1 count)</w:t>
+            <w:tcW w:type="dxa" w:w="4032"/>
+            <w:tcMar>
+              <w:top w:type="dxa" w:w="60"/>
+              <w:left w:type="dxa" w:w="100"/>
+              <w:bottom w:type="dxa" w:w="60"/>
+              <w:right w:type="dxa" w:w="100"/>
+            </w:tcMar>
+          </w:tcPr>
+          <w:p>
+            <w:r>
+              <w:rPr>
+                <w:sz w:val="19"/>
+                <w:szCs w:val="19"/>
+              </w:rPr>
+              <w:t xml:space="preserve">Printing each data line</w:t>
+            </w:r>
+          </w:p>
+        </w:tc>
+        <w:tc>
+          <w:tcPr>
+            <w:tcW w:type="dxa" w:w="3225"/>
+            <w:tcMar>
+              <w:top w:type="dxa" w:w="60"/>
+              <w:left w:type="dxa" w:w="100"/>
+              <w:bottom w:type="dxa" w:w="60"/>
+              <w:right w:type="dxa" w:w="100"/>
+            </w:tcMar>
+          </w:tcPr>
+          <w:p>
+            <w:r>
+              <w:rPr>
+                <w:sz w:val="19"/>
+                <w:szCs w:val="19"/>
+              </w:rPr>
+              <w:t xml:space="preserve">~11.7 ms (~36 separate prints)</w:t>
+            </w:r>
+          </w:p>
+        </w:tc>
+        <w:tc>
+          <w:tcPr>
+            <w:tcW w:type="dxa" w:w="2823"/>
+            <w:tcMar>
+              <w:top w:type="dxa" w:w="60"/>
+              <w:left w:type="dxa" w:w="100"/>
+              <w:bottom w:type="dxa" w:w="60"/>
+              <w:right w:type="dxa" w:w="100"/>
+            </w:tcMar>
+          </w:tcPr>
+          <w:p>
+            <w:r>
+              <w:rPr>
+                <w:sz w:val="19"/>
+                <w:szCs w:val="19"/>
+              </w:rPr>
+              <w:t xml:space="preserve">~1.0–1.8 ms (one write)</w:t>
             </w:r>
           </w:p>
         </w:tc>
@@ -2692,41 +3073,61 @@
         </w:trPr>
         <w:tc>
           <w:tcPr>
-            <w:tcW w:type="dxa" w:w="2174"/>
-            <w:tcMar>
-              <w:top w:type="dxa" w:w="60"/>
-              <w:left w:type="dxa" w:w="100"/>
-              <w:bottom w:type="dxa" w:w="60"/>
-              <w:right w:type="dxa" w:w="100"/>
-            </w:tcMar>
-          </w:tcPr>
-          <w:p>
-            <w:r>
-              <w:rPr>
-                <w:sz w:val="19"/>
-                <w:szCs w:val="19"/>
-              </w:rPr>
-              <w:t xml:space="preserve">21–26 min</w:t>
-            </w:r>
-          </w:p>
-        </w:tc>
-        <w:tc>
-          <w:tcPr>
-            <w:tcW w:type="dxa" w:w="7906"/>
-            <w:tcMar>
-              <w:top w:type="dxa" w:w="60"/>
-              <w:left w:type="dxa" w:w="100"/>
-              <w:bottom w:type="dxa" w:w="60"/>
-              <w:right w:type="dxa" w:w="100"/>
-            </w:tcMar>
-          </w:tcPr>
-          <w:p>
-            <w:r>
-              <w:rPr>
-                <w:sz w:val="19"/>
-                <w:szCs w:val="19"/>
-              </w:rPr>
-              <w:t xml:space="preserve">Hung reads more frequent; gyro reads 1500–2400 °/s while still, so the orientation spins and the angle swings by tens of degrees</w:t>
+            <w:tcW w:type="dxa" w:w="4032"/>
+            <w:tcMar>
+              <w:top w:type="dxa" w:w="60"/>
+              <w:left w:type="dxa" w:w="100"/>
+              <w:bottom w:type="dxa" w:w="60"/>
+              <w:right w:type="dxa" w:w="100"/>
+            </w:tcMar>
+          </w:tcPr>
+          <w:p>
+            <w:r>
+              <w:rPr>
+                <w:sz w:val="19"/>
+                <w:szCs w:val="19"/>
+              </w:rPr>
+              <w:t xml:space="preserve">Unique samples in the CSV</w:t>
+            </w:r>
+          </w:p>
+        </w:tc>
+        <w:tc>
+          <w:tcPr>
+            <w:tcW w:type="dxa" w:w="3225"/>
+            <w:tcMar>
+              <w:top w:type="dxa" w:w="60"/>
+              <w:left w:type="dxa" w:w="100"/>
+              <w:bottom w:type="dxa" w:w="60"/>
+              <w:right w:type="dxa" w:w="100"/>
+            </w:tcMar>
+          </w:tcPr>
+          <w:p>
+            <w:r>
+              <w:rPr>
+                <w:sz w:val="19"/>
+                <w:szCs w:val="19"/>
+              </w:rPr>
+              <w:t xml:space="preserve">~40.5 per second</w:t>
+            </w:r>
+          </w:p>
+        </w:tc>
+        <w:tc>
+          <w:tcPr>
+            <w:tcW w:type="dxa" w:w="2823"/>
+            <w:tcMar>
+              <w:top w:type="dxa" w:w="60"/>
+              <w:left w:type="dxa" w:w="100"/>
+              <w:bottom w:type="dxa" w:w="60"/>
+              <w:right w:type="dxa" w:w="100"/>
+            </w:tcMar>
+          </w:tcPr>
+          <w:p>
+            <w:r>
+              <w:rPr>
+                <w:sz w:val="19"/>
+                <w:szCs w:val="19"/>
+              </w:rPr>
+              <w:t xml:space="preserve">~50 per second</w:t>
             </w:r>
           </w:p>
         </w:tc>
@@ -2737,42 +3138,265 @@
         </w:trPr>
         <w:tc>
           <w:tcPr>
-            <w:tcW w:type="dxa" w:w="2174"/>
-            <w:tcMar>
-              <w:top w:type="dxa" w:w="60"/>
-              <w:left w:type="dxa" w:w="100"/>
-              <w:bottom w:type="dxa" w:w="60"/>
-              <w:right w:type="dxa" w:w="100"/>
-            </w:tcMar>
-          </w:tcPr>
-          <w:p>
-            <w:r>
-              <w:rPr>
-                <w:sz w:val="19"/>
-                <w:szCs w:val="19"/>
-              </w:rPr>
-              <w:t xml:space="preserve">26.3 min</w:t>
-            </w:r>
-          </w:p>
-        </w:tc>
-        <w:tc>
-          <w:tcPr>
-            <w:tcW w:type="dxa" w:w="7906"/>
-            <w:tcMar>
-              <w:top w:type="dxa" w:w="60"/>
-              <w:left w:type="dxa" w:w="100"/>
-              <w:bottom w:type="dxa" w:w="60"/>
-              <w:right w:type="dxa" w:w="100"/>
-            </w:tcMar>
-          </w:tcPr>
-          <w:p>
-            <w:r>
-              <w:rPr>
-                <w:sz w:val="19"/>
-                <w:szCs w:val="19"/>
-              </w:rPr>
-              <w:t xml:space="preserve">The sensor </w:t>
-            </w:r>
+            <w:tcW w:type="dxa" w:w="4032"/>
+            <w:tcMar>
+              <w:top w:type="dxa" w:w="60"/>
+              <w:left w:type="dxa" w:w="100"/>
+              <w:bottom w:type="dxa" w:w="60"/>
+              <w:right w:type="dxa" w:w="100"/>
+            </w:tcMar>
+          </w:tcPr>
+          <w:p>
+            <w:r>
+              <w:rPr>
+                <w:sz w:val="19"/>
+                <w:szCs w:val="19"/>
+              </w:rPr>
+              <w:t xml:space="preserve">CSV rows repeating the previous sample</w:t>
+            </w:r>
+          </w:p>
+        </w:tc>
+        <w:tc>
+          <w:tcPr>
+            <w:tcW w:type="dxa" w:w="3225"/>
+            <w:tcMar>
+              <w:top w:type="dxa" w:w="60"/>
+              <w:left w:type="dxa" w:w="100"/>
+              <w:bottom w:type="dxa" w:w="60"/>
+              <w:right w:type="dxa" w:w="100"/>
+            </w:tcMar>
+          </w:tcPr>
+          <w:p>
+            <w:r>
+              <w:rPr>
+                <w:sz w:val="19"/>
+                <w:szCs w:val="19"/>
+              </w:rPr>
+              <w:t xml:space="preserve">19–20 %</w:t>
+            </w:r>
+          </w:p>
+        </w:tc>
+        <w:tc>
+          <w:tcPr>
+            <w:tcW w:type="dxa" w:w="2823"/>
+            <w:tcMar>
+              <w:top w:type="dxa" w:w="60"/>
+              <w:left w:type="dxa" w:w="100"/>
+              <w:bottom w:type="dxa" w:w="60"/>
+              <w:right w:type="dxa" w:w="100"/>
+            </w:tcMar>
+          </w:tcPr>
+          <w:p>
+            <w:r>
+              <w:rPr>
+                <w:sz w:val="19"/>
+                <w:szCs w:val="19"/>
+              </w:rPr>
+              <w:t xml:space="preserve">0 %</w:t>
+            </w:r>
+          </w:p>
+        </w:tc>
+      </w:tr>
+    </w:tbl>
+    <w:p>
+      <w:pPr>
+        <w:spacing w:after="120"/>
+      </w:pPr>
+    </w:p>
+    <w:p>
+      <w:pPr>
+        <w:spacing w:after="60"/>
+      </w:pPr>
+      <w:r>
+        <w:rPr>
+          <w:b/>
+          <w:bCs/>
+        </w:rPr>
+        <w:t xml:space="preserve">Cause.</w:t>
+      </w:r>
+      <w:r>
+        <w:t xml:space="preserve"> Two separate problems:</w:t>
+      </w:r>
+    </w:p>
+    <w:p>
+      <w:pPr>
+        <w:pStyle w:val="ListParagraph"/>
+        <w:numPr>
+          <w:ilvl w:val="0"/>
+          <w:numId w:val="3"/>
+        </w:numPr>
+        <w:spacing w:after="60"/>
+      </w:pPr>
+      <w:r>
+        <w:rPr>
+          <w:b/>
+          <w:bCs/>
+        </w:rPr>
+        <w:t xml:space="preserve">The central board ran slow.</w:t>
+      </w:r>
+      <w:r>
+        <w:t xml:space="preserve"> Each output cycle spent ~10.7 ms reading its IMU and ~11.7 ms printing the data line as ~36 separate blocking prints.</w:t>
+      </w:r>
+    </w:p>
+    <w:p>
+      <w:pPr>
+        <w:pStyle w:val="ListParagraph"/>
+        <w:numPr>
+          <w:ilvl w:val="0"/>
+          <w:numId w:val="3"/>
+        </w:numPr>
+        <w:spacing w:after="60"/>
+      </w:pPr>
+      <w:r>
+        <w:rPr>
+          <w:b/>
+          <w:bCs/>
+        </w:rPr>
+        <w:t xml:space="preserve">The GUI wrote on its own timer.</w:t>
+      </w:r>
+      <w:r>
+        <w:t xml:space="preserve"> It wrote a row every 20 ms whatever had arrived, and on Windows that timer ticks unevenly, so rows repeated some samples and skipped others.</w:t>
+      </w:r>
+    </w:p>
+    <w:p>
+      <w:pPr>
+        <w:spacing w:after="60" w:before="80"/>
+      </w:pPr>
+      <w:r>
+        <w:rPr>
+          <w:b/>
+          <w:bCs/>
+        </w:rPr>
+        <w:t xml:space="preserve">Fixes.</w:t>
+      </w:r>
+    </w:p>
+    <w:p>
+      <w:pPr>
+        <w:pStyle w:val="ListParagraph"/>
+        <w:numPr>
+          <w:ilvl w:val="0"/>
+          <w:numId w:val="3"/>
+        </w:numPr>
+        <w:spacing w:after="60"/>
+      </w:pPr>
+      <w:r>
+        <w:t xml:space="preserve">The central now builds each line in memory and sends it with one write.</w:t>
+      </w:r>
+    </w:p>
+    <w:p>
+      <w:pPr>
+        <w:pStyle w:val="ListParagraph"/>
+        <w:numPr>
+          <w:ilvl w:val="0"/>
+          <w:numId w:val="3"/>
+        </w:numPr>
+        <w:spacing w:after="60"/>
+      </w:pPr>
+      <w:r>
+        <w:t xml:space="preserve">The GUI now writes exactly one row per sample received, timed by the board's own clock.</w:t>
+      </w:r>
+    </w:p>
+    <w:p>
+      <w:pPr>
+        <w:spacing w:after="120" w:before="80"/>
+      </w:pPr>
+      <w:r>
+        <w:t xml:space="preserve">Both were confirmed in the hour-long run: 50 rows/s, 0 duplicates, rows 19.9 ms apart.</w:t>
+      </w:r>
+    </w:p>
+    <w:p>
+      <w:pPr>
+        <w:spacing w:after="120"/>
+      </w:pPr>
+      <w:r>
+        <w:rPr>
+          <w:b/>
+          <w:bCs/>
+        </w:rPr>
+        <w:t xml:space="preserve">Effect on these results: none.</w:t>
+      </w:r>
+      <w:r>
+        <w:t xml:space="preserve"> With duplicates removed, every run's mean, SD and drift are identical to within 0.0002°. The fix matters for movement data.</w:t>
+      </w:r>
+    </w:p>
+    <w:p>
+      <w:pPr>
+        <w:pStyle w:val="Heading2"/>
+      </w:pPr>
+      <w:r>
+        <w:t xml:space="preserve">2. One board's sensor fails after 20–47 minutes — traced to that board</w:t>
+      </w:r>
+    </w:p>
+    <w:p>
+      <w:pPr>
+        <w:spacing w:after="120"/>
+      </w:pPr>
+      <w:r>
+        <w:rPr>
+          <w:b/>
+          <w:bCs/>
+        </w:rPr>
+        <w:t xml:space="preserve">What happens.</w:t>
+      </w:r>
+      <w:r>
+        <w:t xml:space="preserve"> On that board, individual sensor reads start </w:t>
+      </w:r>
+      <w:r>
+        <w:rPr>
+          <w:b/>
+          <w:bCs/>
+        </w:rPr>
+        <w:t xml:space="preserve">hanging for ~190–200 ms</w:t>
+      </w:r>
+      <w:r>
+        <w:t xml:space="preserve"> and returning garbage while the board sits still: accelerometer up to 4.4 g, gyro up to 2400 °/s. A few minutes later the sensor </w:t>
+      </w:r>
+      <w:r>
+        <w:rPr>
+          <w:b/>
+          <w:bCs/>
+        </w:rPr>
+        <w:t xml:space="preserve">stops producing data entirely</w:t>
+      </w:r>
+      <w:r>
+        <w:t xml:space="preserve">. Restarting the sensor, or rebooting the board, doesn't bring it back.</w:t>
+      </w:r>
+    </w:p>
+    <w:tbl>
+      <w:tblPr>
+        <w:tblW w:type="dxa" w:w="10080"/>
+        <w:tblBorders>
+          <w:top w:val="single" w:color="BFBFBF" w:sz="4"/>
+          <w:left w:val="single" w:color="BFBFBF" w:sz="4"/>
+          <w:bottom w:val="single" w:color="BFBFBF" w:sz="4"/>
+          <w:right w:val="single" w:color="BFBFBF" w:sz="4"/>
+          <w:insideH w:val="single" w:color="BFBFBF" w:sz="4"/>
+          <w:insideV w:val="single" w:color="BFBFBF" w:sz="4"/>
+        </w:tblBorders>
+        <w:tblLayout w:type="fixed"/>
+      </w:tblPr>
+      <w:tblGrid>
+        <w:gridCol w:w="2352"/>
+        <w:gridCol w:w="1848"/>
+        <w:gridCol w:w="2856"/>
+        <w:gridCol w:w="3024"/>
+      </w:tblGrid>
+      <w:tr>
+        <w:trPr>
+          <w:tblHeader/>
+        </w:trPr>
+        <w:tc>
+          <w:tcPr>
+            <w:tcW w:type="dxa" w:w="2352"/>
+            <w:shd w:fill="DCE6F1" w:color="auto" w:val="clear"/>
+            <w:tcMar>
+              <w:top w:type="dxa" w:w="60"/>
+              <w:left w:type="dxa" w:w="100"/>
+              <w:bottom w:type="dxa" w:w="60"/>
+              <w:right w:type="dxa" w:w="100"/>
+            </w:tcMar>
+          </w:tcPr>
+          <w:p>
             <w:r>
               <w:rPr>
                 <w:b/>
@@ -2780,14 +3404,76 @@
                 <w:sz w:val="19"/>
                 <w:szCs w:val="19"/>
               </w:rPr>
-              <w:t xml:space="preserve">stops producing data</w:t>
-            </w:r>
-            <w:r>
-              <w:rPr>
-                <w:sz w:val="19"/>
-                <w:szCs w:val="19"/>
-              </w:rPr>
-              <w:t xml:space="preserve">. Each restart attempt reports success but takes ~1.9 s, and no sample ever follows</w:t>
+              <w:t xml:space="preserve">Recording</w:t>
+            </w:r>
+          </w:p>
+        </w:tc>
+        <w:tc>
+          <w:tcPr>
+            <w:tcW w:type="dxa" w:w="1848"/>
+            <w:shd w:fill="DCE6F1" w:color="auto" w:val="clear"/>
+            <w:tcMar>
+              <w:top w:type="dxa" w:w="60"/>
+              <w:left w:type="dxa" w:w="100"/>
+              <w:bottom w:type="dxa" w:w="60"/>
+              <w:right w:type="dxa" w:w="100"/>
+            </w:tcMar>
+          </w:tcPr>
+          <w:p>
+            <w:r>
+              <w:rPr>
+                <w:b/>
+                <w:bCs/>
+                <w:sz w:val="19"/>
+                <w:szCs w:val="19"/>
+              </w:rPr>
+              <w:t xml:space="preserve">That board's role</w:t>
+            </w:r>
+          </w:p>
+        </w:tc>
+        <w:tc>
+          <w:tcPr>
+            <w:tcW w:type="dxa" w:w="2856"/>
+            <w:shd w:fill="DCE6F1" w:color="auto" w:val="clear"/>
+            <w:tcMar>
+              <w:top w:type="dxa" w:w="60"/>
+              <w:left w:type="dxa" w:w="100"/>
+              <w:bottom w:type="dxa" w:w="60"/>
+              <w:right w:type="dxa" w:w="100"/>
+            </w:tcMar>
+          </w:tcPr>
+          <w:p>
+            <w:r>
+              <w:rPr>
+                <w:b/>
+                <w:bCs/>
+                <w:sz w:val="19"/>
+                <w:szCs w:val="19"/>
+              </w:rPr>
+              <w:t xml:space="preserve">Sensor trouble starts</w:t>
+            </w:r>
+          </w:p>
+        </w:tc>
+        <w:tc>
+          <w:tcPr>
+            <w:tcW w:type="dxa" w:w="3024"/>
+            <w:shd w:fill="DCE6F1" w:color="auto" w:val="clear"/>
+            <w:tcMar>
+              <w:top w:type="dxa" w:w="60"/>
+              <w:left w:type="dxa" w:w="100"/>
+              <w:bottom w:type="dxa" w:w="60"/>
+              <w:right w:type="dxa" w:w="100"/>
+            </w:tcMar>
+          </w:tcPr>
+          <w:p>
+            <w:r>
+              <w:rPr>
+                <w:b/>
+                <w:bCs/>
+                <w:sz w:val="19"/>
+                <w:szCs w:val="19"/>
+              </w:rPr>
+              <w:t xml:space="preserve">Sensor dead</w:t>
             </w:r>
           </w:p>
         </w:tc>
@@ -2798,41 +3484,345 @@
         </w:trPr>
         <w:tc>
           <w:tcPr>
-            <w:tcW w:type="dxa" w:w="2174"/>
-            <w:tcMar>
-              <w:top w:type="dxa" w:w="60"/>
-              <w:left w:type="dxa" w:w="100"/>
-              <w:bottom w:type="dxa" w:w="60"/>
-              <w:right w:type="dxa" w:w="100"/>
-            </w:tcMar>
-          </w:tcPr>
-          <w:p>
-            <w:r>
-              <w:rPr>
-                <w:sz w:val="19"/>
-                <w:szCs w:val="19"/>
-              </w:rPr>
-              <w:t xml:space="preserve">26–41 min</w:t>
-            </w:r>
-          </w:p>
-        </w:tc>
-        <w:tc>
-          <w:tcPr>
-            <w:tcW w:type="dxa" w:w="7906"/>
-            <w:tcMar>
-              <w:top w:type="dxa" w:w="60"/>
-              <w:left w:type="dxa" w:w="100"/>
-              <w:bottom w:type="dxa" w:w="60"/>
-              <w:right w:type="dxa" w:w="100"/>
-            </w:tcMar>
-          </w:tcPr>
-          <w:p>
-            <w:r>
-              <w:rPr>
-                <w:sz w:val="19"/>
-                <w:szCs w:val="19"/>
-              </w:rPr>
-              <w:t xml:space="preserve">Board still running and talking to the central; its sensor silent</w:t>
+            <w:tcW w:type="dxa" w:w="2352"/>
+            <w:tcMar>
+              <w:top w:type="dxa" w:w="60"/>
+              <w:left w:type="dxa" w:w="100"/>
+              <w:bottom w:type="dxa" w:w="60"/>
+              <w:right w:type="dxa" w:w="100"/>
+            </w:tcMar>
+          </w:tcPr>
+          <w:p>
+            <w:r>
+              <w:rPr>
+                <w:sz w:val="19"/>
+                <w:szCs w:val="19"/>
+              </w:rPr>
+              <w:t xml:space="preserve">No-motion test</w:t>
+            </w:r>
+          </w:p>
+        </w:tc>
+        <w:tc>
+          <w:tcPr>
+            <w:tcW w:type="dxa" w:w="1848"/>
+            <w:tcMar>
+              <w:top w:type="dxa" w:w="60"/>
+              <w:left w:type="dxa" w:w="100"/>
+              <w:bottom w:type="dxa" w:w="60"/>
+              <w:right w:type="dxa" w:w="100"/>
+            </w:tcMar>
+          </w:tcPr>
+          <w:p>
+            <w:r>
+              <w:rPr>
+                <w:sz w:val="19"/>
+                <w:szCs w:val="19"/>
+              </w:rPr>
+              <w:t xml:space="preserve">Shank (ruler)</w:t>
+            </w:r>
+          </w:p>
+        </w:tc>
+        <w:tc>
+          <w:tcPr>
+            <w:tcW w:type="dxa" w:w="2856"/>
+            <w:tcMar>
+              <w:top w:type="dxa" w:w="60"/>
+              <w:left w:type="dxa" w:w="100"/>
+              <w:bottom w:type="dxa" w:w="60"/>
+              <w:right w:type="dxa" w:w="100"/>
+            </w:tcMar>
+          </w:tcPr>
+          <w:p>
+            <w:r>
+              <w:rPr>
+                <w:sz w:val="19"/>
+                <w:szCs w:val="19"/>
+              </w:rPr>
+              <w:t xml:space="preserve">before 26 min</w:t>
+            </w:r>
+          </w:p>
+        </w:tc>
+        <w:tc>
+          <w:tcPr>
+            <w:tcW w:type="dxa" w:w="3024"/>
+            <w:tcMar>
+              <w:top w:type="dxa" w:w="60"/>
+              <w:left w:type="dxa" w:w="100"/>
+              <w:bottom w:type="dxa" w:w="60"/>
+              <w:right w:type="dxa" w:w="100"/>
+            </w:tcMar>
+          </w:tcPr>
+          <w:p>
+            <w:r>
+              <w:rPr>
+                <w:sz w:val="19"/>
+                <w:szCs w:val="19"/>
+              </w:rPr>
+              <w:t xml:space="preserve">~26 min</w:t>
+            </w:r>
+          </w:p>
+        </w:tc>
+      </w:tr>
+      <w:tr>
+        <w:trPr>
+          <w:cantSplit/>
+        </w:trPr>
+        <w:tc>
+          <w:tcPr>
+            <w:tcW w:type="dxa" w:w="2352"/>
+            <w:tcMar>
+              <w:top w:type="dxa" w:w="60"/>
+              <w:left w:type="dxa" w:w="100"/>
+              <w:bottom w:type="dxa" w:w="60"/>
+              <w:right w:type="dxa" w:w="100"/>
+            </w:tcMar>
+          </w:tcPr>
+          <w:p>
+            <w:r>
+              <w:rPr>
+                <w:sz w:val="19"/>
+                <w:szCs w:val="19"/>
+              </w:rPr>
+              <w:t xml:space="preserve">Long run 1</w:t>
+            </w:r>
+          </w:p>
+        </w:tc>
+        <w:tc>
+          <w:tcPr>
+            <w:tcW w:type="dxa" w:w="1848"/>
+            <w:tcMar>
+              <w:top w:type="dxa" w:w="60"/>
+              <w:left w:type="dxa" w:w="100"/>
+              <w:bottom w:type="dxa" w:w="60"/>
+              <w:right w:type="dxa" w:w="100"/>
+            </w:tcMar>
+          </w:tcPr>
+          <w:p>
+            <w:r>
+              <w:rPr>
+                <w:sz w:val="19"/>
+                <w:szCs w:val="19"/>
+              </w:rPr>
+              <w:t xml:space="preserve">Shank</w:t>
+            </w:r>
+          </w:p>
+        </w:tc>
+        <w:tc>
+          <w:tcPr>
+            <w:tcW w:type="dxa" w:w="2856"/>
+            <w:tcMar>
+              <w:top w:type="dxa" w:w="60"/>
+              <w:left w:type="dxa" w:w="100"/>
+              <w:bottom w:type="dxa" w:w="60"/>
+              <w:right w:type="dxa" w:w="100"/>
+            </w:tcMar>
+          </w:tcPr>
+          <w:p>
+            <w:r>
+              <w:rPr>
+                <w:sz w:val="19"/>
+                <w:szCs w:val="19"/>
+              </w:rPr>
+              <w:t xml:space="preserve">20.4 min</w:t>
+            </w:r>
+          </w:p>
+        </w:tc>
+        <w:tc>
+          <w:tcPr>
+            <w:tcW w:type="dxa" w:w="3024"/>
+            <w:tcMar>
+              <w:top w:type="dxa" w:w="60"/>
+              <w:left w:type="dxa" w:w="100"/>
+              <w:bottom w:type="dxa" w:w="60"/>
+              <w:right w:type="dxa" w:w="100"/>
+            </w:tcMar>
+          </w:tcPr>
+          <w:p>
+            <w:r>
+              <w:rPr>
+                <w:sz w:val="19"/>
+                <w:szCs w:val="19"/>
+              </w:rPr>
+              <w:t xml:space="preserve">26.3 min</w:t>
+            </w:r>
+          </w:p>
+        </w:tc>
+      </w:tr>
+      <w:tr>
+        <w:trPr>
+          <w:cantSplit/>
+        </w:trPr>
+        <w:tc>
+          <w:tcPr>
+            <w:tcW w:type="dxa" w:w="2352"/>
+            <w:tcMar>
+              <w:top w:type="dxa" w:w="60"/>
+              <w:left w:type="dxa" w:w="100"/>
+              <w:bottom w:type="dxa" w:w="60"/>
+              <w:right w:type="dxa" w:w="100"/>
+            </w:tcMar>
+          </w:tcPr>
+          <w:p>
+            <w:r>
+              <w:rPr>
+                <w:sz w:val="19"/>
+                <w:szCs w:val="19"/>
+              </w:rPr>
+              <w:t xml:space="preserve">Long run 2</w:t>
+            </w:r>
+          </w:p>
+        </w:tc>
+        <w:tc>
+          <w:tcPr>
+            <w:tcW w:type="dxa" w:w="1848"/>
+            <w:tcMar>
+              <w:top w:type="dxa" w:w="60"/>
+              <w:left w:type="dxa" w:w="100"/>
+              <w:bottom w:type="dxa" w:w="60"/>
+              <w:right w:type="dxa" w:w="100"/>
+            </w:tcMar>
+          </w:tcPr>
+          <w:p>
+            <w:r>
+              <w:rPr>
+                <w:sz w:val="19"/>
+                <w:szCs w:val="19"/>
+              </w:rPr>
+              <w:t xml:space="preserve">Shank</w:t>
+            </w:r>
+          </w:p>
+        </w:tc>
+        <w:tc>
+          <w:tcPr>
+            <w:tcW w:type="dxa" w:w="2856"/>
+            <w:tcMar>
+              <w:top w:type="dxa" w:w="60"/>
+              <w:left w:type="dxa" w:w="100"/>
+              <w:bottom w:type="dxa" w:w="60"/>
+              <w:right w:type="dxa" w:w="100"/>
+            </w:tcMar>
+          </w:tcPr>
+          <w:p>
+            <w:r>
+              <w:rPr>
+                <w:sz w:val="19"/>
+                <w:szCs w:val="19"/>
+              </w:rPr>
+              <w:t xml:space="preserve">24.8 min (abrupt)</w:t>
+            </w:r>
+          </w:p>
+        </w:tc>
+        <w:tc>
+          <w:tcPr>
+            <w:tcW w:type="dxa" w:w="3024"/>
+            <w:tcMar>
+              <w:top w:type="dxa" w:w="60"/>
+              <w:left w:type="dxa" w:w="100"/>
+              <w:bottom w:type="dxa" w:w="60"/>
+              <w:right w:type="dxa" w:w="100"/>
+            </w:tcMar>
+          </w:tcPr>
+          <w:p>
+            <w:r>
+              <w:rPr>
+                <w:sz w:val="19"/>
+                <w:szCs w:val="19"/>
+              </w:rPr>
+              <w:t xml:space="preserve">24.8 min; still dead after the automatic reboot</w:t>
+            </w:r>
+          </w:p>
+        </w:tc>
+      </w:tr>
+      <w:tr>
+        <w:trPr>
+          <w:cantSplit/>
+        </w:trPr>
+        <w:tc>
+          <w:tcPr>
+            <w:tcW w:type="dxa" w:w="2352"/>
+            <w:tcMar>
+              <w:top w:type="dxa" w:w="60"/>
+              <w:left w:type="dxa" w:w="100"/>
+              <w:bottom w:type="dxa" w:w="60"/>
+              <w:right w:type="dxa" w:w="100"/>
+            </w:tcMar>
+          </w:tcPr>
+          <w:p>
+            <w:r>
+              <w:rPr>
+                <w:sz w:val="19"/>
+                <w:szCs w:val="19"/>
+              </w:rPr>
+              <w:t xml:space="preserve">Long run 3, </w:t>
+            </w:r>
+            <w:r>
+              <w:rPr>
+                <w:b/>
+                <w:bCs/>
+                <w:sz w:val="19"/>
+                <w:szCs w:val="19"/>
+              </w:rPr>
+              <w:t xml:space="preserve">roles swapped</w:t>
+            </w:r>
+          </w:p>
+        </w:tc>
+        <w:tc>
+          <w:tcPr>
+            <w:tcW w:type="dxa" w:w="1848"/>
+            <w:tcMar>
+              <w:top w:type="dxa" w:w="60"/>
+              <w:left w:type="dxa" w:w="100"/>
+              <w:bottom w:type="dxa" w:w="60"/>
+              <w:right w:type="dxa" w:w="100"/>
+            </w:tcMar>
+          </w:tcPr>
+          <w:p>
+            <w:r>
+              <w:rPr>
+                <w:sz w:val="19"/>
+                <w:szCs w:val="19"/>
+              </w:rPr>
+              <w:t xml:space="preserve">Thigh (central)</w:t>
+            </w:r>
+          </w:p>
+        </w:tc>
+        <w:tc>
+          <w:tcPr>
+            <w:tcW w:type="dxa" w:w="2856"/>
+            <w:tcMar>
+              <w:top w:type="dxa" w:w="60"/>
+              <w:left w:type="dxa" w:w="100"/>
+              <w:bottom w:type="dxa" w:w="60"/>
+              <w:right w:type="dxa" w:w="100"/>
+            </w:tcMar>
+          </w:tcPr>
+          <w:p>
+            <w:r>
+              <w:rPr>
+                <w:sz w:val="19"/>
+                <w:szCs w:val="19"/>
+              </w:rPr>
+              <w:t xml:space="preserve">6.5 min (missed updates); 37.8 min (hung reads)</w:t>
+            </w:r>
+          </w:p>
+        </w:tc>
+        <w:tc>
+          <w:tcPr>
+            <w:tcW w:type="dxa" w:w="3024"/>
+            <w:tcMar>
+              <w:top w:type="dxa" w:w="60"/>
+              <w:left w:type="dxa" w:w="100"/>
+              <w:bottom w:type="dxa" w:w="60"/>
+              <w:right w:type="dxa" w:w="100"/>
+            </w:tcMar>
+          </w:tcPr>
+          <w:p>
+            <w:r>
+              <w:rPr>
+                <w:sz w:val="19"/>
+                <w:szCs w:val="19"/>
+              </w:rPr>
+              <w:t xml:space="preserve">47.3 min</w:t>
             </w:r>
           </w:p>
         </w:tc>
@@ -2842,13 +3832,43 @@
       <w:pPr>
         <w:spacing w:after="120"/>
       </w:pPr>
+    </w:p>
+    <w:p>
+      <w:pPr>
+        <w:spacing w:after="120"/>
+      </w:pPr>
+      <w:r>
+        <w:t xml:space="preserve">In the swapped run, </w:t>
+      </w:r>
+      <w:r>
+        <w:rPr>
+          <w:b/>
+          <w:bCs/>
+        </w:rPr>
+        <w:t xml:space="preserve">the other board ran the shank role for over an hour with 0 bad readings.</w:t>
+      </w:r>
+      <w:r>
+        <w:t xml:space="preserve"> Across all runs, the other board never had a sensor problem in either role.</w:t>
+      </w:r>
+    </w:p>
+    <w:p>
+      <w:pPr>
+        <w:spacing w:after="60"/>
+      </w:pPr>
+      <w:r>
+        <w:rPr>
+          <w:b/>
+          <w:bCs/>
+        </w:rPr>
+        <w:t xml:space="preserve">Ruled out:</w:t>
+      </w:r>
     </w:p>
     <w:p>
       <w:pPr>
         <w:pStyle w:val="ListParagraph"/>
         <w:numPr>
           <w:ilvl w:val="0"/>
-          <w:numId w:val="4"/>
+          <w:numId w:val="3"/>
         </w:numPr>
         <w:spacing w:after="60"/>
       </w:pPr>
@@ -2857,10 +3877,10 @@
           <w:b/>
           <w:bCs/>
         </w:rPr>
-        <w:t xml:space="preserve">Not the link:</w:t>
-      </w:r>
-      <w:r>
-        <w:t xml:space="preserve"> 0 checksum failures and 0 corrupted bytes for the whole run, and the ruler board's health reports kept arriving.</w:t>
+        <w:t xml:space="preserve">The link:</w:t>
+      </w:r>
+      <w:r>
+        <w:t xml:space="preserve"> no checksum failures before the fault in any run (apart from 2 at start-up in one).</w:t>
       </w:r>
     </w:p>
     <w:p>
@@ -2868,7 +3888,7 @@
         <w:pStyle w:val="ListParagraph"/>
         <w:numPr>
           <w:ilvl w:val="0"/>
-          <w:numId w:val="4"/>
+          <w:numId w:val="3"/>
         </w:numPr>
         <w:spacing w:after="60"/>
       </w:pPr>
@@ -2877,10 +3897,10 @@
           <w:b/>
           <w:bCs/>
         </w:rPr>
-        <w:t xml:space="preserve">Not a board reset or power loss:</w:t>
-      </w:r>
-      <w:r>
-        <w:t xml:space="preserve"> its uptime counter never restarted.</w:t>
+        <w:t xml:space="preserve">Power loss or a board reset:</w:t>
+      </w:r>
+      <w:r>
+        <w:t xml:space="preserve"> its uptime counter never restarted by itself.</w:t>
       </w:r>
     </w:p>
     <w:p>
@@ -2888,7 +3908,7 @@
         <w:pStyle w:val="ListParagraph"/>
         <w:numPr>
           <w:ilvl w:val="0"/>
-          <w:numId w:val="4"/>
+          <w:numId w:val="3"/>
         </w:numPr>
         <w:spacing w:after="60"/>
       </w:pPr>
@@ -2897,57 +3917,10 @@
           <w:b/>
           <w:bCs/>
         </w:rPr>
-        <w:t xml:space="preserve">Not calibration:</w:t>
-      </w:r>
-      <w:r>
-        <w:t xml:space="preserve"> the fault is between the ruler board's processor and its own sensor. The desk node's sensor stayed perfect for all 41 minutes.</w:t>
-      </w:r>
-    </w:p>
-    <w:p>
-      <w:pPr>
-        <w:spacing w:after="120" w:before="80"/>
-      </w:pPr>
-      <w:r>
-        <w:t xml:space="preserve">The likely cause is a hardware problem on that board (the sensor, its connections, or heat), but a firmware cause isn't ruled out yet. Swapping the two boards' roles will tell: if the fault stays with the same physical board, it's that board.</w:t>
-      </w:r>
-    </w:p>
-    <w:p>
-      <w:pPr>
-        <w:spacing w:after="120"/>
-      </w:pPr>
-      <w:r>
-        <w:rPr>
-          <w:b/>
-          <w:bCs/>
-        </w:rPr>
-        <w:t xml:space="preserve">Firmware protection (made, awaiting a test run):</w:t>
-      </w:r>
-      <w:r>
-        <w:t xml:space="preserve"> the ruler board now rejects implausible samples and sends them as gaps instead of wrong angles, resets its filter after each sensor restart, and reboots itself if its sensor produces nothing usable for 5 s.</w:t>
-      </w:r>
-    </w:p>
-    <w:p>
-      <w:pPr>
-        <w:pStyle w:val="Heading2"/>
-      </w:pPr>
-      <w:r>
-        <w:t xml:space="preserve">3. Only the ruler node was tested</w:t>
-      </w:r>
-    </w:p>
-    <w:p>
-      <w:pPr>
-        <w:spacing w:after="120"/>
-      </w:pPr>
-      <w:r>
-        <w:t xml:space="preserve">The angle is the difference between the two nodes' tilts, but the software only uses a node's tilt if it moved at least 5° during the calibration sweep. The desk node never did, so it was treated as fixed and the angle came from the ruler node alone. Its own data shows it was just as stable (jitter ~0.01°, no drift), but a future test should tilt both nodes during calibration.</w:t>
-      </w:r>
-    </w:p>
-    <w:p>
-      <w:pPr>
-        <w:pStyle w:val="Heading1"/>
-      </w:pPr>
-      <w:r>
-        <w:t xml:space="preserve">Limitations</w:t>
+        <w:t xml:space="preserve">Calibration:</w:t>
+      </w:r>
+      <w:r>
+        <w:t xml:space="preserve"> unrelated to how or whether the node moved.</w:t>
       </w:r>
     </w:p>
     <w:p>
@@ -2955,7 +3928,7 @@
         <w:pStyle w:val="ListParagraph"/>
         <w:numPr>
           <w:ilvl w:val="0"/>
-          <w:numId w:val="4"/>
+          <w:numId w:val="3"/>
         </w:numPr>
         <w:spacing w:after="60"/>
       </w:pPr>
@@ -2964,10 +3937,100 @@
           <w:b/>
           <w:bCs/>
         </w:rPr>
-        <w:t xml:space="preserve">Stability only, not accuracy.</w:t>
-      </w:r>
-      <w:r>
-        <w:t xml:space="preserve"> There was no reference angle, and resting angles were at most 6.4°, too small to reveal scale errors.</w:t>
+        <w:t xml:space="preserve">The firmware:</w:t>
+      </w:r>
+      <w:r>
+        <w:t xml:space="preserve"> both firmware roles failed on this board, and neither failed on the other.</w:t>
+      </w:r>
+    </w:p>
+    <w:p>
+      <w:pPr>
+        <w:spacing w:after="120" w:before="80"/>
+      </w:pPr>
+      <w:r>
+        <w:rPr>
+          <w:b/>
+          <w:bCs/>
+        </w:rPr>
+        <w:t xml:space="preserve">Conclusion.</w:t>
+      </w:r>
+      <w:r>
+        <w:t xml:space="preserve"> The fault follows that physical board. Its cable, USB port and position also stayed with it, so a one-off test with the other board's cable and port would exclude those. The board itself is the most likely cause: a faulty sensor chip, a weak joint, or heat. </w:t>
+      </w:r>
+      <w:r>
+        <w:rPr>
+          <w:b/>
+          <w:bCs/>
+        </w:rPr>
+        <w:t xml:space="preserve">Replace it.</w:t>
+      </w:r>
+    </w:p>
+    <w:p>
+      <w:pPr>
+        <w:spacing w:after="120"/>
+      </w:pPr>
+      <w:r>
+        <w:rPr>
+          <w:b/>
+          <w:bCs/>
+        </w:rPr>
+        <w:t xml:space="preserve">Firmware protection (in place).</w:t>
+      </w:r>
+      <w:r>
+        <w:t xml:space="preserve"> The shank board now rejects implausible samples and sends them as gaps instead of wrong angles, resets its filter after each sensor restart, and reboots itself if its sensor produces nothing usable for 5 s. In long run 2 the guard caught the bad readings and the reboot fired, but the sensor stayed dead, which is why it points to hardware.</w:t>
+      </w:r>
+    </w:p>
+    <w:p>
+      <w:pPr>
+        <w:pStyle w:val="Heading2"/>
+      </w:pPr>
+      <w:r>
+        <w:t xml:space="preserve">3. Only one node was exercised, and validity can hide a failure</w:t>
+      </w:r>
+    </w:p>
+    <w:p>
+      <w:pPr>
+        <w:spacing w:after="120"/>
+      </w:pPr>
+      <w:r>
+        <w:t xml:space="preserve">The angle is the difference between the two nodes' tilts, but the software only uses a node's tilt if it moved at least 5° during the calibration sweep. The desk node never did, so it was treated as fixed and the angle came from the shank node alone.</w:t>
+      </w:r>
+    </w:p>
+    <w:p>
+      <w:pPr>
+        <w:spacing w:after="120"/>
+      </w:pPr>
+      <w:r>
+        <w:t xml:space="preserve">This also means </w:t>
+      </w:r>
+      <w:r>
+        <w:rPr>
+          <w:b/>
+          <w:bCs/>
+        </w:rPr>
+        <w:t xml:space="preserve">"valid %" only reflects the shank node's data.</w:t>
+      </w:r>
+      <w:r>
+        <w:t xml:space="preserve"> In the swapped run, the failing board was the reference node: validity stayed ~100 % and the angle stayed flat while its sensor died. The failure only showed in the diagnostic log and the CSV's </w:t>
+      </w:r>
+      <w:r>
+        <w:rPr>
+          <w:rFonts w:ascii="Consolas" w:cs="Consolas" w:eastAsia="Consolas" w:hAnsi="Consolas"/>
+          <w:sz w:val="19"/>
+          <w:szCs w:val="19"/>
+        </w:rPr>
+        <w:t xml:space="preserve">thigh_ax..az</w:t>
+      </w:r>
+      <w:r>
+        <w:t xml:space="preserve"> columns.</w:t>
+      </w:r>
+    </w:p>
+    <w:p>
+      <w:pPr>
+        <w:pStyle w:val="Heading1"/>
+      </w:pPr>
+      <w:r>
+        <w:t xml:space="preserve">Limitations</w:t>
       </w:r>
     </w:p>
     <w:p>
@@ -2975,7 +4038,7 @@
         <w:pStyle w:val="ListParagraph"/>
         <w:numPr>
           <w:ilvl w:val="0"/>
-          <w:numId w:val="4"/>
+          <w:numId w:val="3"/>
         </w:numPr>
         <w:spacing w:after="60"/>
       </w:pPr>
@@ -2984,10 +4047,10 @@
           <w:b/>
           <w:bCs/>
         </w:rPr>
-        <w:t xml:space="preserve">Jitter is limited by the log format.</w:t>
-      </w:r>
-      <w:r>
-        <w:t xml:space="preserve"> Angles are logged to 0.01°, so the ~0.01° jitter is an upper bound; the true sensor noise is probably lower.</w:t>
+        <w:t xml:space="preserve">Accuracy is preliminary only.</w:t>
+      </w:r>
+      <w:r>
+        <w:t xml:space="preserve"> The 45°/90° check was one placement each, and the reference node shifted during placement.</w:t>
       </w:r>
     </w:p>
     <w:p>
@@ -2995,7 +4058,7 @@
         <w:pStyle w:val="ListParagraph"/>
         <w:numPr>
           <w:ilvl w:val="0"/>
-          <w:numId w:val="4"/>
+          <w:numId w:val="3"/>
         </w:numPr>
         <w:spacing w:after="60"/>
       </w:pPr>
@@ -3004,10 +4067,10 @@
           <w:b/>
           <w:bCs/>
         </w:rPr>
-        <w:t xml:space="preserve">Mostly 5-minute holds.</w:t>
-      </w:r>
-      <w:r>
-        <w:t xml:space="preserve"> One clean 18-minute stretch exists; longer drift isn't measured yet because of the sensor fault.</w:t>
+        <w:t xml:space="preserve">Jitter is limited by the log format.</w:t>
+      </w:r>
+      <w:r>
+        <w:t xml:space="preserve"> Angles are logged to 0.01°, so the ~0.01° jitter is an upper bound; the true sensor noise is probably lower.</w:t>
       </w:r>
     </w:p>
     <w:p>
@@ -3015,7 +4078,7 @@
         <w:pStyle w:val="ListParagraph"/>
         <w:numPr>
           <w:ilvl w:val="0"/>
-          <w:numId w:val="4"/>
+          <w:numId w:val="3"/>
         </w:numPr>
         <w:spacing w:after="60"/>
       </w:pPr>
@@ -3027,7 +4090,27 @@
         <w:t xml:space="preserve">Rig vs. sensor.</w:t>
       </w:r>
       <w:r>
-        <w:t xml:space="preserve"> Where the rig moved (session 2), its movement can't yet be separated from sensor drift. The GUI now logs the raw accelerometer, which will allow that.</w:t>
+        <w:t xml:space="preserve"> Where the rig moved (session 2), its movement couldn't be separated from sensor drift at the time. The GUI now logs the raw accelerometer, which does that; it confirmed a later creep was physical.</w:t>
+      </w:r>
+    </w:p>
+    <w:p>
+      <w:pPr>
+        <w:pStyle w:val="ListParagraph"/>
+        <w:numPr>
+          <w:ilvl w:val="0"/>
+          <w:numId w:val="3"/>
+        </w:numPr>
+        <w:spacing w:after="60"/>
+      </w:pPr>
+      <w:r>
+        <w:rPr>
+          <w:b/>
+          <w:bCs/>
+        </w:rPr>
+        <w:t xml:space="preserve">One node per test.</w:t>
+      </w:r>
+      <w:r>
+        <w:t xml:space="preserve"> The reference node's behaviour within the angle calculation hasn't been tested.</w:t>
       </w:r>
     </w:p>
     <w:p>
@@ -3126,7 +4209,7 @@
                 <w:sz w:val="19"/>
                 <w:szCs w:val="19"/>
               </w:rPr>
-              <w:t xml:space="preserve">Run the diagnostic build past the ~15 min mark</w:t>
+              <w:t xml:space="preserve">Fix the sample rate (one write per line; one CSV row per sample)</w:t>
             </w:r>
           </w:p>
         </w:tc>
@@ -3146,7 +4229,7 @@
                 <w:sz w:val="19"/>
                 <w:szCs w:val="19"/>
               </w:rPr>
-              <w:t xml:space="preserve">Done (~40 min run)</w:t>
+              <w:t xml:space="preserve">Done and confirmed</w:t>
             </w:r>
           </w:p>
         </w:tc>
@@ -3191,22 +4274,7 @@
                 <w:sz w:val="19"/>
                 <w:szCs w:val="19"/>
               </w:rPr>
-              <w:t xml:space="preserve">Done (</w:t>
-            </w:r>
-            <w:r>
-              <w:rPr>
-                <w:rFonts w:ascii="Consolas" w:cs="Consolas" w:eastAsia="Consolas" w:hAnsi="Consolas"/>
-                <w:sz w:val="19"/>
-                <w:szCs w:val="19"/>
-              </w:rPr>
-              <w:t xml:space="preserve">knee_gui.py</w:t>
-            </w:r>
-            <w:r>
-              <w:rPr>
-                <w:sz w:val="19"/>
-                <w:szCs w:val="19"/>
-              </w:rPr>
-              <w:t xml:space="preserve">)</w:t>
+              <w:t xml:space="preserve">Done</w:t>
             </w:r>
           </w:p>
         </w:tc>
@@ -3231,7 +4299,7 @@
                 <w:sz w:val="19"/>
                 <w:szCs w:val="19"/>
               </w:rPr>
-              <w:t xml:space="preserve">Speed up the output cycle (one write per line)</w:t>
+              <w:t xml:space="preserve">Guard the shank node against a failing sensor</w:t>
             </w:r>
           </w:p>
         </w:tc>
@@ -3251,7 +4319,7 @@
                 <w:sz w:val="19"/>
                 <w:szCs w:val="19"/>
               </w:rPr>
-              <w:t xml:space="preserve">Done: flash both boards and test</w:t>
+              <w:t xml:space="preserve">Done</w:t>
             </w:r>
           </w:p>
         </w:tc>
@@ -3276,7 +4344,7 @@
                 <w:sz w:val="19"/>
                 <w:szCs w:val="19"/>
               </w:rPr>
-              <w:t xml:space="preserve">Guard the ruler node against a failing sensor</w:t>
+              <w:t xml:space="preserve">Board-swap test to locate the sensor fault</w:t>
             </w:r>
           </w:p>
         </w:tc>
@@ -3296,7 +4364,7 @@
                 <w:sz w:val="19"/>
                 <w:szCs w:val="19"/>
               </w:rPr>
-              <w:t xml:space="preserve">Done: flash both boards and test</w:t>
+              <w:t xml:space="preserve">Done: fault follows one board</w:t>
             </w:r>
           </w:p>
         </w:tc>
@@ -3321,7 +4389,7 @@
                 <w:sz w:val="19"/>
                 <w:szCs w:val="19"/>
               </w:rPr>
-              <w:t xml:space="preserve">Swap the boards' roles to see if the fault follows the hardware</w:t>
+              <w:t xml:space="preserve">Replace the faulty board (optionally, first test it on the other cable and port)</w:t>
             </w:r>
           </w:p>
         </w:tc>
@@ -3341,7 +4409,7 @@
                 <w:sz w:val="19"/>
                 <w:szCs w:val="19"/>
               </w:rPr>
-              <w:t xml:space="preserve">Next test</w:t>
+              <w:t xml:space="preserve">To do</w:t>
             </w:r>
           </w:p>
         </w:tc>
@@ -3366,7 +4434,7 @@
                 <w:sz w:val="19"/>
                 <w:szCs w:val="19"/>
               </w:rPr>
-              <w:t xml:space="preserve">Write one CSV row per received sample</w:t>
+              <w:t xml:space="preserve">One-hour static run on two healthy boards as the clean baseline</w:t>
             </w:r>
           </w:p>
         </w:tc>
@@ -3386,7 +4454,7 @@
                 <w:sz w:val="19"/>
                 <w:szCs w:val="19"/>
               </w:rPr>
-              <w:t xml:space="preserve">To do</w:t>
+              <w:t xml:space="preserve">After replacement</w:t>
             </w:r>
           </w:p>
         </w:tc>
@@ -3411,7 +4479,7 @@
                 <w:sz w:val="19"/>
                 <w:szCs w:val="19"/>
               </w:rPr>
-              <w:t xml:space="preserve">Log angles with more decimal places</w:t>
+              <w:t xml:space="preserve">Tilt both nodes during calibration, so the angle uses both</w:t>
             </w:r>
           </w:p>
         </w:tc>
@@ -3431,7 +4499,7 @@
                 <w:sz w:val="19"/>
                 <w:szCs w:val="19"/>
               </w:rPr>
-              <w:t xml:space="preserve">To do</w:t>
+              <w:t xml:space="preserve">Next test</w:t>
             </w:r>
           </w:p>
         </w:tc>
@@ -3456,7 +4524,7 @@
                 <w:sz w:val="19"/>
                 <w:szCs w:val="19"/>
               </w:rPr>
-              <w:t xml:space="preserve">Stiffen the raised rig (clamp the ruler, fix both nodes rigidly)</w:t>
+              <w:t xml:space="preserve">Keep the reference node still (tape the board and its cable down)</w:t>
             </w:r>
           </w:p>
         </w:tc>
@@ -3476,7 +4544,7 @@
                 <w:sz w:val="19"/>
                 <w:szCs w:val="19"/>
               </w:rPr>
-              <w:t xml:space="preserve">To do</w:t>
+              <w:t xml:space="preserve">Next test</w:t>
             </w:r>
           </w:p>
         </w:tc>
@@ -3501,7 +4569,7 @@
                 <w:sz w:val="19"/>
                 <w:szCs w:val="19"/>
               </w:rPr>
-              <w:t xml:space="preserve">Tilt both nodes during calibration</w:t>
+              <w:t xml:space="preserve">Repeat 0°/45°/90° placements 3–5 times each</w:t>
             </w:r>
           </w:p>
         </w:tc>
@@ -3521,7 +4589,7 @@
                 <w:sz w:val="19"/>
                 <w:szCs w:val="19"/>
               </w:rPr>
-              <w:t xml:space="preserve">Next test</w:t>
+              <w:t xml:space="preserve">If a steadier rig is available</w:t>
             </w:r>
           </w:p>
         </w:tc>
@@ -3546,7 +4614,7 @@
                 <w:sz w:val="19"/>
                 <w:szCs w:val="19"/>
               </w:rPr>
-              <w:t xml:space="preserve">Static test at known angles (30°, 45°, 90°) for accuracy</w:t>
+              <w:t xml:space="preserve">Log angles with more decimal places</w:t>
             </w:r>
           </w:p>
         </w:tc>
@@ -3566,52 +4634,7 @@
                 <w:sz w:val="19"/>
                 <w:szCs w:val="19"/>
               </w:rPr>
-              <w:t xml:space="preserve">Next test</w:t>
-            </w:r>
-          </w:p>
-        </w:tc>
-      </w:tr>
-      <w:tr>
-        <w:trPr>
-          <w:cantSplit/>
-        </w:trPr>
-        <w:tc>
-          <w:tcPr>
-            <w:tcW w:type="dxa" w:w="6854"/>
-            <w:tcMar>
-              <w:top w:type="dxa" w:w="60"/>
-              <w:left w:type="dxa" w:w="100"/>
-              <w:bottom w:type="dxa" w:w="60"/>
-              <w:right w:type="dxa" w:w="100"/>
-            </w:tcMar>
-          </w:tcPr>
-          <w:p>
-            <w:r>
-              <w:rPr>
-                <w:sz w:val="19"/>
-                <w:szCs w:val="19"/>
-              </w:rPr>
-              <w:t xml:space="preserve">Longer static run (30–60 min)</w:t>
-            </w:r>
-          </w:p>
-        </w:tc>
-        <w:tc>
-          <w:tcPr>
-            <w:tcW w:type="dxa" w:w="3226"/>
-            <w:tcMar>
-              <w:top w:type="dxa" w:w="60"/>
-              <w:left w:type="dxa" w:w="100"/>
-              <w:bottom w:type="dxa" w:w="60"/>
-              <w:right w:type="dxa" w:w="100"/>
-            </w:tcMar>
-          </w:tcPr>
-          <w:p>
-            <w:r>
-              <w:rPr>
-                <w:sz w:val="19"/>
-                <w:szCs w:val="19"/>
-              </w:rPr>
-              <w:t xml:space="preserve">Next test</w:t>
+              <w:t xml:space="preserve">To do</w:t>
             </w:r>
           </w:p>
         </w:tc>
@@ -3716,7 +4739,7 @@
         <w:sz w:val="16"/>
         <w:szCs w:val="16"/>
       </w:rPr>
-      <w:t xml:space="preserve">Static Stability Test Report   ·   page </w:t>
+      <w:t xml:space="preserve">Static Test Report   ·   page </w:t>
     </w:r>
     <w:r>
       <w:rPr>
@@ -3914,13 +4937,13 @@
     </w:lvlOverride>
   </w:num>
   <w:num w:numId="3">
-    <w:abstractNumId w:val="4"/>
+    <w:abstractNumId w:val="2"/>
     <w:lvlOverride w:ilvl="0">
       <w:startOverride w:val="1"/>
     </w:lvlOverride>
   </w:num>
   <w:num w:numId="4">
-    <w:abstractNumId w:val="2"/>
+    <w:abstractNumId w:val="4"/>
     <w:lvlOverride w:ilvl="0">
       <w:startOverride w:val="1"/>
     </w:lvlOverride>

</xml_diff>

<commit_message>
Report: restructure (purpose, testing, setup, results, issues, limitations, conclusions)
- New order: purpose of the document, what we are testing, setup,
  results, issues found, limitations, conclusions and next steps.
- Issue 2 rewritten retrospectively: long-session data loss traced to a
  faulty board, not an action item.
- The one-node-exercised finding and the valid-% caveat move to
  Limitations.
- The next-steps table becomes a written conclusions section: what was
  tested, what was found and addressed, and recommended next steps.
- build_report_docx.js now converts REPORT.md directly, so the Word
  version can't drift from the Markdown.

Co-Authored-By: Claude Opus 5.5 <noreply@anthropic.com>
Claude-Session: https://claude.ai/code/session_01AxnhBNGVNZa62atbRd2ZEw
</commit_message>
<xml_diff>
--- a/analysis/static_test/Static_Stability_Test_Report.docx
+++ b/analysis/static_test/Static_Stability_Test_Report.docx
@@ -43,7 +43,7 @@
           <w:sz w:val="19"/>
           <w:szCs w:val="19"/>
         </w:rPr>
-        <w:t xml:space="preserve"> 2026-09-23 and 2026-09-24   ·   </w:t>
+        <w:t xml:space="preserve"> 2026-09-23 and 2026-09-24 · </w:t>
       </w:r>
       <w:r>
         <w:rPr>
@@ -61,7 +61,7 @@
           <w:sz w:val="19"/>
           <w:szCs w:val="19"/>
         </w:rPr>
-        <w:t xml:space="preserve"> 2 × Arduino Nano 33 BLE Rev2 (BMI270), wired UART link   ·   </w:t>
+        <w:t xml:space="preserve"> 2 × Arduino Nano 33 BLE Rev2 (BMI270), wired UART link · </w:t>
       </w:r>
       <w:r>
         <w:rPr>
@@ -101,10 +101,40 @@
     </w:p>
     <w:p>
       <w:pPr>
+        <w:spacing w:after="120"/>
+      </w:pPr>
+      <w:r>
+        <w:rPr>
+          <w:color w:val="5A5A5A"/>
+          <w:sz w:val="19"/>
+          <w:szCs w:val="19"/>
+        </w:rPr>
+        <w:t xml:space="preserve">Detailed analysis, per-run tables and method notes are in </w:t>
+      </w:r>
+      <w:r>
+        <w:rPr>
+          <w:rFonts w:ascii="Consolas" w:cs="Consolas" w:eastAsia="Consolas" w:hAnsi="Consolas"/>
+          <w:color w:val="5A5A5A"/>
+          <w:sz w:val="19"/>
+          <w:szCs w:val="19"/>
+        </w:rPr>
+        <w:t xml:space="preserve">analysis/static_test/FINDINGS.md</w:t>
+      </w:r>
+      <w:r>
+        <w:rPr>
+          <w:color w:val="5A5A5A"/>
+          <w:sz w:val="19"/>
+          <w:szCs w:val="19"/>
+        </w:rPr>
+        <w:t xml:space="preserve"> in the project repository.</w:t>
+      </w:r>
+    </w:p>
+    <w:p>
+      <w:pPr>
         <w:pStyle w:val="Heading1"/>
       </w:pPr>
       <w:r>
-        <w:t xml:space="preserve">Summary</w:t>
+        <w:t xml:space="preserve">Purpose of this document</w:t>
       </w:r>
     </w:p>
     <w:p>
@@ -112,53 +142,15 @@
         <w:spacing w:after="120"/>
       </w:pPr>
       <w:r>
-        <w:t xml:space="preserve">With nothing moving, the goniometer's reading stays still. Jitter is about </w:t>
-      </w:r>
-      <w:r>
-        <w:rPr>
-          <w:b/>
-          <w:bCs/>
-        </w:rPr>
-        <w:t xml:space="preserve">0.01–0.02°</w:t>
-      </w:r>
-      <w:r>
-        <w:t xml:space="preserve">. On a stable setup the reading changed by </w:t>
-      </w:r>
-      <w:r>
-        <w:rPr>
-          <w:b/>
-          <w:bCs/>
-        </w:rPr>
-        <w:t xml:space="preserve">less than 0.1° over 5 minutes, and by about 0.06° over a full hour</w:t>
-      </w:r>
-      <w:r>
-        <w:t xml:space="preserve"> (drift −0.001 °/min).</w:t>
-      </w:r>
-    </w:p>
-    <w:p>
-      <w:pPr>
-        <w:spacing w:after="120"/>
-      </w:pPr>
-      <w:r>
-        <w:t xml:space="preserve">A preliminary check on 45° and 90° rigs read </w:t>
-      </w:r>
-      <w:r>
-        <w:rPr>
-          <w:b/>
-          <w:bCs/>
-        </w:rPr>
-        <w:t xml:space="preserve">45.0° and 89.0°</w:t>
-      </w:r>
-      <w:r>
-        <w:t xml:space="preserve">. That's within 1° of nominal, but the setup couldn't give a rigorous accuracy figure (see below).</w:t>
-      </w:r>
-    </w:p>
-    <w:p>
-      <w:pPr>
-        <w:spacing w:after="120"/>
-      </w:pPr>
-      <w:r>
-        <w:t xml:space="preserve">Testing also found three problems:</w:t>
+        <w:t xml:space="preserve">This document records the static testing of the dual-IMU goniometer prototype: what was tested, how, what the results showed, which problems turned up along the way and how they were addressed. It closes with conclusions and recommended next steps for anyone continuing the work.</w:t>
+      </w:r>
+    </w:p>
+    <w:p>
+      <w:pPr>
+        <w:pStyle w:val="Heading1"/>
+      </w:pPr>
+      <w:r>
+        <w:t xml:space="preserve">What we are testing</w:t>
       </w:r>
     </w:p>
     <w:p>
@@ -175,20 +167,10 @@
           <w:b/>
           <w:bCs/>
         </w:rPr>
-        <w:t xml:space="preserve">The sample rate was ~40 Hz, not 50 Hz,</w:t>
-      </w:r>
-      <w:r>
-        <w:t xml:space="preserve"> and ~20 % of CSV rows were duplicates. </w:t>
-      </w:r>
-      <w:r>
-        <w:rPr>
-          <w:b/>
-          <w:bCs/>
-        </w:rPr>
-        <w:t xml:space="preserve">Fixed and confirmed:</w:t>
-      </w:r>
-      <w:r>
-        <w:t xml:space="preserve"> true 50 Hz, 0 duplicate rows. The static results were unaffected.</w:t>
+        <w:t xml:space="preserve">Stability:</w:t>
+      </w:r>
+      <w:r>
+        <w:t xml:space="preserve"> if nothing moves, does the measured angle also stay unchanged? This covers short-term jitter, slow drift over minutes to an hour, and data quality over long sessions.</w:t>
       </w:r>
     </w:p>
     <w:p>
@@ -205,93 +187,10 @@
           <w:b/>
           <w:bCs/>
         </w:rPr>
-        <w:t xml:space="preserve">One board's sensor fails after 20–47 minutes of running.</w:t>
-      </w:r>
-      <w:r>
-        <w:t xml:space="preserve"> The fault followed that physical board when the boards swapped roles; the other board ran a full hour without a single bad reading. </w:t>
-      </w:r>
-      <w:r>
-        <w:rPr>
-          <w:b/>
-          <w:bCs/>
-        </w:rPr>
-        <w:t xml:space="preserve">Action: replace that board.</w:t>
-      </w:r>
-    </w:p>
-    <w:p>
-      <w:pPr>
-        <w:pStyle w:val="ListParagraph"/>
-        <w:numPr>
-          <w:ilvl w:val="0"/>
-          <w:numId w:val="2"/>
-        </w:numPr>
-        <w:spacing w:after="60"/>
-      </w:pPr>
-      <w:r>
-        <w:rPr>
-          <w:b/>
-          <w:bCs/>
-        </w:rPr>
-        <w:t xml:space="preserve">Only one node was exercised</w:t>
-      </w:r>
-      <w:r>
-        <w:t xml:space="preserve"> by these tests, because of how calibration works when one node never tilts.</w:t>
-      </w:r>
-    </w:p>
-    <w:p>
-      <w:pPr>
-        <w:pStyle w:val="Heading1"/>
-      </w:pPr>
-      <w:r>
-        <w:t xml:space="preserve">Purpose</w:t>
-      </w:r>
-    </w:p>
-    <w:p>
-      <w:pPr>
-        <w:pStyle w:val="ListParagraph"/>
-        <w:numPr>
-          <w:ilvl w:val="0"/>
-          <w:numId w:val="3"/>
-        </w:numPr>
-        <w:spacing w:after="60"/>
-      </w:pPr>
-      <w:r>
-        <w:rPr>
-          <w:b/>
-          <w:bCs/>
-        </w:rPr>
-        <w:t xml:space="preserve">Stability:</w:t>
-      </w:r>
-      <w:r>
-        <w:t xml:space="preserve"> if nothing moves, does the measured angle also stay unchanged?</w:t>
-      </w:r>
-    </w:p>
-    <w:p>
-      <w:pPr>
-        <w:pStyle w:val="ListParagraph"/>
-        <w:numPr>
-          <w:ilvl w:val="0"/>
-          <w:numId w:val="3"/>
-        </w:numPr>
-        <w:spacing w:after="60"/>
-      </w:pPr>
-      <w:r>
-        <w:rPr>
-          <w:b/>
-          <w:bCs/>
-        </w:rPr>
         <w:t xml:space="preserve">Preliminary angle check:</w:t>
       </w:r>
       <w:r>
-        <w:t xml:space="preserve"> do fixed 45° and 90° rigs read close to nominal?</w:t>
-      </w:r>
-    </w:p>
-    <w:p>
-      <w:pPr>
-        <w:spacing w:after="120" w:before="80"/>
-      </w:pPr>
-      <w:r>
-        <w:t xml:space="preserve">The rigs weren't precise enough for a formal accuracy figure, so that part is a preliminary inspection only.</w:t>
+        <w:t xml:space="preserve"> do fixed 45° and 90° rigs read close to nominal? The rigs weren't precise enough for a formal accuracy figure, so this part is a preliminary inspection only.</w:t>
       </w:r>
     </w:p>
     <w:p>
@@ -316,11 +215,11 @@
         <w:tblLayout w:type="fixed"/>
       </w:tblPr>
       <w:tblGrid>
-        <w:gridCol w:w="1527"/>
-        <w:gridCol w:w="1985"/>
-        <w:gridCol w:w="2443"/>
-        <w:gridCol w:w="1985"/>
-        <w:gridCol w:w="2140"/>
+        <w:gridCol w:w="840"/>
+        <w:gridCol w:w="1680"/>
+        <w:gridCol w:w="3528"/>
+        <w:gridCol w:w="1764"/>
+        <w:gridCol w:w="2268"/>
       </w:tblGrid>
       <w:tr>
         <w:trPr>
@@ -328,7 +227,7 @@
         </w:trPr>
         <w:tc>
           <w:tcPr>
-            <w:tcW w:type="dxa" w:w="1527"/>
+            <w:tcW w:type="dxa" w:w="840"/>
             <w:shd w:fill="DCE6F1" w:color="auto" w:val="clear"/>
             <w:tcMar>
               <w:top w:type="dxa" w:w="60"/>
@@ -341,7 +240,7 @@
         </w:tc>
         <w:tc>
           <w:tcPr>
-            <w:tcW w:type="dxa" w:w="1985"/>
+            <w:tcW w:type="dxa" w:w="1680"/>
             <w:shd w:fill="DCE6F1" w:color="auto" w:val="clear"/>
             <w:tcMar>
               <w:top w:type="dxa" w:w="60"/>
@@ -364,7 +263,7 @@
         </w:tc>
         <w:tc>
           <w:tcPr>
-            <w:tcW w:type="dxa" w:w="2443"/>
+            <w:tcW w:type="dxa" w:w="3528"/>
             <w:shd w:fill="DCE6F1" w:color="auto" w:val="clear"/>
             <w:tcMar>
               <w:top w:type="dxa" w:w="60"/>
@@ -387,7 +286,7 @@
         </w:tc>
         <w:tc>
           <w:tcPr>
-            <w:tcW w:type="dxa" w:w="1985"/>
+            <w:tcW w:type="dxa" w:w="1764"/>
             <w:shd w:fill="DCE6F1" w:color="auto" w:val="clear"/>
             <w:tcMar>
               <w:top w:type="dxa" w:w="60"/>
@@ -410,7 +309,7 @@
         </w:tc>
         <w:tc>
           <w:tcPr>
-            <w:tcW w:type="dxa" w:w="2140"/>
+            <w:tcW w:type="dxa" w:w="2268"/>
             <w:shd w:fill="DCE6F1" w:color="auto" w:val="clear"/>
             <w:tcMar>
               <w:top w:type="dxa" w:w="60"/>
@@ -438,7 +337,7 @@
         </w:trPr>
         <w:tc>
           <w:tcPr>
-            <w:tcW w:type="dxa" w:w="1527"/>
+            <w:tcW w:type="dxa" w:w="840"/>
             <w:tcMar>
               <w:top w:type="dxa" w:w="60"/>
               <w:left w:type="dxa" w:w="100"/>
@@ -458,7 +357,7 @@
         </w:tc>
         <w:tc>
           <w:tcPr>
-            <w:tcW w:type="dxa" w:w="1985"/>
+            <w:tcW w:type="dxa" w:w="1680"/>
             <w:tcMar>
               <w:top w:type="dxa" w:w="60"/>
               <w:left w:type="dxa" w:w="100"/>
@@ -478,7 +377,7 @@
         </w:tc>
         <w:tc>
           <w:tcPr>
-            <w:tcW w:type="dxa" w:w="2443"/>
+            <w:tcW w:type="dxa" w:w="3528"/>
             <w:tcMar>
               <w:top w:type="dxa" w:w="60"/>
               <w:left w:type="dxa" w:w="100"/>
@@ -498,7 +397,7 @@
         </w:tc>
         <w:tc>
           <w:tcPr>
-            <w:tcW w:type="dxa" w:w="1985"/>
+            <w:tcW w:type="dxa" w:w="1764"/>
             <w:tcMar>
               <w:top w:type="dxa" w:w="60"/>
               <w:left w:type="dxa" w:w="100"/>
@@ -518,7 +417,7 @@
         </w:tc>
         <w:tc>
           <w:tcPr>
-            <w:tcW w:type="dxa" w:w="2140"/>
+            <w:tcW w:type="dxa" w:w="2268"/>
             <w:tcMar>
               <w:top w:type="dxa" w:w="60"/>
               <w:left w:type="dxa" w:w="100"/>
@@ -543,7 +442,7 @@
         </w:trPr>
         <w:tc>
           <w:tcPr>
-            <w:tcW w:type="dxa" w:w="1527"/>
+            <w:tcW w:type="dxa" w:w="840"/>
             <w:tcMar>
               <w:top w:type="dxa" w:w="60"/>
               <w:left w:type="dxa" w:w="100"/>
@@ -563,7 +462,7 @@
         </w:tc>
         <w:tc>
           <w:tcPr>
-            <w:tcW w:type="dxa" w:w="1985"/>
+            <w:tcW w:type="dxa" w:w="1680"/>
             <w:tcMar>
               <w:top w:type="dxa" w:w="60"/>
               <w:left w:type="dxa" w:w="100"/>
@@ -583,7 +482,7 @@
         </w:tc>
         <w:tc>
           <w:tcPr>
-            <w:tcW w:type="dxa" w:w="2443"/>
+            <w:tcW w:type="dxa" w:w="3528"/>
             <w:tcMar>
               <w:top w:type="dxa" w:w="60"/>
               <w:left w:type="dxa" w:w="100"/>
@@ -603,7 +502,7 @@
         </w:tc>
         <w:tc>
           <w:tcPr>
-            <w:tcW w:type="dxa" w:w="1985"/>
+            <w:tcW w:type="dxa" w:w="1764"/>
             <w:tcMar>
               <w:top w:type="dxa" w:w="60"/>
               <w:left w:type="dxa" w:w="100"/>
@@ -623,7 +522,7 @@
         </w:tc>
         <w:tc>
           <w:tcPr>
-            <w:tcW w:type="dxa" w:w="2140"/>
+            <w:tcW w:type="dxa" w:w="2268"/>
             <w:tcMar>
               <w:top w:type="dxa" w:w="60"/>
               <w:left w:type="dxa" w:w="100"/>
@@ -648,7 +547,7 @@
         </w:trPr>
         <w:tc>
           <w:tcPr>
-            <w:tcW w:type="dxa" w:w="1527"/>
+            <w:tcW w:type="dxa" w:w="840"/>
             <w:tcMar>
               <w:top w:type="dxa" w:w="60"/>
               <w:left w:type="dxa" w:w="100"/>
@@ -668,7 +567,7 @@
         </w:tc>
         <w:tc>
           <w:tcPr>
-            <w:tcW w:type="dxa" w:w="1985"/>
+            <w:tcW w:type="dxa" w:w="1680"/>
             <w:tcMar>
               <w:top w:type="dxa" w:w="60"/>
               <w:left w:type="dxa" w:w="100"/>
@@ -688,7 +587,7 @@
         </w:tc>
         <w:tc>
           <w:tcPr>
-            <w:tcW w:type="dxa" w:w="2443"/>
+            <w:tcW w:type="dxa" w:w="3528"/>
             <w:tcMar>
               <w:top w:type="dxa" w:w="60"/>
               <w:left w:type="dxa" w:w="100"/>
@@ -708,7 +607,7 @@
         </w:tc>
         <w:tc>
           <w:tcPr>
-            <w:tcW w:type="dxa" w:w="1985"/>
+            <w:tcW w:type="dxa" w:w="1764"/>
             <w:tcMar>
               <w:top w:type="dxa" w:w="60"/>
               <w:left w:type="dxa" w:w="100"/>
@@ -728,7 +627,7 @@
         </w:tc>
         <w:tc>
           <w:tcPr>
-            <w:tcW w:type="dxa" w:w="2140"/>
+            <w:tcW w:type="dxa" w:w="2268"/>
             <w:tcMar>
               <w:top w:type="dxa" w:w="60"/>
               <w:left w:type="dxa" w:w="100"/>
@@ -753,7 +652,7 @@
         </w:trPr>
         <w:tc>
           <w:tcPr>
-            <w:tcW w:type="dxa" w:w="1527"/>
+            <w:tcW w:type="dxa" w:w="840"/>
             <w:tcMar>
               <w:top w:type="dxa" w:w="60"/>
               <w:left w:type="dxa" w:w="100"/>
@@ -773,7 +672,7 @@
         </w:tc>
         <w:tc>
           <w:tcPr>
-            <w:tcW w:type="dxa" w:w="1985"/>
+            <w:tcW w:type="dxa" w:w="1680"/>
             <w:tcMar>
               <w:top w:type="dxa" w:w="60"/>
               <w:left w:type="dxa" w:w="100"/>
@@ -793,7 +692,7 @@
         </w:tc>
         <w:tc>
           <w:tcPr>
-            <w:tcW w:type="dxa" w:w="2443"/>
+            <w:tcW w:type="dxa" w:w="3528"/>
             <w:tcMar>
               <w:top w:type="dxa" w:w="60"/>
               <w:left w:type="dxa" w:w="100"/>
@@ -813,7 +712,7 @@
         </w:tc>
         <w:tc>
           <w:tcPr>
-            <w:tcW w:type="dxa" w:w="1985"/>
+            <w:tcW w:type="dxa" w:w="1764"/>
             <w:tcMar>
               <w:top w:type="dxa" w:w="60"/>
               <w:left w:type="dxa" w:w="100"/>
@@ -833,7 +732,7 @@
         </w:tc>
         <w:tc>
           <w:tcPr>
-            <w:tcW w:type="dxa" w:w="2140"/>
+            <w:tcW w:type="dxa" w:w="2268"/>
             <w:tcMar>
               <w:top w:type="dxa" w:w="60"/>
               <w:left w:type="dxa" w:w="100"/>
@@ -868,7 +767,7 @@
     </w:p>
     <w:p>
       <w:pPr>
-        <w:spacing w:after="60"/>
+        <w:spacing w:after="120"/>
       </w:pPr>
       <w:r>
         <w:rPr>
@@ -883,7 +782,7 @@
         <w:pStyle w:val="ListParagraph"/>
         <w:numPr>
           <w:ilvl w:val="0"/>
-          <w:numId w:val="4"/>
+          <w:numId w:val="3"/>
         </w:numPr>
         <w:spacing w:after="60"/>
       </w:pPr>
@@ -903,7 +802,7 @@
         <w:pStyle w:val="ListParagraph"/>
         <w:numPr>
           <w:ilvl w:val="0"/>
-          <w:numId w:val="4"/>
+          <w:numId w:val="3"/>
         </w:numPr>
         <w:spacing w:after="60"/>
       </w:pPr>
@@ -923,7 +822,7 @@
         <w:pStyle w:val="ListParagraph"/>
         <w:numPr>
           <w:ilvl w:val="0"/>
-          <w:numId w:val="4"/>
+          <w:numId w:val="3"/>
         </w:numPr>
         <w:spacing w:after="60"/>
       </w:pPr>
@@ -940,7 +839,7 @@
     </w:p>
     <w:p>
       <w:pPr>
-        <w:spacing w:after="120" w:before="80"/>
+        <w:spacing w:after="120"/>
       </w:pPr>
       <w:r>
         <w:t xml:space="preserve">The first 20 s (calibration plus setting the node down) are excluded from the stability analysis.</w:t>
@@ -971,7 +870,7 @@
           <wp:inline distT="0" distB="0" distL="0" distR="0">
             <wp:extent cx="6400800" cy="2209800"/>
             <wp:effectExtent t="0" r="0" b="0" l="0"/>
-            <wp:docPr id="1" name="stability" descr="Session 1 runs stay within 0.06 degrees; session 2 runs creep 0.1 to 0.5 degrees, run 5 with two steps." title="Change in angle during each hold"/>
+            <wp:docPr id="1" name="figure" descr="Change in angle during each 5-minute hold" title="Change in angle during each 5-minute hold"/>
             <wp:cNvGraphicFramePr>
               <a:graphicFrameLocks xmlns:a="http://schemas.openxmlformats.org/drawingml/2006/main" noChangeAspect="1"/>
             </wp:cNvGraphicFramePr>
@@ -1009,15 +908,12 @@
     </w:p>
     <w:p>
       <w:pPr>
-        <w:spacing w:after="200"/>
+        <w:spacing w:after="120"/>
       </w:pPr>
       <w:r>
         <w:rPr>
           <w:i/>
           <w:iCs/>
-          <w:color w:val="5A5A5A"/>
-          <w:sz w:val="18"/>
-          <w:szCs w:val="18"/>
         </w:rPr>
         <w:t xml:space="preserve">Change in the measured angle during each hold (5 s rolling average), relative to the first 10 s of the hold.</w:t>
       </w:r>
@@ -1036,11 +932,11 @@
         <w:tblLayout w:type="fixed"/>
       </w:tblPr>
       <w:tblGrid>
-        <w:gridCol w:w="1600"/>
-        <w:gridCol w:w="1920"/>
-        <w:gridCol w:w="1760"/>
-        <w:gridCol w:w="2720"/>
-        <w:gridCol w:w="2080"/>
+        <w:gridCol w:w="1630"/>
+        <w:gridCol w:w="1927"/>
+        <w:gridCol w:w="1630"/>
+        <w:gridCol w:w="2964"/>
+        <w:gridCol w:w="1929"/>
       </w:tblGrid>
       <w:tr>
         <w:trPr>
@@ -1048,7 +944,7 @@
         </w:trPr>
         <w:tc>
           <w:tcPr>
-            <w:tcW w:type="dxa" w:w="1600"/>
+            <w:tcW w:type="dxa" w:w="1630"/>
             <w:shd w:fill="DCE6F1" w:color="auto" w:val="clear"/>
             <w:tcMar>
               <w:top w:type="dxa" w:w="60"/>
@@ -1071,7 +967,7 @@
         </w:tc>
         <w:tc>
           <w:tcPr>
-            <w:tcW w:type="dxa" w:w="1920"/>
+            <w:tcW w:type="dxa" w:w="1927"/>
             <w:shd w:fill="DCE6F1" w:color="auto" w:val="clear"/>
             <w:tcMar>
               <w:top w:type="dxa" w:w="60"/>
@@ -1094,7 +990,7 @@
         </w:tc>
         <w:tc>
           <w:tcPr>
-            <w:tcW w:type="dxa" w:w="1760"/>
+            <w:tcW w:type="dxa" w:w="1630"/>
             <w:shd w:fill="DCE6F1" w:color="auto" w:val="clear"/>
             <w:tcMar>
               <w:top w:type="dxa" w:w="60"/>
@@ -1117,7 +1013,7 @@
         </w:tc>
         <w:tc>
           <w:tcPr>
-            <w:tcW w:type="dxa" w:w="2720"/>
+            <w:tcW w:type="dxa" w:w="2964"/>
             <w:shd w:fill="DCE6F1" w:color="auto" w:val="clear"/>
             <w:tcMar>
               <w:top w:type="dxa" w:w="60"/>
@@ -1140,7 +1036,7 @@
         </w:tc>
         <w:tc>
           <w:tcPr>
-            <w:tcW w:type="dxa" w:w="2080"/>
+            <w:tcW w:type="dxa" w:w="1929"/>
             <w:shd w:fill="DCE6F1" w:color="auto" w:val="clear"/>
             <w:tcMar>
               <w:top w:type="dxa" w:w="60"/>
@@ -1168,7 +1064,7 @@
         </w:trPr>
         <w:tc>
           <w:tcPr>
-            <w:tcW w:type="dxa" w:w="1600"/>
+            <w:tcW w:type="dxa" w:w="1630"/>
             <w:tcMar>
               <w:top w:type="dxa" w:w="60"/>
               <w:left w:type="dxa" w:w="100"/>
@@ -1188,7 +1084,7 @@
         </w:tc>
         <w:tc>
           <w:tcPr>
-            <w:tcW w:type="dxa" w:w="1920"/>
+            <w:tcW w:type="dxa" w:w="1927"/>
             <w:tcMar>
               <w:top w:type="dxa" w:w="60"/>
               <w:left w:type="dxa" w:w="100"/>
@@ -1208,7 +1104,7 @@
         </w:tc>
         <w:tc>
           <w:tcPr>
-            <w:tcW w:type="dxa" w:w="1760"/>
+            <w:tcW w:type="dxa" w:w="1630"/>
             <w:tcMar>
               <w:top w:type="dxa" w:w="60"/>
               <w:left w:type="dxa" w:w="100"/>
@@ -1228,7 +1124,7 @@
         </w:tc>
         <w:tc>
           <w:tcPr>
-            <w:tcW w:type="dxa" w:w="2720"/>
+            <w:tcW w:type="dxa" w:w="2964"/>
             <w:tcMar>
               <w:top w:type="dxa" w:w="60"/>
               <w:left w:type="dxa" w:w="100"/>
@@ -1248,7 +1144,7 @@
         </w:tc>
         <w:tc>
           <w:tcPr>
-            <w:tcW w:type="dxa" w:w="2080"/>
+            <w:tcW w:type="dxa" w:w="1929"/>
             <w:tcMar>
               <w:top w:type="dxa" w:w="60"/>
               <w:left w:type="dxa" w:w="100"/>
@@ -1273,7 +1169,7 @@
         </w:trPr>
         <w:tc>
           <w:tcPr>
-            <w:tcW w:type="dxa" w:w="1600"/>
+            <w:tcW w:type="dxa" w:w="1630"/>
             <w:tcMar>
               <w:top w:type="dxa" w:w="60"/>
               <w:left w:type="dxa" w:w="100"/>
@@ -1293,7 +1189,7 @@
         </w:tc>
         <w:tc>
           <w:tcPr>
-            <w:tcW w:type="dxa" w:w="1920"/>
+            <w:tcW w:type="dxa" w:w="1927"/>
             <w:tcMar>
               <w:top w:type="dxa" w:w="60"/>
               <w:left w:type="dxa" w:w="100"/>
@@ -1313,7 +1209,7 @@
         </w:tc>
         <w:tc>
           <w:tcPr>
-            <w:tcW w:type="dxa" w:w="1760"/>
+            <w:tcW w:type="dxa" w:w="1630"/>
             <w:tcMar>
               <w:top w:type="dxa" w:w="60"/>
               <w:left w:type="dxa" w:w="100"/>
@@ -1333,7 +1229,7 @@
         </w:tc>
         <w:tc>
           <w:tcPr>
-            <w:tcW w:type="dxa" w:w="2720"/>
+            <w:tcW w:type="dxa" w:w="2964"/>
             <w:tcMar>
               <w:top w:type="dxa" w:w="60"/>
               <w:left w:type="dxa" w:w="100"/>
@@ -1353,7 +1249,7 @@
         </w:tc>
         <w:tc>
           <w:tcPr>
-            <w:tcW w:type="dxa" w:w="2080"/>
+            <w:tcW w:type="dxa" w:w="1929"/>
             <w:tcMar>
               <w:top w:type="dxa" w:w="60"/>
               <w:left w:type="dxa" w:w="100"/>
@@ -1378,7 +1274,7 @@
         </w:trPr>
         <w:tc>
           <w:tcPr>
-            <w:tcW w:type="dxa" w:w="1600"/>
+            <w:tcW w:type="dxa" w:w="1630"/>
             <w:tcMar>
               <w:top w:type="dxa" w:w="60"/>
               <w:left w:type="dxa" w:w="100"/>
@@ -1398,7 +1294,7 @@
         </w:tc>
         <w:tc>
           <w:tcPr>
-            <w:tcW w:type="dxa" w:w="1920"/>
+            <w:tcW w:type="dxa" w:w="1927"/>
             <w:tcMar>
               <w:top w:type="dxa" w:w="60"/>
               <w:left w:type="dxa" w:w="100"/>
@@ -1418,7 +1314,7 @@
         </w:tc>
         <w:tc>
           <w:tcPr>
-            <w:tcW w:type="dxa" w:w="1760"/>
+            <w:tcW w:type="dxa" w:w="1630"/>
             <w:tcMar>
               <w:top w:type="dxa" w:w="60"/>
               <w:left w:type="dxa" w:w="100"/>
@@ -1438,7 +1334,7 @@
         </w:tc>
         <w:tc>
           <w:tcPr>
-            <w:tcW w:type="dxa" w:w="2720"/>
+            <w:tcW w:type="dxa" w:w="2964"/>
             <w:tcMar>
               <w:top w:type="dxa" w:w="60"/>
               <w:left w:type="dxa" w:w="100"/>
@@ -1458,7 +1354,7 @@
         </w:tc>
         <w:tc>
           <w:tcPr>
-            <w:tcW w:type="dxa" w:w="2080"/>
+            <w:tcW w:type="dxa" w:w="1929"/>
             <w:tcMar>
               <w:top w:type="dxa" w:w="60"/>
               <w:left w:type="dxa" w:w="100"/>
@@ -1483,7 +1379,7 @@
         </w:trPr>
         <w:tc>
           <w:tcPr>
-            <w:tcW w:type="dxa" w:w="1600"/>
+            <w:tcW w:type="dxa" w:w="1630"/>
             <w:tcMar>
               <w:top w:type="dxa" w:w="60"/>
               <w:left w:type="dxa" w:w="100"/>
@@ -1503,7 +1399,7 @@
         </w:tc>
         <w:tc>
           <w:tcPr>
-            <w:tcW w:type="dxa" w:w="1920"/>
+            <w:tcW w:type="dxa" w:w="1927"/>
             <w:tcMar>
               <w:top w:type="dxa" w:w="60"/>
               <w:left w:type="dxa" w:w="100"/>
@@ -1523,27 +1419,27 @@
         </w:tc>
         <w:tc>
           <w:tcPr>
-            <w:tcW w:type="dxa" w:w="1760"/>
-            <w:tcMar>
-              <w:top w:type="dxa" w:w="60"/>
-              <w:left w:type="dxa" w:w="100"/>
-              <w:bottom w:type="dxa" w:w="60"/>
-              <w:right w:type="dxa" w:w="100"/>
-            </w:tcMar>
-          </w:tcPr>
-          <w:p>
-            <w:r>
-              <w:rPr>
-                <w:sz w:val="19"/>
-                <w:szCs w:val="19"/>
-              </w:rPr>
-              <w:t xml:space="preserve">0.016°*</w:t>
-            </w:r>
-          </w:p>
-        </w:tc>
-        <w:tc>
-          <w:tcPr>
-            <w:tcW w:type="dxa" w:w="2720"/>
+            <w:tcW w:type="dxa" w:w="1630"/>
+            <w:tcMar>
+              <w:top w:type="dxa" w:w="60"/>
+              <w:left w:type="dxa" w:w="100"/>
+              <w:bottom w:type="dxa" w:w="60"/>
+              <w:right w:type="dxa" w:w="100"/>
+            </w:tcMar>
+          </w:tcPr>
+          <w:p>
+            <w:r>
+              <w:rPr>
+                <w:sz w:val="19"/>
+                <w:szCs w:val="19"/>
+              </w:rPr>
+              <w:t xml:space="preserve">0.016°∗</w:t>
+            </w:r>
+          </w:p>
+        </w:tc>
+        <w:tc>
+          <w:tcPr>
+            <w:tcW w:type="dxa" w:w="2964"/>
             <w:tcMar>
               <w:top w:type="dxa" w:w="60"/>
               <w:left w:type="dxa" w:w="100"/>
@@ -1563,7 +1459,7 @@
         </w:tc>
         <w:tc>
           <w:tcPr>
-            <w:tcW w:type="dxa" w:w="2080"/>
+            <w:tcW w:type="dxa" w:w="1929"/>
             <w:tcMar>
               <w:top w:type="dxa" w:w="60"/>
               <w:left w:type="dxa" w:w="100"/>
@@ -1588,7 +1484,7 @@
         </w:trPr>
         <w:tc>
           <w:tcPr>
-            <w:tcW w:type="dxa" w:w="1600"/>
+            <w:tcW w:type="dxa" w:w="1630"/>
             <w:tcMar>
               <w:top w:type="dxa" w:w="60"/>
               <w:left w:type="dxa" w:w="100"/>
@@ -1608,7 +1504,7 @@
         </w:tc>
         <w:tc>
           <w:tcPr>
-            <w:tcW w:type="dxa" w:w="1920"/>
+            <w:tcW w:type="dxa" w:w="1927"/>
             <w:tcMar>
               <w:top w:type="dxa" w:w="60"/>
               <w:left w:type="dxa" w:w="100"/>
@@ -1628,27 +1524,27 @@
         </w:tc>
         <w:tc>
           <w:tcPr>
-            <w:tcW w:type="dxa" w:w="1760"/>
-            <w:tcMar>
-              <w:top w:type="dxa" w:w="60"/>
-              <w:left w:type="dxa" w:w="100"/>
-              <w:bottom w:type="dxa" w:w="60"/>
-              <w:right w:type="dxa" w:w="100"/>
-            </w:tcMar>
-          </w:tcPr>
-          <w:p>
-            <w:r>
-              <w:rPr>
-                <w:sz w:val="19"/>
-                <w:szCs w:val="19"/>
-              </w:rPr>
-              <w:t xml:space="preserve">0.047°*</w:t>
-            </w:r>
-          </w:p>
-        </w:tc>
-        <w:tc>
-          <w:tcPr>
-            <w:tcW w:type="dxa" w:w="2720"/>
+            <w:tcW w:type="dxa" w:w="1630"/>
+            <w:tcMar>
+              <w:top w:type="dxa" w:w="60"/>
+              <w:left w:type="dxa" w:w="100"/>
+              <w:bottom w:type="dxa" w:w="60"/>
+              <w:right w:type="dxa" w:w="100"/>
+            </w:tcMar>
+          </w:tcPr>
+          <w:p>
+            <w:r>
+              <w:rPr>
+                <w:sz w:val="19"/>
+                <w:szCs w:val="19"/>
+              </w:rPr>
+              <w:t xml:space="preserve">0.047°∗</w:t>
+            </w:r>
+          </w:p>
+        </w:tc>
+        <w:tc>
+          <w:tcPr>
+            <w:tcW w:type="dxa" w:w="2964"/>
             <w:tcMar>
               <w:top w:type="dxa" w:w="60"/>
               <w:left w:type="dxa" w:w="100"/>
@@ -1668,7 +1564,7 @@
         </w:tc>
         <w:tc>
           <w:tcPr>
-            <w:tcW w:type="dxa" w:w="2080"/>
+            <w:tcW w:type="dxa" w:w="1929"/>
             <w:tcMar>
               <w:top w:type="dxa" w:w="60"/>
               <w:left w:type="dxa" w:w="100"/>
@@ -1693,7 +1589,7 @@
         </w:trPr>
         <w:tc>
           <w:tcPr>
-            <w:tcW w:type="dxa" w:w="1600"/>
+            <w:tcW w:type="dxa" w:w="1630"/>
             <w:tcMar>
               <w:top w:type="dxa" w:w="60"/>
               <w:left w:type="dxa" w:w="100"/>
@@ -1713,7 +1609,7 @@
         </w:tc>
         <w:tc>
           <w:tcPr>
-            <w:tcW w:type="dxa" w:w="1920"/>
+            <w:tcW w:type="dxa" w:w="1927"/>
             <w:tcMar>
               <w:top w:type="dxa" w:w="60"/>
               <w:left w:type="dxa" w:w="100"/>
@@ -1733,27 +1629,27 @@
         </w:tc>
         <w:tc>
           <w:tcPr>
-            <w:tcW w:type="dxa" w:w="1760"/>
-            <w:tcMar>
-              <w:top w:type="dxa" w:w="60"/>
-              <w:left w:type="dxa" w:w="100"/>
-              <w:bottom w:type="dxa" w:w="60"/>
-              <w:right w:type="dxa" w:w="100"/>
-            </w:tcMar>
-          </w:tcPr>
-          <w:p>
-            <w:r>
-              <w:rPr>
-                <w:sz w:val="19"/>
-                <w:szCs w:val="19"/>
-              </w:rPr>
-              <w:t xml:space="preserve">0.012°*</w:t>
-            </w:r>
-          </w:p>
-        </w:tc>
-        <w:tc>
-          <w:tcPr>
-            <w:tcW w:type="dxa" w:w="2720"/>
+            <w:tcW w:type="dxa" w:w="1630"/>
+            <w:tcMar>
+              <w:top w:type="dxa" w:w="60"/>
+              <w:left w:type="dxa" w:w="100"/>
+              <w:bottom w:type="dxa" w:w="60"/>
+              <w:right w:type="dxa" w:w="100"/>
+            </w:tcMar>
+          </w:tcPr>
+          <w:p>
+            <w:r>
+              <w:rPr>
+                <w:sz w:val="19"/>
+                <w:szCs w:val="19"/>
+              </w:rPr>
+              <w:t xml:space="preserve">0.012°∗</w:t>
+            </w:r>
+          </w:p>
+        </w:tc>
+        <w:tc>
+          <w:tcPr>
+            <w:tcW w:type="dxa" w:w="2964"/>
             <w:tcMar>
               <w:top w:type="dxa" w:w="60"/>
               <w:left w:type="dxa" w:w="100"/>
@@ -1773,7 +1669,7 @@
         </w:tc>
         <w:tc>
           <w:tcPr>
-            <w:tcW w:type="dxa" w:w="2080"/>
+            <w:tcW w:type="dxa" w:w="1929"/>
             <w:tcMar>
               <w:top w:type="dxa" w:w="60"/>
               <w:left w:type="dxa" w:w="100"/>
@@ -1798,7 +1694,7 @@
         </w:trPr>
         <w:tc>
           <w:tcPr>
-            <w:tcW w:type="dxa" w:w="1600"/>
+            <w:tcW w:type="dxa" w:w="1630"/>
             <w:tcMar>
               <w:top w:type="dxa" w:w="60"/>
               <w:left w:type="dxa" w:w="100"/>
@@ -1818,7 +1714,7 @@
         </w:tc>
         <w:tc>
           <w:tcPr>
-            <w:tcW w:type="dxa" w:w="1920"/>
+            <w:tcW w:type="dxa" w:w="1927"/>
             <w:tcMar>
               <w:top w:type="dxa" w:w="60"/>
               <w:left w:type="dxa" w:w="100"/>
@@ -1838,7 +1734,7 @@
         </w:tc>
         <w:tc>
           <w:tcPr>
-            <w:tcW w:type="dxa" w:w="1760"/>
+            <w:tcW w:type="dxa" w:w="1630"/>
             <w:tcMar>
               <w:top w:type="dxa" w:w="60"/>
               <w:left w:type="dxa" w:w="100"/>
@@ -1858,7 +1754,7 @@
         </w:tc>
         <w:tc>
           <w:tcPr>
-            <w:tcW w:type="dxa" w:w="2720"/>
+            <w:tcW w:type="dxa" w:w="2964"/>
             <w:tcMar>
               <w:top w:type="dxa" w:w="60"/>
               <w:left w:type="dxa" w:w="100"/>
@@ -1878,7 +1774,7 @@
         </w:tc>
         <w:tc>
           <w:tcPr>
-            <w:tcW w:type="dxa" w:w="2080"/>
+            <w:tcW w:type="dxa" w:w="1929"/>
             <w:tcMar>
               <w:top w:type="dxa" w:w="60"/>
               <w:left w:type="dxa" w:w="100"/>
@@ -1898,6 +1794,11 @@
         </w:tc>
       </w:tr>
     </w:tbl>
+    <w:p>
+      <w:pPr>
+        <w:spacing w:after="120"/>
+      </w:pPr>
+    </w:p>
     <w:p>
       <w:pPr>
         <w:spacing w:after="200"/>
@@ -1910,7 +1811,7 @@
           <w:sz w:val="18"/>
           <w:szCs w:val="18"/>
         </w:rPr>
-        <w:t xml:space="preserve">*Session 2 SD with the slow trend removed, so it measures jitter rather than the creep.</w:t>
+        <w:t xml:space="preserve">∗Session 2 SD with the slow trend removed, so it measures jitter rather than the creep.</w:t>
       </w:r>
     </w:p>
     <w:p>
@@ -1918,7 +1819,7 @@
         <w:pStyle w:val="ListParagraph"/>
         <w:numPr>
           <w:ilvl w:val="0"/>
-          <w:numId w:val="3"/>
+          <w:numId w:val="2"/>
         </w:numPr>
         <w:spacing w:after="60"/>
       </w:pPr>
@@ -1938,7 +1839,7 @@
         <w:pStyle w:val="ListParagraph"/>
         <w:numPr>
           <w:ilvl w:val="0"/>
-          <w:numId w:val="3"/>
+          <w:numId w:val="2"/>
         </w:numPr>
         <w:spacing w:after="60"/>
       </w:pPr>
@@ -1958,7 +1859,7 @@
         <w:pStyle w:val="ListParagraph"/>
         <w:numPr>
           <w:ilvl w:val="0"/>
-          <w:numId w:val="3"/>
+          <w:numId w:val="2"/>
         </w:numPr>
         <w:spacing w:after="60"/>
       </w:pPr>
@@ -1978,7 +1879,7 @@
         <w:pStyle w:val="ListParagraph"/>
         <w:numPr>
           <w:ilvl w:val="0"/>
-          <w:numId w:val="3"/>
+          <w:numId w:val="2"/>
         </w:numPr>
         <w:spacing w:after="60"/>
       </w:pPr>
@@ -2023,9 +1924,9 @@
         <w:tblLayout w:type="fixed"/>
       </w:tblPr>
       <w:tblGrid>
-        <w:gridCol w:w="3136"/>
-        <w:gridCol w:w="2912"/>
-        <w:gridCol w:w="4032"/>
+        <w:gridCol w:w="3423"/>
+        <w:gridCol w:w="2282"/>
+        <w:gridCol w:w="4375"/>
       </w:tblGrid>
       <w:tr>
         <w:trPr>
@@ -2033,7 +1934,7 @@
         </w:trPr>
         <w:tc>
           <w:tcPr>
-            <w:tcW w:type="dxa" w:w="3136"/>
+            <w:tcW w:type="dxa" w:w="3423"/>
             <w:shd w:fill="DCE6F1" w:color="auto" w:val="clear"/>
             <w:tcMar>
               <w:top w:type="dxa" w:w="60"/>
@@ -2056,7 +1957,7 @@
         </w:tc>
         <w:tc>
           <w:tcPr>
-            <w:tcW w:type="dxa" w:w="2912"/>
+            <w:tcW w:type="dxa" w:w="2282"/>
             <w:shd w:fill="DCE6F1" w:color="auto" w:val="clear"/>
             <w:tcMar>
               <w:top w:type="dxa" w:w="60"/>
@@ -2079,7 +1980,7 @@
         </w:tc>
         <w:tc>
           <w:tcPr>
-            <w:tcW w:type="dxa" w:w="4032"/>
+            <w:tcW w:type="dxa" w:w="4375"/>
             <w:shd w:fill="DCE6F1" w:color="auto" w:val="clear"/>
             <w:tcMar>
               <w:top w:type="dxa" w:w="60"/>
@@ -2107,7 +2008,7 @@
         </w:trPr>
         <w:tc>
           <w:tcPr>
-            <w:tcW w:type="dxa" w:w="3136"/>
+            <w:tcW w:type="dxa" w:w="3423"/>
             <w:tcMar>
               <w:top w:type="dxa" w:w="60"/>
               <w:left w:type="dxa" w:w="100"/>
@@ -2127,7 +2028,7 @@
         </w:tc>
         <w:tc>
           <w:tcPr>
-            <w:tcW w:type="dxa" w:w="2912"/>
+            <w:tcW w:type="dxa" w:w="2282"/>
             <w:tcMar>
               <w:top w:type="dxa" w:w="60"/>
               <w:left w:type="dxa" w:w="100"/>
@@ -2147,7 +2048,7 @@
         </w:tc>
         <w:tc>
           <w:tcPr>
-            <w:tcW w:type="dxa" w:w="4032"/>
+            <w:tcW w:type="dxa" w:w="4375"/>
             <w:tcMar>
               <w:top w:type="dxa" w:w="60"/>
               <w:left w:type="dxa" w:w="100"/>
@@ -2172,7 +2073,7 @@
         </w:trPr>
         <w:tc>
           <w:tcPr>
-            <w:tcW w:type="dxa" w:w="3136"/>
+            <w:tcW w:type="dxa" w:w="3423"/>
             <w:tcMar>
               <w:top w:type="dxa" w:w="60"/>
               <w:left w:type="dxa" w:w="100"/>
@@ -2192,7 +2093,7 @@
         </w:tc>
         <w:tc>
           <w:tcPr>
-            <w:tcW w:type="dxa" w:w="2912"/>
+            <w:tcW w:type="dxa" w:w="2282"/>
             <w:tcMar>
               <w:top w:type="dxa" w:w="60"/>
               <w:left w:type="dxa" w:w="100"/>
@@ -2212,7 +2113,7 @@
         </w:tc>
         <w:tc>
           <w:tcPr>
-            <w:tcW w:type="dxa" w:w="4032"/>
+            <w:tcW w:type="dxa" w:w="4375"/>
             <w:tcMar>
               <w:top w:type="dxa" w:w="60"/>
               <w:left w:type="dxa" w:w="100"/>
@@ -2237,7 +2138,7 @@
         </w:trPr>
         <w:tc>
           <w:tcPr>
-            <w:tcW w:type="dxa" w:w="3136"/>
+            <w:tcW w:type="dxa" w:w="3423"/>
             <w:tcMar>
               <w:top w:type="dxa" w:w="60"/>
               <w:left w:type="dxa" w:w="100"/>
@@ -2257,7 +2158,7 @@
         </w:tc>
         <w:tc>
           <w:tcPr>
-            <w:tcW w:type="dxa" w:w="2912"/>
+            <w:tcW w:type="dxa" w:w="2282"/>
             <w:tcMar>
               <w:top w:type="dxa" w:w="60"/>
               <w:left w:type="dxa" w:w="100"/>
@@ -2277,7 +2178,7 @@
         </w:tc>
         <w:tc>
           <w:tcPr>
-            <w:tcW w:type="dxa" w:w="4032"/>
+            <w:tcW w:type="dxa" w:w="4375"/>
             <w:tcMar>
               <w:top w:type="dxa" w:w="60"/>
               <w:left w:type="dxa" w:w="100"/>
@@ -2332,11 +2233,11 @@
         <w:tblLayout w:type="fixed"/>
       </w:tblPr>
       <w:tblGrid>
-        <w:gridCol w:w="1138"/>
-        <w:gridCol w:w="2438"/>
-        <w:gridCol w:w="2113"/>
-        <w:gridCol w:w="1788"/>
-        <w:gridCol w:w="2603"/>
+        <w:gridCol w:w="1008"/>
+        <w:gridCol w:w="2646"/>
+        <w:gridCol w:w="2142"/>
+        <w:gridCol w:w="1386"/>
+        <w:gridCol w:w="2898"/>
       </w:tblGrid>
       <w:tr>
         <w:trPr>
@@ -2344,7 +2245,7 @@
         </w:trPr>
         <w:tc>
           <w:tcPr>
-            <w:tcW w:type="dxa" w:w="1138"/>
+            <w:tcW w:type="dxa" w:w="1008"/>
             <w:shd w:fill="DCE6F1" w:color="auto" w:val="clear"/>
             <w:tcMar>
               <w:top w:type="dxa" w:w="60"/>
@@ -2367,7 +2268,7 @@
         </w:tc>
         <w:tc>
           <w:tcPr>
-            <w:tcW w:type="dxa" w:w="2438"/>
+            <w:tcW w:type="dxa" w:w="2646"/>
             <w:shd w:fill="DCE6F1" w:color="auto" w:val="clear"/>
             <w:tcMar>
               <w:top w:type="dxa" w:w="60"/>
@@ -2390,7 +2291,7 @@
         </w:tc>
         <w:tc>
           <w:tcPr>
-            <w:tcW w:type="dxa" w:w="2113"/>
+            <w:tcW w:type="dxa" w:w="2142"/>
             <w:shd w:fill="DCE6F1" w:color="auto" w:val="clear"/>
             <w:tcMar>
               <w:top w:type="dxa" w:w="60"/>
@@ -2413,7 +2314,7 @@
         </w:tc>
         <w:tc>
           <w:tcPr>
-            <w:tcW w:type="dxa" w:w="1788"/>
+            <w:tcW w:type="dxa" w:w="1386"/>
             <w:shd w:fill="DCE6F1" w:color="auto" w:val="clear"/>
             <w:tcMar>
               <w:top w:type="dxa" w:w="60"/>
@@ -2436,7 +2337,7 @@
         </w:tc>
         <w:tc>
           <w:tcPr>
-            <w:tcW w:type="dxa" w:w="2603"/>
+            <w:tcW w:type="dxa" w:w="2898"/>
             <w:shd w:fill="DCE6F1" w:color="auto" w:val="clear"/>
             <w:tcMar>
               <w:top w:type="dxa" w:w="60"/>
@@ -2464,7 +2365,7 @@
         </w:trPr>
         <w:tc>
           <w:tcPr>
-            <w:tcW w:type="dxa" w:w="1138"/>
+            <w:tcW w:type="dxa" w:w="1008"/>
             <w:tcMar>
               <w:top w:type="dxa" w:w="60"/>
               <w:left w:type="dxa" w:w="100"/>
@@ -2484,7 +2385,7 @@
         </w:tc>
         <w:tc>
           <w:tcPr>
-            <w:tcW w:type="dxa" w:w="2438"/>
+            <w:tcW w:type="dxa" w:w="2646"/>
             <w:tcMar>
               <w:top w:type="dxa" w:w="60"/>
               <w:left w:type="dxa" w:w="100"/>
@@ -2504,7 +2405,7 @@
         </w:tc>
         <w:tc>
           <w:tcPr>
-            <w:tcW w:type="dxa" w:w="2113"/>
+            <w:tcW w:type="dxa" w:w="2142"/>
             <w:tcMar>
               <w:top w:type="dxa" w:w="60"/>
               <w:left w:type="dxa" w:w="100"/>
@@ -2524,7 +2425,7 @@
         </w:tc>
         <w:tc>
           <w:tcPr>
-            <w:tcW w:type="dxa" w:w="1788"/>
+            <w:tcW w:type="dxa" w:w="1386"/>
             <w:tcMar>
               <w:top w:type="dxa" w:w="60"/>
               <w:left w:type="dxa" w:w="100"/>
@@ -2544,7 +2445,7 @@
         </w:tc>
         <w:tc>
           <w:tcPr>
-            <w:tcW w:type="dxa" w:w="2603"/>
+            <w:tcW w:type="dxa" w:w="2898"/>
             <w:tcMar>
               <w:top w:type="dxa" w:w="60"/>
               <w:left w:type="dxa" w:w="100"/>
@@ -2569,7 +2470,7 @@
         </w:trPr>
         <w:tc>
           <w:tcPr>
-            <w:tcW w:type="dxa" w:w="1138"/>
+            <w:tcW w:type="dxa" w:w="1008"/>
             <w:tcMar>
               <w:top w:type="dxa" w:w="60"/>
               <w:left w:type="dxa" w:w="100"/>
@@ -2589,7 +2490,7 @@
         </w:tc>
         <w:tc>
           <w:tcPr>
-            <w:tcW w:type="dxa" w:w="2438"/>
+            <w:tcW w:type="dxa" w:w="2646"/>
             <w:tcMar>
               <w:top w:type="dxa" w:w="60"/>
               <w:left w:type="dxa" w:w="100"/>
@@ -2609,7 +2510,7 @@
         </w:tc>
         <w:tc>
           <w:tcPr>
-            <w:tcW w:type="dxa" w:w="2113"/>
+            <w:tcW w:type="dxa" w:w="2142"/>
             <w:tcMar>
               <w:top w:type="dxa" w:w="60"/>
               <w:left w:type="dxa" w:w="100"/>
@@ -2629,7 +2530,7 @@
         </w:tc>
         <w:tc>
           <w:tcPr>
-            <w:tcW w:type="dxa" w:w="1788"/>
+            <w:tcW w:type="dxa" w:w="1386"/>
             <w:tcMar>
               <w:top w:type="dxa" w:w="60"/>
               <w:left w:type="dxa" w:w="100"/>
@@ -2649,7 +2550,7 @@
         </w:tc>
         <w:tc>
           <w:tcPr>
-            <w:tcW w:type="dxa" w:w="2603"/>
+            <w:tcW w:type="dxa" w:w="2898"/>
             <w:tcMar>
               <w:top w:type="dxa" w:w="60"/>
               <w:left w:type="dxa" w:w="100"/>
@@ -2671,16 +2572,14 @@
     </w:tbl>
     <w:p>
       <w:pPr>
-        <w:spacing w:after="200"/>
-      </w:pPr>
-      <w:r>
-        <w:rPr>
-          <w:i/>
-          <w:iCs/>
-          <w:color w:val="5A5A5A"/>
-          <w:sz w:val="18"/>
-          <w:szCs w:val="18"/>
-        </w:rPr>
+        <w:spacing w:after="120"/>
+      </w:pPr>
+    </w:p>
+    <w:p>
+      <w:pPr>
+        <w:spacing w:after="120"/>
+      </w:pPr>
+      <w:r>
         <w:t xml:space="preserve">The GUI shows these as negative angles because of the bending direction the calibration learned.</w:t>
       </w:r>
     </w:p>
@@ -2689,7 +2588,7 @@
         <w:pStyle w:val="ListParagraph"/>
         <w:numPr>
           <w:ilvl w:val="0"/>
-          <w:numId w:val="3"/>
+          <w:numId w:val="2"/>
         </w:numPr>
         <w:spacing w:after="60"/>
       </w:pPr>
@@ -2709,7 +2608,7 @@
         <w:pStyle w:val="ListParagraph"/>
         <w:numPr>
           <w:ilvl w:val="0"/>
-          <w:numId w:val="3"/>
+          <w:numId w:val="2"/>
         </w:numPr>
         <w:spacing w:after="60"/>
       </w:pPr>
@@ -2726,7 +2625,7 @@
         <w:pStyle w:val="ListParagraph"/>
         <w:numPr>
           <w:ilvl w:val="1"/>
-          <w:numId w:val="3"/>
+          <w:numId w:val="2"/>
         </w:numPr>
         <w:spacing w:after="60"/>
       </w:pPr>
@@ -2743,7 +2642,7 @@
         <w:pStyle w:val="ListParagraph"/>
         <w:numPr>
           <w:ilvl w:val="1"/>
-          <w:numId w:val="3"/>
+          <w:numId w:val="2"/>
         </w:numPr>
         <w:spacing w:after="60"/>
       </w:pPr>
@@ -2763,7 +2662,7 @@
         <w:pStyle w:val="ListParagraph"/>
         <w:numPr>
           <w:ilvl w:val="1"/>
-          <w:numId w:val="3"/>
+          <w:numId w:val="2"/>
         </w:numPr>
         <w:spacing w:after="60"/>
       </w:pPr>
@@ -2784,7 +2683,7 @@
         <w:pStyle w:val="ListParagraph"/>
         <w:numPr>
           <w:ilvl w:val="0"/>
-          <w:numId w:val="3"/>
+          <w:numId w:val="2"/>
         </w:numPr>
         <w:spacing w:after="60"/>
       </w:pPr>
@@ -2804,7 +2703,7 @@
         <w:pStyle w:val="ListParagraph"/>
         <w:numPr>
           <w:ilvl w:val="0"/>
-          <w:numId w:val="3"/>
+          <w:numId w:val="2"/>
         </w:numPr>
         <w:spacing w:after="60"/>
       </w:pPr>
@@ -2824,7 +2723,7 @@
         <w:pStyle w:val="ListParagraph"/>
         <w:numPr>
           <w:ilvl w:val="0"/>
-          <w:numId w:val="3"/>
+          <w:numId w:val="2"/>
         </w:numPr>
         <w:spacing w:after="60"/>
       </w:pPr>
@@ -2869,9 +2768,9 @@
         <w:tblLayout w:type="fixed"/>
       </w:tblPr>
       <w:tblGrid>
-        <w:gridCol w:w="4032"/>
-        <w:gridCol w:w="3225"/>
-        <w:gridCol w:w="2823"/>
+        <w:gridCol w:w="4209"/>
+        <w:gridCol w:w="3323"/>
+        <w:gridCol w:w="2548"/>
       </w:tblGrid>
       <w:tr>
         <w:trPr>
@@ -2879,7 +2778,7 @@
         </w:trPr>
         <w:tc>
           <w:tcPr>
-            <w:tcW w:type="dxa" w:w="4032"/>
+            <w:tcW w:type="dxa" w:w="4209"/>
             <w:shd w:fill="DCE6F1" w:color="auto" w:val="clear"/>
             <w:tcMar>
               <w:top w:type="dxa" w:w="60"/>
@@ -2892,7 +2791,7 @@
         </w:tc>
         <w:tc>
           <w:tcPr>
-            <w:tcW w:type="dxa" w:w="3225"/>
+            <w:tcW w:type="dxa" w:w="3323"/>
             <w:shd w:fill="DCE6F1" w:color="auto" w:val="clear"/>
             <w:tcMar>
               <w:top w:type="dxa" w:w="60"/>
@@ -2915,7 +2814,7 @@
         </w:tc>
         <w:tc>
           <w:tcPr>
-            <w:tcW w:type="dxa" w:w="2823"/>
+            <w:tcW w:type="dxa" w:w="2548"/>
             <w:shd w:fill="DCE6F1" w:color="auto" w:val="clear"/>
             <w:tcMar>
               <w:top w:type="dxa" w:w="60"/>
@@ -2943,7 +2842,7 @@
         </w:trPr>
         <w:tc>
           <w:tcPr>
-            <w:tcW w:type="dxa" w:w="4032"/>
+            <w:tcW w:type="dxa" w:w="4209"/>
             <w:tcMar>
               <w:top w:type="dxa" w:w="60"/>
               <w:left w:type="dxa" w:w="100"/>
@@ -2963,7 +2862,7 @@
         </w:tc>
         <w:tc>
           <w:tcPr>
-            <w:tcW w:type="dxa" w:w="3225"/>
+            <w:tcW w:type="dxa" w:w="3323"/>
             <w:tcMar>
               <w:top w:type="dxa" w:w="60"/>
               <w:left w:type="dxa" w:w="100"/>
@@ -2983,7 +2882,7 @@
         </w:tc>
         <w:tc>
           <w:tcPr>
-            <w:tcW w:type="dxa" w:w="2823"/>
+            <w:tcW w:type="dxa" w:w="2548"/>
             <w:tcMar>
               <w:top w:type="dxa" w:w="60"/>
               <w:left w:type="dxa" w:w="100"/>
@@ -3008,7 +2907,7 @@
         </w:trPr>
         <w:tc>
           <w:tcPr>
-            <w:tcW w:type="dxa" w:w="4032"/>
+            <w:tcW w:type="dxa" w:w="4209"/>
             <w:tcMar>
               <w:top w:type="dxa" w:w="60"/>
               <w:left w:type="dxa" w:w="100"/>
@@ -3028,7 +2927,7 @@
         </w:tc>
         <w:tc>
           <w:tcPr>
-            <w:tcW w:type="dxa" w:w="3225"/>
+            <w:tcW w:type="dxa" w:w="3323"/>
             <w:tcMar>
               <w:top w:type="dxa" w:w="60"/>
               <w:left w:type="dxa" w:w="100"/>
@@ -3048,7 +2947,7 @@
         </w:tc>
         <w:tc>
           <w:tcPr>
-            <w:tcW w:type="dxa" w:w="2823"/>
+            <w:tcW w:type="dxa" w:w="2548"/>
             <w:tcMar>
               <w:top w:type="dxa" w:w="60"/>
               <w:left w:type="dxa" w:w="100"/>
@@ -3073,7 +2972,7 @@
         </w:trPr>
         <w:tc>
           <w:tcPr>
-            <w:tcW w:type="dxa" w:w="4032"/>
+            <w:tcW w:type="dxa" w:w="4209"/>
             <w:tcMar>
               <w:top w:type="dxa" w:w="60"/>
               <w:left w:type="dxa" w:w="100"/>
@@ -3093,7 +2992,7 @@
         </w:tc>
         <w:tc>
           <w:tcPr>
-            <w:tcW w:type="dxa" w:w="3225"/>
+            <w:tcW w:type="dxa" w:w="3323"/>
             <w:tcMar>
               <w:top w:type="dxa" w:w="60"/>
               <w:left w:type="dxa" w:w="100"/>
@@ -3113,7 +3012,7 @@
         </w:tc>
         <w:tc>
           <w:tcPr>
-            <w:tcW w:type="dxa" w:w="2823"/>
+            <w:tcW w:type="dxa" w:w="2548"/>
             <w:tcMar>
               <w:top w:type="dxa" w:w="60"/>
               <w:left w:type="dxa" w:w="100"/>
@@ -3138,7 +3037,7 @@
         </w:trPr>
         <w:tc>
           <w:tcPr>
-            <w:tcW w:type="dxa" w:w="4032"/>
+            <w:tcW w:type="dxa" w:w="4209"/>
             <w:tcMar>
               <w:top w:type="dxa" w:w="60"/>
               <w:left w:type="dxa" w:w="100"/>
@@ -3158,7 +3057,7 @@
         </w:tc>
         <w:tc>
           <w:tcPr>
-            <w:tcW w:type="dxa" w:w="3225"/>
+            <w:tcW w:type="dxa" w:w="3323"/>
             <w:tcMar>
               <w:top w:type="dxa" w:w="60"/>
               <w:left w:type="dxa" w:w="100"/>
@@ -3178,7 +3077,7 @@
         </w:tc>
         <w:tc>
           <w:tcPr>
-            <w:tcW w:type="dxa" w:w="2823"/>
+            <w:tcW w:type="dxa" w:w="2548"/>
             <w:tcMar>
               <w:top w:type="dxa" w:w="60"/>
               <w:left w:type="dxa" w:w="100"/>
@@ -3205,7 +3104,7 @@
     </w:p>
     <w:p>
       <w:pPr>
-        <w:spacing w:after="60"/>
+        <w:spacing w:after="120"/>
       </w:pPr>
       <w:r>
         <w:rPr>
@@ -3223,7 +3122,7 @@
         <w:pStyle w:val="ListParagraph"/>
         <w:numPr>
           <w:ilvl w:val="0"/>
-          <w:numId w:val="3"/>
+          <w:numId w:val="2"/>
         </w:numPr>
         <w:spacing w:after="60"/>
       </w:pPr>
@@ -3243,7 +3142,7 @@
         <w:pStyle w:val="ListParagraph"/>
         <w:numPr>
           <w:ilvl w:val="0"/>
-          <w:numId w:val="3"/>
+          <w:numId w:val="2"/>
         </w:numPr>
         <w:spacing w:after="60"/>
       </w:pPr>
@@ -3260,7 +3159,7 @@
     </w:p>
     <w:p>
       <w:pPr>
-        <w:spacing w:after="60" w:before="80"/>
+        <w:spacing w:after="120"/>
       </w:pPr>
       <w:r>
         <w:rPr>
@@ -3275,7 +3174,7 @@
         <w:pStyle w:val="ListParagraph"/>
         <w:numPr>
           <w:ilvl w:val="0"/>
-          <w:numId w:val="3"/>
+          <w:numId w:val="2"/>
         </w:numPr>
         <w:spacing w:after="60"/>
       </w:pPr>
@@ -3288,7 +3187,7 @@
         <w:pStyle w:val="ListParagraph"/>
         <w:numPr>
           <w:ilvl w:val="0"/>
-          <w:numId w:val="3"/>
+          <w:numId w:val="2"/>
         </w:numPr>
         <w:spacing w:after="60"/>
       </w:pPr>
@@ -3298,7 +3197,7 @@
     </w:p>
     <w:p>
       <w:pPr>
-        <w:spacing w:after="120" w:before="80"/>
+        <w:spacing w:after="120"/>
       </w:pPr>
       <w:r>
         <w:t xml:space="preserve">Both were confirmed in the hour-long run: 50 rows/s, 0 duplicates, rows 19.9 ms apart.</w:t>
@@ -3324,7 +3223,15 @@
         <w:pStyle w:val="Heading2"/>
       </w:pPr>
       <w:r>
-        <w:t xml:space="preserve">2. One board's sensor fails after 20–47 minutes — traced to that board</w:t>
+        <w:t xml:space="preserve">2. Poor data quality in long sessions: traced to one faulty board</w:t>
+      </w:r>
+    </w:p>
+    <w:p>
+      <w:pPr>
+        <w:spacing w:after="120"/>
+      </w:pPr>
+      <w:r>
+        <w:t xml:space="preserve">In long sessions, data quality from one node would break down after 20–47 minutes. The evidence points to a hardware fault on one of the two Arduino boards as the most likely cause.</w:t>
       </w:r>
     </w:p>
     <w:p>
@@ -3336,10 +3243,10 @@
           <w:b/>
           <w:bCs/>
         </w:rPr>
-        <w:t xml:space="preserve">What happens.</w:t>
-      </w:r>
-      <w:r>
-        <w:t xml:space="preserve"> On that board, individual sensor reads start </w:t>
+        <w:t xml:space="preserve">What happened.</w:t>
+      </w:r>
+      <w:r>
+        <w:t xml:space="preserve"> On that board, individual sensor reads started </w:t>
       </w:r>
       <w:r>
         <w:rPr>
@@ -3349,17 +3256,17 @@
         <w:t xml:space="preserve">hanging for ~190–200 ms</w:t>
       </w:r>
       <w:r>
-        <w:t xml:space="preserve"> and returning garbage while the board sits still: accelerometer up to 4.4 g, gyro up to 2400 °/s. A few minutes later the sensor </w:t>
+        <w:t xml:space="preserve"> and returning garbage while the board sat still: accelerometer up to 4.4 g, gyro up to 2400 °/s. This made the reported orientation spin and the angle swing by tens of degrees. A few minutes later the sensor </w:t>
       </w:r>
       <w:r>
         <w:rPr>
           <w:b/>
           <w:bCs/>
         </w:rPr>
-        <w:t xml:space="preserve">stops producing data entirely</w:t>
-      </w:r>
-      <w:r>
-        <w:t xml:space="preserve">. Restarting the sensor, or rebooting the board, doesn't bring it back.</w:t>
+        <w:t xml:space="preserve">stopped producing data entirely</w:t>
+      </w:r>
+      <w:r>
+        <w:t xml:space="preserve">. Restarting the sensor, or rebooting the board, didn't bring it back.</w:t>
       </w:r>
     </w:p>
     <w:tbl>
@@ -3376,10 +3283,10 @@
         <w:tblLayout w:type="fixed"/>
       </w:tblPr>
       <w:tblGrid>
-        <w:gridCol w:w="2352"/>
-        <w:gridCol w:w="1848"/>
-        <w:gridCol w:w="2856"/>
-        <w:gridCol w:w="3024"/>
+        <w:gridCol w:w="1852"/>
+        <w:gridCol w:w="1260"/>
+        <w:gridCol w:w="3483"/>
+        <w:gridCol w:w="3485"/>
       </w:tblGrid>
       <w:tr>
         <w:trPr>
@@ -3387,7 +3294,7 @@
         </w:trPr>
         <w:tc>
           <w:tcPr>
-            <w:tcW w:type="dxa" w:w="2352"/>
+            <w:tcW w:type="dxa" w:w="1852"/>
             <w:shd w:fill="DCE6F1" w:color="auto" w:val="clear"/>
             <w:tcMar>
               <w:top w:type="dxa" w:w="60"/>
@@ -3410,7 +3317,7 @@
         </w:tc>
         <w:tc>
           <w:tcPr>
-            <w:tcW w:type="dxa" w:w="1848"/>
+            <w:tcW w:type="dxa" w:w="1260"/>
             <w:shd w:fill="DCE6F1" w:color="auto" w:val="clear"/>
             <w:tcMar>
               <w:top w:type="dxa" w:w="60"/>
@@ -3433,7 +3340,7 @@
         </w:tc>
         <w:tc>
           <w:tcPr>
-            <w:tcW w:type="dxa" w:w="2856"/>
+            <w:tcW w:type="dxa" w:w="3483"/>
             <w:shd w:fill="DCE6F1" w:color="auto" w:val="clear"/>
             <w:tcMar>
               <w:top w:type="dxa" w:w="60"/>
@@ -3450,13 +3357,13 @@
                 <w:sz w:val="19"/>
                 <w:szCs w:val="19"/>
               </w:rPr>
-              <w:t xml:space="preserve">Sensor trouble starts</w:t>
-            </w:r>
-          </w:p>
-        </w:tc>
-        <w:tc>
-          <w:tcPr>
-            <w:tcW w:type="dxa" w:w="3024"/>
+              <w:t xml:space="preserve">Sensor trouble started</w:t>
+            </w:r>
+          </w:p>
+        </w:tc>
+        <w:tc>
+          <w:tcPr>
+            <w:tcW w:type="dxa" w:w="3485"/>
             <w:shd w:fill="DCE6F1" w:color="auto" w:val="clear"/>
             <w:tcMar>
               <w:top w:type="dxa" w:w="60"/>
@@ -3473,7 +3380,7 @@
                 <w:sz w:val="19"/>
                 <w:szCs w:val="19"/>
               </w:rPr>
-              <w:t xml:space="preserve">Sensor dead</w:t>
+              <w:t xml:space="preserve">Sensor stopped</w:t>
             </w:r>
           </w:p>
         </w:tc>
@@ -3484,7 +3391,7 @@
         </w:trPr>
         <w:tc>
           <w:tcPr>
-            <w:tcW w:type="dxa" w:w="2352"/>
+            <w:tcW w:type="dxa" w:w="1852"/>
             <w:tcMar>
               <w:top w:type="dxa" w:w="60"/>
               <w:left w:type="dxa" w:w="100"/>
@@ -3504,7 +3411,7 @@
         </w:tc>
         <w:tc>
           <w:tcPr>
-            <w:tcW w:type="dxa" w:w="1848"/>
+            <w:tcW w:type="dxa" w:w="1260"/>
             <w:tcMar>
               <w:top w:type="dxa" w:w="60"/>
               <w:left w:type="dxa" w:w="100"/>
@@ -3524,7 +3431,7 @@
         </w:tc>
         <w:tc>
           <w:tcPr>
-            <w:tcW w:type="dxa" w:w="2856"/>
+            <w:tcW w:type="dxa" w:w="3483"/>
             <w:tcMar>
               <w:top w:type="dxa" w:w="60"/>
               <w:left w:type="dxa" w:w="100"/>
@@ -3544,7 +3451,7 @@
         </w:tc>
         <w:tc>
           <w:tcPr>
-            <w:tcW w:type="dxa" w:w="3024"/>
+            <w:tcW w:type="dxa" w:w="3485"/>
             <w:tcMar>
               <w:top w:type="dxa" w:w="60"/>
               <w:left w:type="dxa" w:w="100"/>
@@ -3569,7 +3476,7 @@
         </w:trPr>
         <w:tc>
           <w:tcPr>
-            <w:tcW w:type="dxa" w:w="2352"/>
+            <w:tcW w:type="dxa" w:w="1852"/>
             <w:tcMar>
               <w:top w:type="dxa" w:w="60"/>
               <w:left w:type="dxa" w:w="100"/>
@@ -3589,7 +3496,7 @@
         </w:tc>
         <w:tc>
           <w:tcPr>
-            <w:tcW w:type="dxa" w:w="1848"/>
+            <w:tcW w:type="dxa" w:w="1260"/>
             <w:tcMar>
               <w:top w:type="dxa" w:w="60"/>
               <w:left w:type="dxa" w:w="100"/>
@@ -3609,7 +3516,7 @@
         </w:tc>
         <w:tc>
           <w:tcPr>
-            <w:tcW w:type="dxa" w:w="2856"/>
+            <w:tcW w:type="dxa" w:w="3483"/>
             <w:tcMar>
               <w:top w:type="dxa" w:w="60"/>
               <w:left w:type="dxa" w:w="100"/>
@@ -3629,7 +3536,7 @@
         </w:tc>
         <w:tc>
           <w:tcPr>
-            <w:tcW w:type="dxa" w:w="3024"/>
+            <w:tcW w:type="dxa" w:w="3485"/>
             <w:tcMar>
               <w:top w:type="dxa" w:w="60"/>
               <w:left w:type="dxa" w:w="100"/>
@@ -3654,7 +3561,7 @@
         </w:trPr>
         <w:tc>
           <w:tcPr>
-            <w:tcW w:type="dxa" w:w="2352"/>
+            <w:tcW w:type="dxa" w:w="1852"/>
             <w:tcMar>
               <w:top w:type="dxa" w:w="60"/>
               <w:left w:type="dxa" w:w="100"/>
@@ -3674,7 +3581,7 @@
         </w:tc>
         <w:tc>
           <w:tcPr>
-            <w:tcW w:type="dxa" w:w="1848"/>
+            <w:tcW w:type="dxa" w:w="1260"/>
             <w:tcMar>
               <w:top w:type="dxa" w:w="60"/>
               <w:left w:type="dxa" w:w="100"/>
@@ -3694,7 +3601,7 @@
         </w:tc>
         <w:tc>
           <w:tcPr>
-            <w:tcW w:type="dxa" w:w="2856"/>
+            <w:tcW w:type="dxa" w:w="3483"/>
             <w:tcMar>
               <w:top w:type="dxa" w:w="60"/>
               <w:left w:type="dxa" w:w="100"/>
@@ -3714,7 +3621,7 @@
         </w:tc>
         <w:tc>
           <w:tcPr>
-            <w:tcW w:type="dxa" w:w="3024"/>
+            <w:tcW w:type="dxa" w:w="3485"/>
             <w:tcMar>
               <w:top w:type="dxa" w:w="60"/>
               <w:left w:type="dxa" w:w="100"/>
@@ -3739,7 +3646,7 @@
         </w:trPr>
         <w:tc>
           <w:tcPr>
-            <w:tcW w:type="dxa" w:w="2352"/>
+            <w:tcW w:type="dxa" w:w="1852"/>
             <w:tcMar>
               <w:top w:type="dxa" w:w="60"/>
               <w:left w:type="dxa" w:w="100"/>
@@ -3768,7 +3675,7 @@
         </w:tc>
         <w:tc>
           <w:tcPr>
-            <w:tcW w:type="dxa" w:w="1848"/>
+            <w:tcW w:type="dxa" w:w="1260"/>
             <w:tcMar>
               <w:top w:type="dxa" w:w="60"/>
               <w:left w:type="dxa" w:w="100"/>
@@ -3788,7 +3695,7 @@
         </w:tc>
         <w:tc>
           <w:tcPr>
-            <w:tcW w:type="dxa" w:w="2856"/>
+            <w:tcW w:type="dxa" w:w="3483"/>
             <w:tcMar>
               <w:top w:type="dxa" w:w="60"/>
               <w:left w:type="dxa" w:w="100"/>
@@ -3808,7 +3715,7 @@
         </w:tc>
         <w:tc>
           <w:tcPr>
-            <w:tcW w:type="dxa" w:w="3024"/>
+            <w:tcW w:type="dxa" w:w="3485"/>
             <w:tcMar>
               <w:top w:type="dxa" w:w="60"/>
               <w:left w:type="dxa" w:w="100"/>
@@ -3838,29 +3745,11 @@
         <w:spacing w:after="120"/>
       </w:pPr>
       <w:r>
-        <w:t xml:space="preserve">In the swapped run, </w:t>
-      </w:r>
-      <w:r>
         <w:rPr>
           <w:b/>
           <w:bCs/>
         </w:rPr>
-        <w:t xml:space="preserve">the other board ran the shank role for over an hour with 0 bad readings.</w:t>
-      </w:r>
-      <w:r>
-        <w:t xml:space="preserve"> Across all runs, the other board never had a sensor problem in either role.</w:t>
-      </w:r>
-    </w:p>
-    <w:p>
-      <w:pPr>
-        <w:spacing w:after="60"/>
-      </w:pPr>
-      <w:r>
-        <w:rPr>
-          <w:b/>
-          <w:bCs/>
-        </w:rPr>
-        <w:t xml:space="preserve">Ruled out:</w:t>
+        <w:t xml:space="preserve">How it was traced.</w:t>
       </w:r>
     </w:p>
     <w:p>
@@ -3868,7 +3757,7 @@
         <w:pStyle w:val="ListParagraph"/>
         <w:numPr>
           <w:ilvl w:val="0"/>
-          <w:numId w:val="3"/>
+          <w:numId w:val="2"/>
         </w:numPr>
         <w:spacing w:after="60"/>
       </w:pPr>
@@ -3877,10 +3766,10 @@
           <w:b/>
           <w:bCs/>
         </w:rPr>
-        <w:t xml:space="preserve">The link:</w:t>
-      </w:r>
-      <w:r>
-        <w:t xml:space="preserve"> no checksum failures before the fault in any run (apart from 2 at start-up in one).</w:t>
+        <w:t xml:space="preserve">Swapping the boards' firmware roles moved the fault with the board.</w:t>
+      </w:r>
+      <w:r>
+        <w:t xml:space="preserve"> In long run 3, the board that had been failing as the shank node failed again as the thigh node. The other board ran the shank role for over an hour with 0 bad readings. Across all runs, the other board never had a sensor problem in either role.</w:t>
       </w:r>
     </w:p>
     <w:p>
@@ -3888,7 +3777,7 @@
         <w:pStyle w:val="ListParagraph"/>
         <w:numPr>
           <w:ilvl w:val="0"/>
-          <w:numId w:val="3"/>
+          <w:numId w:val="2"/>
         </w:numPr>
         <w:spacing w:after="60"/>
       </w:pPr>
@@ -3897,10 +3786,87 @@
           <w:b/>
           <w:bCs/>
         </w:rPr>
+        <w:t xml:space="preserve">Ruled out:</w:t>
+      </w:r>
+    </w:p>
+    <w:p>
+      <w:pPr>
+        <w:pStyle w:val="ListParagraph"/>
+        <w:numPr>
+          <w:ilvl w:val="1"/>
+          <w:numId w:val="2"/>
+        </w:numPr>
+        <w:spacing w:after="60"/>
+      </w:pPr>
+      <w:r>
+        <w:rPr>
+          <w:b/>
+          <w:bCs/>
+        </w:rPr>
+        <w:t xml:space="preserve">The link:</w:t>
+      </w:r>
+      <w:r>
+        <w:t xml:space="preserve"> no checksum failures before the fault in any run (apart from 2 at start-up in one).</w:t>
+      </w:r>
+    </w:p>
+    <w:p>
+      <w:pPr>
+        <w:pStyle w:val="ListParagraph"/>
+        <w:numPr>
+          <w:ilvl w:val="1"/>
+          <w:numId w:val="2"/>
+        </w:numPr>
+        <w:spacing w:after="60"/>
+      </w:pPr>
+      <w:r>
+        <w:rPr>
+          <w:b/>
+          <w:bCs/>
+        </w:rPr>
         <w:t xml:space="preserve">Power loss or a board reset:</w:t>
       </w:r>
       <w:r>
         <w:t xml:space="preserve"> its uptime counter never restarted by itself.</w:t>
+      </w:r>
+    </w:p>
+    <w:p>
+      <w:pPr>
+        <w:pStyle w:val="ListParagraph"/>
+        <w:numPr>
+          <w:ilvl w:val="1"/>
+          <w:numId w:val="2"/>
+        </w:numPr>
+        <w:spacing w:after="60"/>
+      </w:pPr>
+      <w:r>
+        <w:rPr>
+          <w:b/>
+          <w:bCs/>
+        </w:rPr>
+        <w:t xml:space="preserve">Calibration:</w:t>
+      </w:r>
+      <w:r>
+        <w:t xml:space="preserve"> unrelated to how or whether the node moved.</w:t>
+      </w:r>
+    </w:p>
+    <w:p>
+      <w:pPr>
+        <w:pStyle w:val="ListParagraph"/>
+        <w:numPr>
+          <w:ilvl w:val="1"/>
+          <w:numId w:val="2"/>
+        </w:numPr>
+        <w:spacing w:after="60"/>
+      </w:pPr>
+      <w:r>
+        <w:rPr>
+          <w:b/>
+          <w:bCs/>
+        </w:rPr>
+        <w:t xml:space="preserve">The firmware:</w:t>
+      </w:r>
+      <w:r>
+        <w:t xml:space="preserve"> both firmware roles failed on this board, and neither failed on the other.</w:t>
       </w:r>
     </w:p>
     <w:p>
@@ -3908,19 +3874,35 @@
         <w:pStyle w:val="ListParagraph"/>
         <w:numPr>
           <w:ilvl w:val="0"/>
-          <w:numId w:val="3"/>
+          <w:numId w:val="2"/>
         </w:numPr>
         <w:spacing w:after="60"/>
       </w:pPr>
       <w:r>
+        <w:t xml:space="preserve">Its cable, USB port and position stayed with it during the swap, so those weren't separately excluded. A faulty sensor chip or joint on the board itself remains the most likely explanation.</w:t>
+      </w:r>
+    </w:p>
+    <w:p>
+      <w:pPr>
+        <w:spacing w:after="120"/>
+      </w:pPr>
+      <w:r>
         <w:rPr>
           <w:b/>
           <w:bCs/>
         </w:rPr>
-        <w:t xml:space="preserve">Calibration:</w:t>
-      </w:r>
-      <w:r>
-        <w:t xml:space="preserve"> unrelated to how or whether the node moved.</w:t>
+        <w:t xml:space="preserve">Mitigation added along the way.</w:t>
+      </w:r>
+      <w:r>
+        <w:t xml:space="preserve"> The shank firmware now rejects implausible sensor samples and sends them as gaps instead of wrong angles. It also resets its filter after each sensor restart, and reboots the board if the sensor produces nothing usable for 5 s. In long run 2 the guard caught the bad readings and the reboot fired, but the sensor stayed dead. That's further evidence the fault was in the hardware.</w:t>
+      </w:r>
+    </w:p>
+    <w:p>
+      <w:pPr>
+        <w:pStyle w:val="Heading1"/>
+      </w:pPr>
+      <w:r>
+        <w:t xml:space="preserve">Limitations</w:t>
       </w:r>
     </w:p>
     <w:p>
@@ -3928,7 +3910,7 @@
         <w:pStyle w:val="ListParagraph"/>
         <w:numPr>
           <w:ilvl w:val="0"/>
-          <w:numId w:val="3"/>
+          <w:numId w:val="2"/>
         </w:numPr>
         <w:spacing w:after="60"/>
       </w:pPr>
@@ -3937,81 +3919,30 @@
           <w:b/>
           <w:bCs/>
         </w:rPr>
-        <w:t xml:space="preserve">The firmware:</w:t>
-      </w:r>
-      <w:r>
-        <w:t xml:space="preserve"> both firmware roles failed on this board, and neither failed on the other.</w:t>
-      </w:r>
-    </w:p>
-    <w:p>
-      <w:pPr>
-        <w:spacing w:after="120" w:before="80"/>
+        <w:t xml:space="preserve">Only one node was exercised in the angle.</w:t>
+      </w:r>
+      <w:r>
+        <w:t xml:space="preserve"> The angle is the difference between the two nodes' tilts, but the software only uses a node's tilt if it moved at least 5° during the calibration sweep. In every test only the shank node was swept, so the thigh node was treated as fixed and the angle came from the shank node alone. The thigh node's own data shows it was just as stable, but its contribution to the angle wasn't tested.</w:t>
+      </w:r>
+    </w:p>
+    <w:p>
+      <w:pPr>
+        <w:pStyle w:val="ListParagraph"/>
+        <w:numPr>
+          <w:ilvl w:val="0"/>
+          <w:numId w:val="2"/>
+        </w:numPr>
+        <w:spacing w:after="60"/>
       </w:pPr>
       <w:r>
         <w:rPr>
           <w:b/>
           <w:bCs/>
         </w:rPr>
-        <w:t xml:space="preserve">Conclusion.</w:t>
-      </w:r>
-      <w:r>
-        <w:t xml:space="preserve"> The fault follows that physical board. Its cable, USB port and position also stayed with it, so a one-off test with the other board's cable and port would exclude those. The board itself is the most likely cause: a faulty sensor chip, a weak joint, or heat. </w:t>
-      </w:r>
-      <w:r>
-        <w:rPr>
-          <w:b/>
-          <w:bCs/>
-        </w:rPr>
-        <w:t xml:space="preserve">Replace it.</w:t>
-      </w:r>
-    </w:p>
-    <w:p>
-      <w:pPr>
-        <w:spacing w:after="120"/>
-      </w:pPr>
-      <w:r>
-        <w:rPr>
-          <w:b/>
-          <w:bCs/>
-        </w:rPr>
-        <w:t xml:space="preserve">Firmware protection (in place).</w:t>
-      </w:r>
-      <w:r>
-        <w:t xml:space="preserve"> The shank board now rejects implausible samples and sends them as gaps instead of wrong angles, resets its filter after each sensor restart, and reboots itself if its sensor produces nothing usable for 5 s. In long run 2 the guard caught the bad readings and the reboot fired, but the sensor stayed dead, which is why it points to hardware.</w:t>
-      </w:r>
-    </w:p>
-    <w:p>
-      <w:pPr>
-        <w:pStyle w:val="Heading2"/>
-      </w:pPr>
-      <w:r>
-        <w:t xml:space="preserve">3. Only one node was exercised, and validity can hide a failure</w:t>
-      </w:r>
-    </w:p>
-    <w:p>
-      <w:pPr>
-        <w:spacing w:after="120"/>
-      </w:pPr>
-      <w:r>
-        <w:t xml:space="preserve">The angle is the difference between the two nodes' tilts, but the software only uses a node's tilt if it moved at least 5° during the calibration sweep. The desk node never did, so it was treated as fixed and the angle came from the shank node alone.</w:t>
-      </w:r>
-    </w:p>
-    <w:p>
-      <w:pPr>
-        <w:spacing w:after="120"/>
-      </w:pPr>
-      <w:r>
-        <w:t xml:space="preserve">This also means </w:t>
-      </w:r>
-      <w:r>
-        <w:rPr>
-          <w:b/>
-          <w:bCs/>
-        </w:rPr>
-        <w:t xml:space="preserve">"valid %" only reflects the shank node's data.</w:t>
-      </w:r>
-      <w:r>
-        <w:t xml:space="preserve"> In the swapped run, the failing board was the reference node: validity stayed ~100 % and the angle stayed flat while its sensor died. The failure only showed in the diagnostic log and the CSV's </w:t>
+        <w:t xml:space="preserve">"Valid %" only reflects the shank node's data.</w:t>
+      </w:r>
+      <w:r>
+        <w:t xml:space="preserve"> A failure of the thigh node doesn't show up in the valid % or, with the calibration above, in the angle. In long run 3 the failing board was the thigh node, and validity stayed ~100 % while its sensor died. It only showed in the diagnostic log and the CSV's </w:t>
       </w:r>
       <w:r>
         <w:rPr>
@@ -4027,18 +3958,10 @@
     </w:p>
     <w:p>
       <w:pPr>
-        <w:pStyle w:val="Heading1"/>
-      </w:pPr>
-      <w:r>
-        <w:t xml:space="preserve">Limitations</w:t>
-      </w:r>
-    </w:p>
-    <w:p>
-      <w:pPr>
         <w:pStyle w:val="ListParagraph"/>
         <w:numPr>
           <w:ilvl w:val="0"/>
-          <w:numId w:val="3"/>
+          <w:numId w:val="2"/>
         </w:numPr>
         <w:spacing w:after="60"/>
       </w:pPr>
@@ -4050,7 +3973,7 @@
         <w:t xml:space="preserve">Accuracy is preliminary only.</w:t>
       </w:r>
       <w:r>
-        <w:t xml:space="preserve"> The 45°/90° check was one placement each, and the reference node shifted during placement.</w:t>
+        <w:t xml:space="preserve"> The 45°/90° check was one placement each, and the reference node shifted 2.7–4.5° during placement.</w:t>
       </w:r>
     </w:p>
     <w:p>
@@ -4058,7 +3981,7 @@
         <w:pStyle w:val="ListParagraph"/>
         <w:numPr>
           <w:ilvl w:val="0"/>
-          <w:numId w:val="3"/>
+          <w:numId w:val="2"/>
         </w:numPr>
         <w:spacing w:after="60"/>
       </w:pPr>
@@ -4078,7 +4001,7 @@
         <w:pStyle w:val="ListParagraph"/>
         <w:numPr>
           <w:ilvl w:val="0"/>
-          <w:numId w:val="3"/>
+          <w:numId w:val="2"/>
         </w:numPr>
         <w:spacing w:after="60"/>
       </w:pPr>
@@ -4091,6 +4014,41 @@
       </w:r>
       <w:r>
         <w:t xml:space="preserve"> Where the rig moved (session 2), its movement couldn't be separated from sensor drift at the time. The GUI now logs the raw accelerometer, which does that; it confirmed a later creep was physical.</w:t>
+      </w:r>
+    </w:p>
+    <w:p>
+      <w:pPr>
+        <w:pStyle w:val="Heading1"/>
+      </w:pPr>
+      <w:r>
+        <w:t xml:space="preserve">Conclusions and next steps</w:t>
+      </w:r>
+    </w:p>
+    <w:p>
+      <w:pPr>
+        <w:spacing w:after="120"/>
+      </w:pPr>
+      <w:r>
+        <w:rPr>
+          <w:b/>
+          <w:bCs/>
+        </w:rPr>
+        <w:t xml:space="preserve">What was tested.</w:t>
+      </w:r>
+      <w:r>
+        <w:t xml:space="preserve"> Six ~5-minute static holds on two setups (a flat desk and a raised rig), three long unattended sessions of 25–65 minutes with diagnostic firmware, a board-swap session, and a preliminary check on 45° and 90° rigs.</w:t>
+      </w:r>
+    </w:p>
+    <w:p>
+      <w:pPr>
+        <w:spacing w:after="120"/>
+      </w:pPr>
+      <w:r>
+        <w:rPr>
+          <w:b/>
+          <w:bCs/>
+        </w:rPr>
+        <w:t xml:space="preserve">What the tests showed.</w:t>
       </w:r>
     </w:p>
     <w:p>
@@ -4098,19 +4056,288 @@
         <w:pStyle w:val="ListParagraph"/>
         <w:numPr>
           <w:ilvl w:val="0"/>
-          <w:numId w:val="3"/>
+          <w:numId w:val="2"/>
         </w:numPr>
         <w:spacing w:after="60"/>
       </w:pPr>
       <w:r>
+        <w:t xml:space="preserve">On healthy hardware the angle is very stable at rest:</w:t>
+      </w:r>
+    </w:p>
+    <w:p>
+      <w:pPr>
+        <w:pStyle w:val="ListParagraph"/>
+        <w:numPr>
+          <w:ilvl w:val="1"/>
+          <w:numId w:val="2"/>
+        </w:numPr>
+        <w:spacing w:after="60"/>
+      </w:pPr>
+      <w:r>
+        <w:t xml:space="preserve">Jitter is about 0.01–0.02°.</w:t>
+      </w:r>
+    </w:p>
+    <w:p>
+      <w:pPr>
+        <w:pStyle w:val="ListParagraph"/>
+        <w:numPr>
+          <w:ilvl w:val="1"/>
+          <w:numId w:val="2"/>
+        </w:numPr>
+        <w:spacing w:after="60"/>
+      </w:pPr>
+      <w:r>
+        <w:t xml:space="preserve">Drift was undetectable over 5 minutes and −0.001 °/min over a clean 57-minute hold (about 0.06° in total).</w:t>
+      </w:r>
+    </w:p>
+    <w:p>
+      <w:pPr>
+        <w:pStyle w:val="ListParagraph"/>
+        <w:numPr>
+          <w:ilvl w:val="1"/>
+          <w:numId w:val="2"/>
+        </w:numPr>
+        <w:spacing w:after="60"/>
+      </w:pPr>
+      <w:r>
+        <w:t xml:space="preserve">Heading drift in the sensors didn't leak into the angle.</w:t>
+      </w:r>
+    </w:p>
+    <w:p>
+      <w:pPr>
+        <w:pStyle w:val="ListParagraph"/>
+        <w:numPr>
+          <w:ilvl w:val="0"/>
+          <w:numId w:val="2"/>
+        </w:numPr>
+        <w:spacing w:after="60"/>
+      </w:pPr>
+      <w:r>
+        <w:t xml:space="preserve">Calibration worked even with a tilted zero pose and a short, reversed sweep.</w:t>
+      </w:r>
+    </w:p>
+    <w:p>
+      <w:pPr>
+        <w:pStyle w:val="ListParagraph"/>
+        <w:numPr>
+          <w:ilvl w:val="0"/>
+          <w:numId w:val="2"/>
+        </w:numPr>
+        <w:spacing w:after="60"/>
+      </w:pPr>
+      <w:r>
+        <w:t xml:space="preserve">At the 45° and 90° rigs the shank node read 45.0° and 89.0°, and its filter-free accelerometer agreed within ~0.2°. This is encouraging, but only a preliminary result.</w:t>
+      </w:r>
+    </w:p>
+    <w:p>
+      <w:pPr>
+        <w:spacing w:after="120"/>
+      </w:pPr>
+      <w:r>
         <w:rPr>
           <w:b/>
           <w:bCs/>
         </w:rPr>
-        <w:t xml:space="preserve">One node per test.</w:t>
-      </w:r>
-      <w:r>
-        <w:t xml:space="preserve"> The reference node's behaviour within the angle calculation hasn't been tested.</w:t>
+        <w:t xml:space="preserve">What was found and addressed.</w:t>
+      </w:r>
+    </w:p>
+    <w:p>
+      <w:pPr>
+        <w:pStyle w:val="ListParagraph"/>
+        <w:numPr>
+          <w:ilvl w:val="0"/>
+          <w:numId w:val="2"/>
+        </w:numPr>
+        <w:spacing w:after="60"/>
+      </w:pPr>
+      <w:r>
+        <w:rPr>
+          <w:b/>
+          <w:bCs/>
+        </w:rPr>
+        <w:t xml:space="preserve">Sample rate:</w:t>
+      </w:r>
+      <w:r>
+        <w:t xml:space="preserve"> the system ran at ~40 Hz instead of 50 Hz, with ~20 % duplicate CSV rows. Two fixes brought it to a true 50 Hz with 0 duplicates:</w:t>
+      </w:r>
+    </w:p>
+    <w:p>
+      <w:pPr>
+        <w:pStyle w:val="ListParagraph"/>
+        <w:numPr>
+          <w:ilvl w:val="1"/>
+          <w:numId w:val="2"/>
+        </w:numPr>
+        <w:spacing w:after="60"/>
+      </w:pPr>
+      <w:r>
+        <w:t xml:space="preserve">The central board now sends each line in one write.</w:t>
+      </w:r>
+    </w:p>
+    <w:p>
+      <w:pPr>
+        <w:pStyle w:val="ListParagraph"/>
+        <w:numPr>
+          <w:ilvl w:val="1"/>
+          <w:numId w:val="2"/>
+        </w:numPr>
+        <w:spacing w:after="60"/>
+      </w:pPr>
+      <w:r>
+        <w:t xml:space="preserve">The GUI now writes one row per received sample, timed by the board's clock.</w:t>
+      </w:r>
+    </w:p>
+    <w:p>
+      <w:pPr>
+        <w:pStyle w:val="ListParagraph"/>
+        <w:numPr>
+          <w:ilvl w:val="0"/>
+          <w:numId w:val="2"/>
+        </w:numPr>
+        <w:spacing w:after="60"/>
+      </w:pPr>
+      <w:r>
+        <w:rPr>
+          <w:b/>
+          <w:bCs/>
+        </w:rPr>
+        <w:t xml:space="preserve">Long-session data loss:</w:t>
+      </w:r>
+      <w:r>
+        <w:t xml:space="preserve"> traced to a faulty sensor on one Arduino board. Firmware now limits the damage by turning bad samples into gaps and rebooting the node, but it can't repair the hardware.</w:t>
+      </w:r>
+    </w:p>
+    <w:p>
+      <w:pPr>
+        <w:pStyle w:val="ListParagraph"/>
+        <w:numPr>
+          <w:ilvl w:val="0"/>
+          <w:numId w:val="2"/>
+        </w:numPr>
+        <w:spacing w:after="60"/>
+      </w:pPr>
+      <w:r>
+        <w:rPr>
+          <w:b/>
+          <w:bCs/>
+        </w:rPr>
+        <w:t xml:space="preserve">Diagnostics added:</w:t>
+      </w:r>
+    </w:p>
+    <w:p>
+      <w:pPr>
+        <w:pStyle w:val="ListParagraph"/>
+        <w:numPr>
+          <w:ilvl w:val="1"/>
+          <w:numId w:val="2"/>
+        </w:numPr>
+        <w:spacing w:after="60"/>
+      </w:pPr>
+      <w:r>
+        <w:t xml:space="preserve">Once-a-second health reports from both boards, saved to a log.</w:t>
+      </w:r>
+    </w:p>
+    <w:p>
+      <w:pPr>
+        <w:pStyle w:val="ListParagraph"/>
+        <w:numPr>
+          <w:ilvl w:val="1"/>
+          <w:numId w:val="2"/>
+        </w:numPr>
+        <w:spacing w:after="60"/>
+      </w:pPr>
+      <w:r>
+        <w:t xml:space="preserve">Raw accelerometer columns in the CSV, which separate physical movement from filter behaviour.</w:t>
+      </w:r>
+    </w:p>
+    <w:p>
+      <w:pPr>
+        <w:spacing w:after="120"/>
+      </w:pPr>
+      <w:r>
+        <w:rPr>
+          <w:b/>
+          <w:bCs/>
+        </w:rPr>
+        <w:t xml:space="preserve">Recommended next steps.</w:t>
+      </w:r>
+      <w:r>
+        <w:t xml:space="preserve"> Anyone continuing this work should first replace the faulty board and repeat a one-hour static run on two healthy boards, to get a clean baseline. From there:</w:t>
+      </w:r>
+    </w:p>
+    <w:p>
+      <w:pPr>
+        <w:pStyle w:val="ListParagraph"/>
+        <w:numPr>
+          <w:ilvl w:val="0"/>
+          <w:numId w:val="2"/>
+        </w:numPr>
+        <w:spacing w:after="60"/>
+      </w:pPr>
+      <w:r>
+        <w:t xml:space="preserve">Sweep </w:t>
+      </w:r>
+      <w:r>
+        <w:rPr>
+          <w:b/>
+          <w:bCs/>
+        </w:rPr>
+        <w:t xml:space="preserve">both</w:t>
+      </w:r>
+      <w:r>
+        <w:t xml:space="preserve"> nodes during calibration so the angle uses both sensors.</w:t>
+      </w:r>
+    </w:p>
+    <w:p>
+      <w:pPr>
+        <w:pStyle w:val="ListParagraph"/>
+        <w:numPr>
+          <w:ilvl w:val="0"/>
+          <w:numId w:val="2"/>
+        </w:numPr>
+        <w:spacing w:after="60"/>
+      </w:pPr>
+      <w:r>
+        <w:t xml:space="preserve">Fix the reference node and its cable firmly so it can't shift.</w:t>
+      </w:r>
+    </w:p>
+    <w:p>
+      <w:pPr>
+        <w:pStyle w:val="ListParagraph"/>
+        <w:numPr>
+          <w:ilvl w:val="0"/>
+          <w:numId w:val="2"/>
+        </w:numPr>
+        <w:spacing w:after="60"/>
+      </w:pPr>
+      <w:r>
+        <w:t xml:space="preserve">If a more precise rig is available, repeat the 0°, 45° and 90° placements several times each to turn the angle check into an accuracy figure.</w:t>
+      </w:r>
+    </w:p>
+    <w:p>
+      <w:pPr>
+        <w:pStyle w:val="ListParagraph"/>
+        <w:numPr>
+          <w:ilvl w:val="0"/>
+          <w:numId w:val="2"/>
+        </w:numPr>
+        <w:spacing w:after="60"/>
+      </w:pPr>
+      <w:r>
+        <w:t xml:space="preserve">Log angles to more decimal places to measure the true noise floor.</w:t>
+      </w:r>
+    </w:p>
+    <w:p>
+      <w:pPr>
+        <w:pStyle w:val="ListParagraph"/>
+        <w:numPr>
+          <w:ilvl w:val="0"/>
+          <w:numId w:val="2"/>
+        </w:numPr>
+        <w:spacing w:after="60"/>
+      </w:pPr>
+      <w:r>
+        <w:t xml:space="preserve">Move on to dynamic (movement) testing, now that the sample rate and CSV timing are sound.</w:t>
       </w:r>
     </w:p>
     <w:p>
@@ -4118,7 +4345,7 @@
         <w:pStyle w:val="Heading1"/>
       </w:pPr>
       <w:r>
-        <w:t xml:space="preserve">Next steps</w:t>
+        <w:t xml:space="preserve">Files</w:t>
       </w:r>
     </w:p>
     <w:tbl>
@@ -4135,8 +4362,8 @@
         <w:tblLayout w:type="fixed"/>
       </w:tblPr>
       <w:tblGrid>
-        <w:gridCol w:w="6854"/>
-        <w:gridCol w:w="3226"/>
+        <w:gridCol w:w="4631"/>
+        <w:gridCol w:w="5449"/>
       </w:tblGrid>
       <w:tr>
         <w:trPr>
@@ -4144,7 +4371,7 @@
         </w:trPr>
         <w:tc>
           <w:tcPr>
-            <w:tcW w:type="dxa" w:w="6854"/>
+            <w:tcW w:type="dxa" w:w="4631"/>
             <w:shd w:fill="DCE6F1" w:color="auto" w:val="clear"/>
             <w:tcMar>
               <w:top w:type="dxa" w:w="60"/>
@@ -4161,13 +4388,13 @@
                 <w:sz w:val="19"/>
                 <w:szCs w:val="19"/>
               </w:rPr>
-              <w:t xml:space="preserve">Step</w:t>
-            </w:r>
-          </w:p>
-        </w:tc>
-        <w:tc>
-          <w:tcPr>
-            <w:tcW w:type="dxa" w:w="3226"/>
+              <w:t xml:space="preserve">File</w:t>
+            </w:r>
+          </w:p>
+        </w:tc>
+        <w:tc>
+          <w:tcPr>
+            <w:tcW w:type="dxa" w:w="5449"/>
             <w:shd w:fill="DCE6F1" w:color="auto" w:val="clear"/>
             <w:tcMar>
               <w:top w:type="dxa" w:w="60"/>
@@ -4184,7 +4411,7 @@
                 <w:sz w:val="19"/>
                 <w:szCs w:val="19"/>
               </w:rPr>
-              <w:t xml:space="preserve">Status</w:t>
+              <w:t xml:space="preserve">Contents</w:t>
             </w:r>
           </w:p>
         </w:tc>
@@ -4195,41 +4422,41 @@
         </w:trPr>
         <w:tc>
           <w:tcPr>
-            <w:tcW w:type="dxa" w:w="6854"/>
-            <w:tcMar>
-              <w:top w:type="dxa" w:w="60"/>
-              <w:left w:type="dxa" w:w="100"/>
-              <w:bottom w:type="dxa" w:w="60"/>
-              <w:right w:type="dxa" w:w="100"/>
-            </w:tcMar>
-          </w:tcPr>
-          <w:p>
-            <w:r>
-              <w:rPr>
-                <w:sz w:val="19"/>
-                <w:szCs w:val="19"/>
-              </w:rPr>
-              <w:t xml:space="preserve">Fix the sample rate (one write per line; one CSV row per sample)</w:t>
-            </w:r>
-          </w:p>
-        </w:tc>
-        <w:tc>
-          <w:tcPr>
-            <w:tcW w:type="dxa" w:w="3226"/>
-            <w:tcMar>
-              <w:top w:type="dxa" w:w="60"/>
-              <w:left w:type="dxa" w:w="100"/>
-              <w:bottom w:type="dxa" w:w="60"/>
-              <w:right w:type="dxa" w:w="100"/>
-            </w:tcMar>
-          </w:tcPr>
-          <w:p>
-            <w:r>
-              <w:rPr>
-                <w:sz w:val="19"/>
-                <w:szCs w:val="19"/>
-              </w:rPr>
-              <w:t xml:space="preserve">Done and confirmed</w:t>
+            <w:tcW w:type="dxa" w:w="4631"/>
+            <w:tcMar>
+              <w:top w:type="dxa" w:w="60"/>
+              <w:left w:type="dxa" w:w="100"/>
+              <w:bottom w:type="dxa" w:w="60"/>
+              <w:right w:type="dxa" w:w="100"/>
+            </w:tcMar>
+          </w:tcPr>
+          <w:p>
+            <w:r>
+              <w:rPr>
+                <w:sz w:val="19"/>
+                <w:szCs w:val="19"/>
+              </w:rPr>
+              <w:t xml:space="preserve">FINDINGS.md</w:t>
+            </w:r>
+          </w:p>
+        </w:tc>
+        <w:tc>
+          <w:tcPr>
+            <w:tcW w:type="dxa" w:w="5449"/>
+            <w:tcMar>
+              <w:top w:type="dxa" w:w="60"/>
+              <w:left w:type="dxa" w:w="100"/>
+              <w:bottom w:type="dxa" w:w="60"/>
+              <w:right w:type="dxa" w:w="100"/>
+            </w:tcMar>
+          </w:tcPr>
+          <w:p>
+            <w:r>
+              <w:rPr>
+                <w:sz w:val="19"/>
+                <w:szCs w:val="19"/>
+              </w:rPr>
+              <w:t xml:space="preserve">Full analysis and per-run detail</w:t>
             </w:r>
           </w:p>
         </w:tc>
@@ -4240,41 +4467,42 @@
         </w:trPr>
         <w:tc>
           <w:tcPr>
-            <w:tcW w:type="dxa" w:w="6854"/>
-            <w:tcMar>
-              <w:top w:type="dxa" w:w="60"/>
-              <w:left w:type="dxa" w:w="100"/>
-              <w:bottom w:type="dxa" w:w="60"/>
-              <w:right w:type="dxa" w:w="100"/>
-            </w:tcMar>
-          </w:tcPr>
-          <w:p>
-            <w:r>
-              <w:rPr>
-                <w:sz w:val="19"/>
-                <w:szCs w:val="19"/>
-              </w:rPr>
-              <w:t xml:space="preserve">Log the raw accelerometer in the CSV</w:t>
-            </w:r>
-          </w:p>
-        </w:tc>
-        <w:tc>
-          <w:tcPr>
-            <w:tcW w:type="dxa" w:w="3226"/>
-            <w:tcMar>
-              <w:top w:type="dxa" w:w="60"/>
-              <w:left w:type="dxa" w:w="100"/>
-              <w:bottom w:type="dxa" w:w="60"/>
-              <w:right w:type="dxa" w:w="100"/>
-            </w:tcMar>
-          </w:tcPr>
-          <w:p>
-            <w:r>
-              <w:rPr>
-                <w:sz w:val="19"/>
-                <w:szCs w:val="19"/>
-              </w:rPr>
-              <w:t xml:space="preserve">Done</w:t>
+            <w:tcW w:type="dxa" w:w="4631"/>
+            <w:tcMar>
+              <w:top w:type="dxa" w:w="60"/>
+              <w:left w:type="dxa" w:w="100"/>
+              <w:bottom w:type="dxa" w:w="60"/>
+              <w:right w:type="dxa" w:w="100"/>
+            </w:tcMar>
+          </w:tcPr>
+          <w:p>
+            <w:r>
+              <w:rPr>
+                <w:rFonts w:ascii="Consolas" w:cs="Consolas" w:eastAsia="Consolas" w:hAnsi="Consolas"/>
+                <w:sz w:val="19"/>
+                <w:szCs w:val="19"/>
+              </w:rPr>
+              <w:t xml:space="preserve">plot_report.py</w:t>
+            </w:r>
+          </w:p>
+        </w:tc>
+        <w:tc>
+          <w:tcPr>
+            <w:tcW w:type="dxa" w:w="5449"/>
+            <w:tcMar>
+              <w:top w:type="dxa" w:w="60"/>
+              <w:left w:type="dxa" w:w="100"/>
+              <w:bottom w:type="dxa" w:w="60"/>
+              <w:right w:type="dxa" w:w="100"/>
+            </w:tcMar>
+          </w:tcPr>
+          <w:p>
+            <w:r>
+              <w:rPr>
+                <w:sz w:val="19"/>
+                <w:szCs w:val="19"/>
+              </w:rPr>
+              <w:t xml:space="preserve">Recreates the figure above (needs the six CSVs in this folder)</w:t>
             </w:r>
           </w:p>
         </w:tc>
@@ -4285,41 +4513,50 @@
         </w:trPr>
         <w:tc>
           <w:tcPr>
-            <w:tcW w:type="dxa" w:w="6854"/>
-            <w:tcMar>
-              <w:top w:type="dxa" w:w="60"/>
-              <w:left w:type="dxa" w:w="100"/>
-              <w:bottom w:type="dxa" w:w="60"/>
-              <w:right w:type="dxa" w:w="100"/>
-            </w:tcMar>
-          </w:tcPr>
-          <w:p>
-            <w:r>
-              <w:rPr>
-                <w:sz w:val="19"/>
-                <w:szCs w:val="19"/>
-              </w:rPr>
-              <w:t xml:space="preserve">Guard the shank node against a failing sensor</w:t>
-            </w:r>
-          </w:p>
-        </w:tc>
-        <w:tc>
-          <w:tcPr>
-            <w:tcW w:type="dxa" w:w="3226"/>
-            <w:tcMar>
-              <w:top w:type="dxa" w:w="60"/>
-              <w:left w:type="dxa" w:w="100"/>
-              <w:bottom w:type="dxa" w:w="60"/>
-              <w:right w:type="dxa" w:w="100"/>
-            </w:tcMar>
-          </w:tcPr>
-          <w:p>
-            <w:r>
-              <w:rPr>
-                <w:sz w:val="19"/>
-                <w:szCs w:val="19"/>
-              </w:rPr>
-              <w:t xml:space="preserve">Done</w:t>
+            <w:tcW w:type="dxa" w:w="4631"/>
+            <w:tcMar>
+              <w:top w:type="dxa" w:w="60"/>
+              <w:left w:type="dxa" w:w="100"/>
+              <w:bottom w:type="dxa" w:w="60"/>
+              <w:right w:type="dxa" w:w="100"/>
+            </w:tcMar>
+          </w:tcPr>
+          <w:p>
+            <w:r>
+              <w:rPr>
+                <w:rFonts w:ascii="Consolas" w:cs="Consolas" w:eastAsia="Consolas" w:hAnsi="Consolas"/>
+                <w:sz w:val="19"/>
+                <w:szCs w:val="19"/>
+              </w:rPr>
+              <w:t xml:space="preserve">Static_Stability_Test_Report.docx</w:t>
+            </w:r>
+          </w:p>
+        </w:tc>
+        <w:tc>
+          <w:tcPr>
+            <w:tcW w:type="dxa" w:w="5449"/>
+            <w:tcMar>
+              <w:top w:type="dxa" w:w="60"/>
+              <w:left w:type="dxa" w:w="100"/>
+              <w:bottom w:type="dxa" w:w="60"/>
+              <w:right w:type="dxa" w:w="100"/>
+            </w:tcMar>
+          </w:tcPr>
+          <w:p>
+            <w:r>
+              <w:rPr>
+                <w:sz w:val="19"/>
+                <w:szCs w:val="19"/>
+              </w:rPr>
+              <w:t xml:space="preserve">Word version of this report, generated from this file by </w:t>
+            </w:r>
+            <w:r>
+              <w:rPr>
+                <w:rFonts w:ascii="Consolas" w:cs="Consolas" w:eastAsia="Consolas" w:hAnsi="Consolas"/>
+                <w:sz w:val="19"/>
+                <w:szCs w:val="19"/>
+              </w:rPr>
+              <w:t xml:space="preserve">build_report_docx.js</w:t>
             </w:r>
           </w:p>
         </w:tc>
@@ -4330,311 +4567,87 @@
         </w:trPr>
         <w:tc>
           <w:tcPr>
-            <w:tcW w:type="dxa" w:w="6854"/>
-            <w:tcMar>
-              <w:top w:type="dxa" w:w="60"/>
-              <w:left w:type="dxa" w:w="100"/>
-              <w:bottom w:type="dxa" w:w="60"/>
-              <w:right w:type="dxa" w:w="100"/>
-            </w:tcMar>
-          </w:tcPr>
-          <w:p>
-            <w:r>
-              <w:rPr>
-                <w:sz w:val="19"/>
-                <w:szCs w:val="19"/>
-              </w:rPr>
-              <w:t xml:space="preserve">Board-swap test to locate the sensor fault</w:t>
-            </w:r>
-          </w:p>
-        </w:tc>
-        <w:tc>
-          <w:tcPr>
-            <w:tcW w:type="dxa" w:w="3226"/>
-            <w:tcMar>
-              <w:top w:type="dxa" w:w="60"/>
-              <w:left w:type="dxa" w:w="100"/>
-              <w:bottom w:type="dxa" w:w="60"/>
-              <w:right w:type="dxa" w:w="100"/>
-            </w:tcMar>
-          </w:tcPr>
-          <w:p>
-            <w:r>
-              <w:rPr>
-                <w:sz w:val="19"/>
-                <w:szCs w:val="19"/>
-              </w:rPr>
-              <w:t xml:space="preserve">Done: fault follows one board</w:t>
-            </w:r>
-          </w:p>
-        </w:tc>
-      </w:tr>
-      <w:tr>
-        <w:trPr>
-          <w:cantSplit/>
-        </w:trPr>
-        <w:tc>
-          <w:tcPr>
-            <w:tcW w:type="dxa" w:w="6854"/>
-            <w:tcMar>
-              <w:top w:type="dxa" w:w="60"/>
-              <w:left w:type="dxa" w:w="100"/>
-              <w:bottom w:type="dxa" w:w="60"/>
-              <w:right w:type="dxa" w:w="100"/>
-            </w:tcMar>
-          </w:tcPr>
-          <w:p>
-            <w:r>
-              <w:rPr>
-                <w:sz w:val="19"/>
-                <w:szCs w:val="19"/>
-              </w:rPr>
-              <w:t xml:space="preserve">Replace the faulty board (optionally, first test it on the other cable and port)</w:t>
-            </w:r>
-          </w:p>
-        </w:tc>
-        <w:tc>
-          <w:tcPr>
-            <w:tcW w:type="dxa" w:w="3226"/>
-            <w:tcMar>
-              <w:top w:type="dxa" w:w="60"/>
-              <w:left w:type="dxa" w:w="100"/>
-              <w:bottom w:type="dxa" w:w="60"/>
-              <w:right w:type="dxa" w:w="100"/>
-            </w:tcMar>
-          </w:tcPr>
-          <w:p>
-            <w:r>
-              <w:rPr>
-                <w:sz w:val="19"/>
-                <w:szCs w:val="19"/>
-              </w:rPr>
-              <w:t xml:space="preserve">To do</w:t>
-            </w:r>
-          </w:p>
-        </w:tc>
-      </w:tr>
-      <w:tr>
-        <w:trPr>
-          <w:cantSplit/>
-        </w:trPr>
-        <w:tc>
-          <w:tcPr>
-            <w:tcW w:type="dxa" w:w="6854"/>
-            <w:tcMar>
-              <w:top w:type="dxa" w:w="60"/>
-              <w:left w:type="dxa" w:w="100"/>
-              <w:bottom w:type="dxa" w:w="60"/>
-              <w:right w:type="dxa" w:w="100"/>
-            </w:tcMar>
-          </w:tcPr>
-          <w:p>
-            <w:r>
-              <w:rPr>
-                <w:sz w:val="19"/>
-                <w:szCs w:val="19"/>
-              </w:rPr>
-              <w:t xml:space="preserve">One-hour static run on two healthy boards as the clean baseline</w:t>
-            </w:r>
-          </w:p>
-        </w:tc>
-        <w:tc>
-          <w:tcPr>
-            <w:tcW w:type="dxa" w:w="3226"/>
-            <w:tcMar>
-              <w:top w:type="dxa" w:w="60"/>
-              <w:left w:type="dxa" w:w="100"/>
-              <w:bottom w:type="dxa" w:w="60"/>
-              <w:right w:type="dxa" w:w="100"/>
-            </w:tcMar>
-          </w:tcPr>
-          <w:p>
-            <w:r>
-              <w:rPr>
-                <w:sz w:val="19"/>
-                <w:szCs w:val="19"/>
-              </w:rPr>
-              <w:t xml:space="preserve">After replacement</w:t>
-            </w:r>
-          </w:p>
-        </w:tc>
-      </w:tr>
-      <w:tr>
-        <w:trPr>
-          <w:cantSplit/>
-        </w:trPr>
-        <w:tc>
-          <w:tcPr>
-            <w:tcW w:type="dxa" w:w="6854"/>
-            <w:tcMar>
-              <w:top w:type="dxa" w:w="60"/>
-              <w:left w:type="dxa" w:w="100"/>
-              <w:bottom w:type="dxa" w:w="60"/>
-              <w:right w:type="dxa" w:w="100"/>
-            </w:tcMar>
-          </w:tcPr>
-          <w:p>
-            <w:r>
-              <w:rPr>
-                <w:sz w:val="19"/>
-                <w:szCs w:val="19"/>
-              </w:rPr>
-              <w:t xml:space="preserve">Tilt both nodes during calibration, so the angle uses both</w:t>
-            </w:r>
-          </w:p>
-        </w:tc>
-        <w:tc>
-          <w:tcPr>
-            <w:tcW w:type="dxa" w:w="3226"/>
-            <w:tcMar>
-              <w:top w:type="dxa" w:w="60"/>
-              <w:left w:type="dxa" w:w="100"/>
-              <w:bottom w:type="dxa" w:w="60"/>
-              <w:right w:type="dxa" w:w="100"/>
-            </w:tcMar>
-          </w:tcPr>
-          <w:p>
-            <w:r>
-              <w:rPr>
-                <w:sz w:val="19"/>
-                <w:szCs w:val="19"/>
-              </w:rPr>
-              <w:t xml:space="preserve">Next test</w:t>
-            </w:r>
-          </w:p>
-        </w:tc>
-      </w:tr>
-      <w:tr>
-        <w:trPr>
-          <w:cantSplit/>
-        </w:trPr>
-        <w:tc>
-          <w:tcPr>
-            <w:tcW w:type="dxa" w:w="6854"/>
-            <w:tcMar>
-              <w:top w:type="dxa" w:w="60"/>
-              <w:left w:type="dxa" w:w="100"/>
-              <w:bottom w:type="dxa" w:w="60"/>
-              <w:right w:type="dxa" w:w="100"/>
-            </w:tcMar>
-          </w:tcPr>
-          <w:p>
-            <w:r>
-              <w:rPr>
-                <w:sz w:val="19"/>
-                <w:szCs w:val="19"/>
-              </w:rPr>
-              <w:t xml:space="preserve">Keep the reference node still (tape the board and its cable down)</w:t>
-            </w:r>
-          </w:p>
-        </w:tc>
-        <w:tc>
-          <w:tcPr>
-            <w:tcW w:type="dxa" w:w="3226"/>
-            <w:tcMar>
-              <w:top w:type="dxa" w:w="60"/>
-              <w:left w:type="dxa" w:w="100"/>
-              <w:bottom w:type="dxa" w:w="60"/>
-              <w:right w:type="dxa" w:w="100"/>
-            </w:tcMar>
-          </w:tcPr>
-          <w:p>
-            <w:r>
-              <w:rPr>
-                <w:sz w:val="19"/>
-                <w:szCs w:val="19"/>
-              </w:rPr>
-              <w:t xml:space="preserve">Next test</w:t>
-            </w:r>
-          </w:p>
-        </w:tc>
-      </w:tr>
-      <w:tr>
-        <w:trPr>
-          <w:cantSplit/>
-        </w:trPr>
-        <w:tc>
-          <w:tcPr>
-            <w:tcW w:type="dxa" w:w="6854"/>
-            <w:tcMar>
-              <w:top w:type="dxa" w:w="60"/>
-              <w:left w:type="dxa" w:w="100"/>
-              <w:bottom w:type="dxa" w:w="60"/>
-              <w:right w:type="dxa" w:w="100"/>
-            </w:tcMar>
-          </w:tcPr>
-          <w:p>
-            <w:r>
-              <w:rPr>
-                <w:sz w:val="19"/>
-                <w:szCs w:val="19"/>
-              </w:rPr>
-              <w:t xml:space="preserve">Repeat 0°/45°/90° placements 3–5 times each</w:t>
-            </w:r>
-          </w:p>
-        </w:tc>
-        <w:tc>
-          <w:tcPr>
-            <w:tcW w:type="dxa" w:w="3226"/>
-            <w:tcMar>
-              <w:top w:type="dxa" w:w="60"/>
-              <w:left w:type="dxa" w:w="100"/>
-              <w:bottom w:type="dxa" w:w="60"/>
-              <w:right w:type="dxa" w:w="100"/>
-            </w:tcMar>
-          </w:tcPr>
-          <w:p>
-            <w:r>
-              <w:rPr>
-                <w:sz w:val="19"/>
-                <w:szCs w:val="19"/>
-              </w:rPr>
-              <w:t xml:space="preserve">If a steadier rig is available</w:t>
-            </w:r>
-          </w:p>
-        </w:tc>
-      </w:tr>
-      <w:tr>
-        <w:trPr>
-          <w:cantSplit/>
-        </w:trPr>
-        <w:tc>
-          <w:tcPr>
-            <w:tcW w:type="dxa" w:w="6854"/>
-            <w:tcMar>
-              <w:top w:type="dxa" w:w="60"/>
-              <w:left w:type="dxa" w:w="100"/>
-              <w:bottom w:type="dxa" w:w="60"/>
-              <w:right w:type="dxa" w:w="100"/>
-            </w:tcMar>
-          </w:tcPr>
-          <w:p>
-            <w:r>
-              <w:rPr>
-                <w:sz w:val="19"/>
-                <w:szCs w:val="19"/>
-              </w:rPr>
-              <w:t xml:space="preserve">Log angles with more decimal places</w:t>
-            </w:r>
-          </w:p>
-        </w:tc>
-        <w:tc>
-          <w:tcPr>
-            <w:tcW w:type="dxa" w:w="3226"/>
-            <w:tcMar>
-              <w:top w:type="dxa" w:w="60"/>
-              <w:left w:type="dxa" w:w="100"/>
-              <w:bottom w:type="dxa" w:w="60"/>
-              <w:right w:type="dxa" w:w="100"/>
-            </w:tcMar>
-          </w:tcPr>
-          <w:p>
-            <w:r>
-              <w:rPr>
-                <w:sz w:val="19"/>
-                <w:szCs w:val="19"/>
-              </w:rPr>
-              <w:t xml:space="preserve">To do</w:t>
+            <w:tcW w:type="dxa" w:w="4631"/>
+            <w:tcMar>
+              <w:top w:type="dxa" w:w="60"/>
+              <w:left w:type="dxa" w:w="100"/>
+              <w:bottom w:type="dxa" w:w="60"/>
+              <w:right w:type="dxa" w:w="100"/>
+            </w:tcMar>
+          </w:tcPr>
+          <w:p>
+            <w:r>
+              <w:rPr>
+                <w:rFonts w:ascii="Consolas" w:cs="Consolas" w:eastAsia="Consolas" w:hAnsi="Consolas"/>
+                <w:sz w:val="19"/>
+                <w:szCs w:val="19"/>
+              </w:rPr>
+              <w:t xml:space="preserve">stats.py</w:t>
+            </w:r>
+            <w:r>
+              <w:rPr>
+                <w:sz w:val="19"/>
+                <w:szCs w:val="19"/>
+              </w:rPr>
+              <w:t xml:space="preserve">, </w:t>
+            </w:r>
+            <w:r>
+              <w:rPr>
+                <w:rFonts w:ascii="Consolas" w:cs="Consolas" w:eastAsia="Consolas" w:hAnsi="Consolas"/>
+                <w:sz w:val="19"/>
+                <w:szCs w:val="19"/>
+              </w:rPr>
+              <w:t xml:space="preserve">calibration.py</w:t>
+            </w:r>
+            <w:r>
+              <w:rPr>
+                <w:sz w:val="19"/>
+                <w:szCs w:val="19"/>
+              </w:rPr>
+              <w:t xml:space="preserve">, </w:t>
+            </w:r>
+            <w:r>
+              <w:rPr>
+                <w:rFonts w:ascii="Consolas" w:cs="Consolas" w:eastAsia="Consolas" w:hAnsi="Consolas"/>
+                <w:sz w:val="19"/>
+                <w:szCs w:val="19"/>
+              </w:rPr>
+              <w:t xml:space="preserve">plot.py</w:t>
+            </w:r>
+            <w:r>
+              <w:rPr>
+                <w:sz w:val="19"/>
+                <w:szCs w:val="19"/>
+              </w:rPr>
+              <w:t xml:space="preserve">, </w:t>
+            </w:r>
+            <w:r>
+              <w:rPr>
+                <w:rFonts w:ascii="Consolas" w:cs="Consolas" w:eastAsia="Consolas" w:hAnsi="Consolas"/>
+                <w:sz w:val="19"/>
+                <w:szCs w:val="19"/>
+              </w:rPr>
+              <w:t xml:space="preserve">plot_session2.py</w:t>
+            </w:r>
+          </w:p>
+        </w:tc>
+        <w:tc>
+          <w:tcPr>
+            <w:tcW w:type="dxa" w:w="5449"/>
+            <w:tcMar>
+              <w:top w:type="dxa" w:w="60"/>
+              <w:left w:type="dxa" w:w="100"/>
+              <w:bottom w:type="dxa" w:w="60"/>
+              <w:right w:type="dxa" w:w="100"/>
+            </w:tcMar>
+          </w:tcPr>
+          <w:p>
+            <w:r>
+              <w:rPr>
+                <w:sz w:val="19"/>
+                <w:szCs w:val="19"/>
+              </w:rPr>
+              <w:t xml:space="preserve">Detailed statistics and plots</w:t>
             </w:r>
           </w:p>
         </w:tc>
@@ -4644,36 +4657,6 @@
       <w:pPr>
         <w:spacing w:after="120"/>
       </w:pPr>
-    </w:p>
-    <w:p>
-      <w:pPr>
-        <w:spacing w:after="120"/>
-      </w:pPr>
-      <w:r>
-        <w:rPr>
-          <w:color w:val="5A5A5A"/>
-          <w:sz w:val="19"/>
-          <w:szCs w:val="19"/>
-        </w:rPr>
-        <w:t xml:space="preserve">Detailed analysis, per-run tables and method notes are in </w:t>
-      </w:r>
-      <w:r>
-        <w:rPr>
-          <w:rFonts w:ascii="Consolas" w:cs="Consolas" w:eastAsia="Consolas" w:hAnsi="Consolas"/>
-          <w:color w:val="5A5A5A"/>
-          <w:sz w:val="19"/>
-          <w:szCs w:val="19"/>
-        </w:rPr>
-        <w:t xml:space="preserve">analysis/static_test/FINDINGS.md</w:t>
-      </w:r>
-      <w:r>
-        <w:rPr>
-          <w:color w:val="5A5A5A"/>
-          <w:sz w:val="19"/>
-          <w:szCs w:val="19"/>
-        </w:rPr>
-        <w:t xml:space="preserve"> in the project repository.</w:t>
-      </w:r>
     </w:p>
     <w:sectPr>
       <w:footerReference w:type="default" r:id="rId7"/>
@@ -4912,18 +4895,6 @@
       </w:pPr>
     </w:lvl>
   </w:abstractNum>
-  <w:abstractNum w:abstractNumId="4" w15:restartNumberingAfterBreak="0">
-    <w:multiLevelType w:val="hybridMultilevel"/>
-    <w:lvl w:ilvl="0" w15:tentative="1">
-      <w:start w:val="1"/>
-      <w:numFmt w:val="decimal"/>
-      <w:lvlText w:val="%1."/>
-      <w:lvlJc w:val="left"/>
-      <w:pPr>
-        <w:ind w:left="360" w:hanging="360"/>
-      </w:pPr>
-    </w:lvl>
-  </w:abstractNum>
   <w:num w:numId="1">
     <w:abstractNumId w:val="1"/>
     <w:lvlOverride w:ilvl="0">
@@ -4931,19 +4902,13 @@
     </w:lvlOverride>
   </w:num>
   <w:num w:numId="2">
-    <w:abstractNumId w:val="3"/>
+    <w:abstractNumId w:val="2"/>
     <w:lvlOverride w:ilvl="0">
       <w:startOverride w:val="1"/>
     </w:lvlOverride>
   </w:num>
   <w:num w:numId="3">
-    <w:abstractNumId w:val="2"/>
-    <w:lvlOverride w:ilvl="0">
-      <w:startOverride w:val="1"/>
-    </w:lvlOverride>
-  </w:num>
-  <w:num w:numId="4">
-    <w:abstractNumId w:val="4"/>
+    <w:abstractNumId w:val="3"/>
     <w:lvlOverride w:ilvl="0">
       <w:startOverride w:val="1"/>
     </w:lvlOverride>

</xml_diff>